<commit_message>
docs(cheatsheet): physically transpose 2D matrix — 管线 as header row
The previous "transpose" only renamed the section title; the table body
still had 管线 down the side and 阶段 across the top. This version
physically swaps the orientation so 5 管线 form the header row (across
the top, 5 cols) and 3 阶段 form the first column (down the side,
3 rows). Cell contents preserved 1:1; reading guide in §2 intro
updated. docx regenerated.

Made-with: Cursor
</commit_message>
<xml_diff>
--- a/docs/codenames-cheatsheet.docx
+++ b/docs/codenames-cheatsheet.docx
@@ -416,27 +416,27 @@
         <w:pStyle w:val="BlockText"/>
       </w:pPr>
       <w:r>
-        <w:t xml:space="preserve">读法:先锁定一条</w:t>
+        <w:t xml:space="preserve">读法:</w:t>
       </w:r>
       <w:r>
         <w:rPr>
           <w:bCs/>
           <w:b/>
         </w:rPr>
-        <w:t xml:space="preserve">管线</w:t>
-      </w:r>
-      <w:r>
-        <w:t xml:space="preserve">(行,生成 / 训练 / 评测 / 存储 / 监控),再横向对比 3 个</w:t>
+        <w:t xml:space="preserve">5 个管线横排表头</w:t>
+      </w:r>
+      <w:r>
+        <w:t xml:space="preserve">(生成 / 训练 / 评测 / 存储 / 监控),</w:t>
       </w:r>
       <w:r>
         <w:rPr>
           <w:bCs/>
           <w:b/>
         </w:rPr>
-        <w:t xml:space="preserve">阶段</w:t>
-      </w:r>
-      <w:r>
-        <w:t xml:space="preserve">(列,P1 / P2 / P3),每格列出</w:t>
+        <w:t xml:space="preserve">3 个阶段竖排第一列</w:t>
+      </w:r>
+      <w:r>
+        <w:t xml:space="preserve">(P1 / P2 / P3)。每格列出</w:t>
       </w:r>
       <w:r>
         <w:rPr>
@@ -466,10 +466,12 @@
         <w:jc w:val="start"/>
       </w:tblPr>
       <w:tblGrid>
-        <w:gridCol w:w="1980"/>
-        <w:gridCol w:w="1980"/>
-        <w:gridCol w:w="1980"/>
-        <w:gridCol w:w="1980"/>
+        <w:gridCol w:w="1320"/>
+        <w:gridCol w:w="1320"/>
+        <w:gridCol w:w="1320"/>
+        <w:gridCol w:w="1320"/>
+        <w:gridCol w:w="1320"/>
+        <w:gridCol w:w="1320"/>
       </w:tblGrid>
       <w:tr>
         <w:trPr>
@@ -483,64 +485,99 @@
               <w:jc w:val="left"/>
             </w:pPr>
             <w:r>
-              <w:t xml:space="preserve">管线 \ 阶段</w:t>
-            </w:r>
-          </w:p>
-        </w:tc>
-        <w:tc>
-          <w:tcPr/>
-          <w:p>
-            <w:pPr>
-              <w:pStyle w:val="Compact"/>
-              <w:jc w:val="left"/>
-            </w:pPr>
-            <w:r>
-              <w:rPr>
-                <w:bCs/>
-                <w:b/>
-              </w:rPr>
-              <w:t xml:space="preserve">P1 复现</w:t>
-            </w:r>
-            <w:r>
-              <w:t xml:space="preserve">(🟡 R1 进行中,40%)</w:t>
-            </w:r>
-          </w:p>
-        </w:tc>
-        <w:tc>
-          <w:tcPr/>
-          <w:p>
-            <w:pPr>
-              <w:pStyle w:val="Compact"/>
-              <w:jc w:val="left"/>
-            </w:pPr>
-            <w:r>
-              <w:rPr>
-                <w:bCs/>
-                <w:b/>
-              </w:rPr>
-              <w:t xml:space="preserve">P2 PoC</w:t>
-            </w:r>
-            <w:r>
-              <w:t xml:space="preserve">(⏳ R1/R2 结束后启动)</w:t>
-            </w:r>
-          </w:p>
-        </w:tc>
-        <w:tc>
-          <w:tcPr/>
-          <w:p>
-            <w:pPr>
-              <w:pStyle w:val="Compact"/>
-              <w:jc w:val="left"/>
-            </w:pPr>
-            <w:r>
-              <w:rPr>
-                <w:bCs/>
-                <w:b/>
-              </w:rPr>
-              <w:t xml:space="preserve">P3 扩容发布</w:t>
-            </w:r>
-            <w:r>
-              <w:t xml:space="preserve">(⏳)</w:t>
+              <w:t xml:space="preserve">阶段 \ 管线</w:t>
+            </w:r>
+          </w:p>
+        </w:tc>
+        <w:tc>
+          <w:tcPr/>
+          <w:p>
+            <w:pPr>
+              <w:pStyle w:val="Compact"/>
+              <w:jc w:val="left"/>
+            </w:pPr>
+            <w:r>
+              <w:rPr>
+                <w:bCs/>
+                <w:b/>
+              </w:rPr>
+              <w:t xml:space="preserve">生成管线</w:t>
+            </w:r>
+            <w:r>
+              <w:t xml:space="preserve">(ADR 0003)</w:t>
+            </w:r>
+          </w:p>
+        </w:tc>
+        <w:tc>
+          <w:tcPr/>
+          <w:p>
+            <w:pPr>
+              <w:pStyle w:val="Compact"/>
+              <w:jc w:val="left"/>
+            </w:pPr>
+            <w:r>
+              <w:rPr>
+                <w:bCs/>
+                <w:b/>
+              </w:rPr>
+              <w:t xml:space="preserve">训练管线</w:t>
+            </w:r>
+            <w:r>
+              <w:t xml:space="preserve">(ADR 0007 / 0008 / 0009)</w:t>
+            </w:r>
+          </w:p>
+        </w:tc>
+        <w:tc>
+          <w:tcPr/>
+          <w:p>
+            <w:pPr>
+              <w:pStyle w:val="Compact"/>
+              <w:jc w:val="left"/>
+            </w:pPr>
+            <w:r>
+              <w:rPr>
+                <w:bCs/>
+                <w:b/>
+              </w:rPr>
+              <w:t xml:space="preserve">评测管线</w:t>
+            </w:r>
+            <w:r>
+              <w:t xml:space="preserve">(ADR 0004 / 0006 / 0009)</w:t>
+            </w:r>
+          </w:p>
+        </w:tc>
+        <w:tc>
+          <w:tcPr/>
+          <w:p>
+            <w:pPr>
+              <w:pStyle w:val="Compact"/>
+              <w:jc w:val="left"/>
+            </w:pPr>
+            <w:r>
+              <w:rPr>
+                <w:bCs/>
+                <w:b/>
+              </w:rPr>
+              <w:t xml:space="preserve">存储</w:t>
+            </w:r>
+            <w:r>
+              <w:t xml:space="preserve">(ADR 0001)</w:t>
+            </w:r>
+          </w:p>
+        </w:tc>
+        <w:tc>
+          <w:tcPr/>
+          <w:p>
+            <w:pPr>
+              <w:pStyle w:val="Compact"/>
+              <w:jc w:val="left"/>
+            </w:pPr>
+            <w:r>
+              <w:rPr>
+                <w:bCs/>
+                <w:b/>
+              </w:rPr>
+              <w:t xml:space="preserve">监控</w:t>
             </w:r>
           </w:p>
         </w:tc>
@@ -558,10 +595,10 @@
                 <w:bCs/>
                 <w:b/>
               </w:rPr>
-              <w:t xml:space="preserve">生成管线</w:t>
-            </w:r>
-            <w:r>
-              <w:t xml:space="preserve">(ADR 0003)</w:t>
+              <w:t xml:space="preserve">P1 复现</w:t>
+            </w:r>
+            <w:r>
+              <w:t xml:space="preserve">🟡 R1 进行中,40%</w:t>
             </w:r>
           </w:p>
         </w:tc>
@@ -585,13 +622,6 @@
               <w:jc w:val="left"/>
             </w:pPr>
             <w:r>
-              <w:rPr>
-                <w:bCs/>
-                <w:b/>
-              </w:rPr>
-              <w:t xml:space="preserve">【配置层(W1 产物)】</w:t>
-            </w:r>
-            <w:r>
               <w:t xml:space="preserve">•</w:t>
             </w:r>
             <w:r>
@@ -599,12 +629,100 @@
             </w:r>
             <w:r>
               <w:rPr>
+                <w:bCs/>
+                <w:b/>
+              </w:rPr>
+              <w:t xml:space="preserve">架构</w:t>
+            </w:r>
+            <w:r>
+              <w:t xml:space="preserve">:</w:t>
+            </w:r>
+            <w:r>
+              <w:rPr>
+                <w:bCs/>
+                <w:b/>
+              </w:rPr>
+              <w:t xml:space="preserve">Protocol A</w:t>
+            </w:r>
+            <w:r>
+              <w:t xml:space="preserve">(Llama2-1.82B,Mistral-7B tokenizer,</w:t>
+            </w:r>
+            <w:r>
+              <w:rPr>
+                <w:bCs/>
+                <w:b/>
+              </w:rPr>
+              <w:t xml:space="preserve">仅用 2 次</w:t>
+            </w:r>
+            <w:r>
+              <w:t xml:space="preserve">)+</w:t>
+            </w:r>
+            <w:r>
+              <w:t xml:space="preserve"> </w:t>
+            </w:r>
+            <w:r>
+              <w:rPr>
+                <w:bCs/>
+                <w:b/>
+              </w:rPr>
+              <w:t xml:space="preserve">Protocol B</w:t>
+            </w:r>
+            <w:r>
+              <w:t xml:space="preserve">(Qwen3-1.7B,Qwen 151k,工作架构)</w:t>
+            </w:r>
+            <w:r>
+              <w:t xml:space="preserve">•</w:t>
+            </w:r>
+            <w:r>
+              <w:t xml:space="preserve"> </w:t>
+            </w:r>
+            <w:r>
+              <w:rPr>
+                <w:bCs/>
+                <w:b/>
+              </w:rPr>
+              <w:t xml:space="preserve">后端</w:t>
+            </w:r>
+            <w:r>
+              <w:t xml:space="preserve">:FA2 默认 + ADR 0008 FA3 switch(</w:t>
+            </w:r>
+            <w:r>
+              <w:rPr>
+                <w:bCs/>
+                <w:b/>
+              </w:rPr>
+              <w:t xml:space="preserve">T1</w:t>
+            </w:r>
+            <w:r>
+              <w:t xml:space="preserve">,默认 OFF)</w:t>
+            </w:r>
+            <w:r>
+              <w:t xml:space="preserve">•</w:t>
+            </w:r>
+            <w:r>
+              <w:t xml:space="preserve"> </w:t>
+            </w:r>
+            <w:r>
+              <w:rPr>
+                <w:bCs/>
+                <w:b/>
+              </w:rPr>
+              <w:t xml:space="preserve">数据</w:t>
+            </w:r>
+            <w:r>
+              <w:t xml:space="preserve">:</w:t>
+            </w:r>
+            <w:r>
+              <w:rPr>
                 <w:rStyle w:val="VerbatimChar"/>
               </w:rPr>
-              <w:t xml:space="preserve">configs/topics.yaml</w:t>
-            </w:r>
-            <w:r>
-              <w:t xml:space="preserve">(~90k,BISAC 34k + Wiki 2 层 + arXiv + MMLU 57 反锚)</w:t>
+              <w:t xml:space="preserve">cosmo_v2_qwen3</w:t>
+            </w:r>
+            <w:r>
+              <w:t xml:space="preserve"> </w:t>
+            </w:r>
+            <w:r>
+              <w:t xml:space="preserve">tokenized dataset</w:t>
             </w:r>
             <w:r>
               <w:t xml:space="preserve">•</w:t>
@@ -614,25 +732,198 @@
             </w:r>
             <w:r>
               <w:rPr>
+                <w:bCs/>
+                <w:b/>
+              </w:rPr>
+              <w:t xml:space="preserve">转换</w:t>
+            </w:r>
+            <w:r>
+              <w:t xml:space="preserve">:ADR 0009 nanotron → HF(eval 前置必经)</w:t>
+            </w:r>
+            <w:r>
+              <w:t xml:space="preserve">•</w:t>
+            </w:r>
+            <w:r>
+              <w:t xml:space="preserve"> </w:t>
+            </w:r>
+            <w:r>
+              <w:rPr>
+                <w:bCs/>
+                <w:b/>
+              </w:rPr>
+              <w:t xml:space="preserve">工程 TODO</w:t>
+            </w:r>
+            <w:r>
+              <w:t xml:space="preserve">:</w:t>
+            </w:r>
+            <w:r>
+              <w:rPr>
+                <w:bCs/>
+                <w:b/>
+              </w:rPr>
+              <w:t xml:space="preserve">T3</w:t>
+            </w:r>
+            <w:r>
+              <w:t xml:space="preserve"> </w:t>
+            </w:r>
+            <w:r>
+              <w:t xml:space="preserve">bootstrap_env.sh 自动 apply 4 个 nanotron 补丁 ·</w:t>
+            </w:r>
+            <w:r>
+              <w:t xml:space="preserve"> </w:t>
+            </w:r>
+            <w:r>
+              <w:rPr>
+                <w:bCs/>
+                <w:b/>
+              </w:rPr>
+              <w:t xml:space="preserve">T4</w:t>
+            </w:r>
+            <w:r>
+              <w:t xml:space="preserve"> </w:t>
+            </w:r>
+            <w:r>
+              <w:t xml:space="preserve">lint_nanotron_yaml.py YAML 审计</w:t>
+            </w:r>
+            <w:r>
+              <w:t xml:space="preserve">•</w:t>
+            </w:r>
+            <w:r>
+              <w:t xml:space="preserve"> </w:t>
+            </w:r>
+            <w:r>
+              <w:rPr>
+                <w:bCs/>
+                <w:b/>
+              </w:rPr>
+              <w:t xml:space="preserve">运行轨迹</w:t>
+            </w:r>
+            <w:r>
+              <w:t xml:space="preserve">:</w:t>
+            </w:r>
+            <w:r>
+              <w:rPr>
+                <w:bCs/>
+                <w:b/>
+              </w:rPr>
+              <w:t xml:space="preserve">R0</w:t>
+            </w:r>
+            <w:r>
+              <w:t xml:space="preserve">(弃)→ ★</w:t>
+            </w:r>
+            <w:r>
+              <w:rPr>
+                <w:bCs/>
+                <w:b/>
+              </w:rPr>
+              <w:t xml:space="preserve">R1</w:t>
+            </w:r>
+            <w:r>
+              <w:t xml:space="preserve"> </w:t>
+            </w:r>
+            <w:r>
+              <w:t xml:space="preserve">seed42 30B(40%)→</w:t>
+            </w:r>
+            <w:r>
+              <w:t xml:space="preserve"> </w:t>
+            </w:r>
+            <w:r>
+              <w:rPr>
+                <w:bCs/>
+                <w:b/>
+              </w:rPr>
+              <w:t xml:space="preserve">R2</w:t>
+            </w:r>
+            <w:r>
+              <w:t xml:space="preserve"> </w:t>
+            </w:r>
+            <w:r>
+              <w:t xml:space="preserve">seed1337 30B →</w:t>
+            </w:r>
+            <w:r>
+              <w:t xml:space="preserve"> </w:t>
+            </w:r>
+            <w:r>
+              <w:rPr>
+                <w:bCs/>
+                <w:b/>
+              </w:rPr>
+              <w:t xml:space="preserve">E1 = R1+R2</w:t>
+            </w:r>
+            <w:r>
+              <w:t xml:space="preserve"> </w:t>
+            </w:r>
+            <w:r>
+              <w:t xml:space="preserve">基线入账</w:t>
+            </w:r>
+          </w:p>
+        </w:tc>
+        <w:tc>
+          <w:tcPr/>
+          <w:p>
+            <w:pPr>
+              <w:pStyle w:val="Compact"/>
+              <w:jc w:val="left"/>
+            </w:pPr>
+            <w:r>
+              <w:t xml:space="preserve">•</w:t>
+            </w:r>
+            <w:r>
+              <w:t xml:space="preserve"> </w:t>
+            </w:r>
+            <w:r>
+              <w:rPr>
+                <w:bCs/>
+                <w:b/>
+              </w:rPr>
+              <w:t xml:space="preserve">轨道</w:t>
+            </w:r>
+            <w:r>
+              <w:t xml:space="preserve">:Track 1 / Track 2 双轨协议就位(ADR 0004),P1 主用 Track 1 跑通端到端</w:t>
+            </w:r>
+            <w:r>
+              <w:t xml:space="preserve">•</w:t>
+            </w:r>
+            <w:r>
+              <w:t xml:space="preserve"> </w:t>
+            </w:r>
+            <w:r>
+              <w:rPr>
+                <w:bCs/>
+                <w:b/>
+              </w:rPr>
+              <w:t xml:space="preserve">工具链</w:t>
+            </w:r>
+            <w:r>
+              <w:t xml:space="preserve">:lighteval pinned(ADR 0006)</w:t>
+            </w:r>
+            <w:r>
+              <w:t xml:space="preserve">•</w:t>
+            </w:r>
+            <w:r>
+              <w:t xml:space="preserve"> </w:t>
+            </w:r>
+            <w:r>
+              <w:rPr>
+                <w:bCs/>
+                <w:b/>
+              </w:rPr>
+              <w:t xml:space="preserve">输入</w:t>
+            </w:r>
+            <w:r>
+              <w:t xml:space="preserve">:ADR 0009 HF ckpt(通过</w:t>
+            </w:r>
+            <w:r>
+              <w:t xml:space="preserve"> </w:t>
+            </w:r>
+            <w:r>
+              <w:rPr>
                 <w:rStyle w:val="VerbatimChar"/>
               </w:rPr>
-              <w:t xml:space="preserve">configs/personas.yaml</w:t>
-            </w:r>
-            <w:r>
-              <w:t xml:space="preserve">(10k,</w:t>
-            </w:r>
-            <w:r>
-              <w:rPr>
-                <w:bCs/>
-                <w:b/>
-              </w:rPr>
-              <w:t xml:space="preserve">⑥</w:t>
-            </w:r>
-            <w:r>
-              <w:t xml:space="preserve"> </w:t>
-            </w:r>
-            <w:r>
-              <w:t xml:space="preserve">由 PersonaHub 过滤)</w:t>
+              <w:t xml:space="preserve">scripts/convert_nanotron_qwen2_to_hf.py</w:t>
+            </w:r>
+            <w:r>
+              <w:t xml:space="preserve">)</w:t>
             </w:r>
             <w:r>
               <w:t xml:space="preserve">•</w:t>
@@ -642,13 +933,133 @@
             </w:r>
             <w:r>
               <w:rPr>
+                <w:bCs/>
+                <w:b/>
+              </w:rPr>
+              <w:t xml:space="preserve">任务组</w:t>
+            </w:r>
+            <w:r>
+              <w:t xml:space="preserve">:</w:t>
+            </w:r>
+            <w:r>
+              <w:rPr>
                 <w:rStyle w:val="VerbatimChar"/>
-              </w:rPr>
-              <w:t xml:space="preserve">configs/generators.yaml</w:t>
-            </w:r>
-            <w:r>
-              <w:t xml:space="preserve">(ADR 0003,midtier / frontier / critic)</w:t>
-            </w:r>
+                <w:bCs/>
+                <w:b/>
+              </w:rPr>
+              <w:t xml:space="preserve">cosmopedia-full</w:t>
+            </w:r>
+            <w:r>
+              <w:t xml:space="preserve">(129 任务,与 SmolLM</w:t>
+            </w:r>
+            <w:r>
+              <w:t xml:space="preserve"> </w:t>
+            </w:r>
+            <w:r>
+              <w:rPr>
+                <w:rStyle w:val="VerbatimChar"/>
+              </w:rPr>
+              <w:t xml:space="preserve">eval.slurm</w:t>
+            </w:r>
+            <w:r>
+              <w:t xml:space="preserve"> </w:t>
+            </w:r>
+            <w:r>
+              <w:t xml:space="preserve">对齐,发表级)+</w:t>
+            </w:r>
+            <w:r>
+              <w:t xml:space="preserve"> </w:t>
+            </w:r>
+            <w:r>
+              <w:rPr>
+                <w:rStyle w:val="VerbatimChar"/>
+              </w:rPr>
+              <w:t xml:space="preserve">early-signal</w:t>
+            </w:r>
+            <w:r>
+              <w:t xml:space="preserve">(debug,不作为对外声明)</w:t>
+            </w:r>
+          </w:p>
+        </w:tc>
+        <w:tc>
+          <w:tcPr/>
+          <w:p>
+            <w:pPr>
+              <w:pStyle w:val="Compact"/>
+              <w:jc w:val="left"/>
+            </w:pPr>
+            <w:r>
+              <w:rPr>
+                <w:bCs/>
+                <w:b/>
+              </w:rPr>
+              <w:t xml:space="preserve">L1</w:t>
+            </w:r>
+            <w:r>
+              <w:t xml:space="preserve"> </w:t>
+            </w:r>
+            <w:r>
+              <w:t xml:space="preserve">本地 NVMe</w:t>
+            </w:r>
+            <w:r>
+              <w:t xml:space="preserve"> </w:t>
+            </w:r>
+            <w:r>
+              <w:rPr>
+                <w:rStyle w:val="VerbatimChar"/>
+              </w:rPr>
+              <w:t xml:space="preserve">/home/ubuntu/lilei/projects/Incepedia/</w:t>
+            </w:r>
+            <w:r>
+              <w:t xml:space="preserve">(single source of truth)</w:t>
+            </w:r>
+            <w:r>
+              <w:rPr>
+                <w:bCs/>
+                <w:b/>
+              </w:rPr>
+              <w:t xml:space="preserve">L2</w:t>
+            </w:r>
+            <w:r>
+              <w:t xml:space="preserve"> </w:t>
+            </w:r>
+            <w:r>
+              <w:t xml:space="preserve">NAS</w:t>
+            </w:r>
+            <w:r>
+              <w:t xml:space="preserve"> </w:t>
+            </w:r>
+            <w:r>
+              <w:rPr>
+                <w:rStyle w:val="VerbatimChar"/>
+              </w:rPr>
+              <w:t xml:space="preserve">/lambda/nfs/us-south-2/incepedia_exp_bak/</w:t>
+            </w:r>
+            <w:r>
+              <w:t xml:space="preserve">(事件驱动 rsync 冷镜像)</w:t>
+            </w:r>
+            <w:r>
+              <w:rPr>
+                <w:bCs/>
+                <w:b/>
+              </w:rPr>
+              <w:t xml:space="preserve">L3</w:t>
+            </w:r>
+            <w:r>
+              <w:t xml:space="preserve"> </w:t>
+            </w:r>
+            <w:r>
+              <w:t xml:space="preserve">git remote(&lt;100MB 结构化产物兜底)</w:t>
+            </w:r>
+          </w:p>
+        </w:tc>
+        <w:tc>
+          <w:tcPr/>
+          <w:p>
+            <w:pPr>
+              <w:pStyle w:val="Compact"/>
+              <w:jc w:val="left"/>
+            </w:pPr>
             <w:r>
               <w:t xml:space="preserve">•</w:t>
             </w:r>
@@ -657,22 +1068,25 @@
             </w:r>
             <w:r>
               <w:rPr>
+                <w:bCs/>
+                <w:b/>
+              </w:rPr>
+              <w:t xml:space="preserve">T2</w:t>
+            </w:r>
+            <w:r>
+              <w:t xml:space="preserve"> </w:t>
+            </w:r>
+            <w:r>
+              <w:t xml:space="preserve">sidecar:</w:t>
+            </w:r>
+            <w:r>
+              <w:rPr>
                 <w:rStyle w:val="VerbatimChar"/>
               </w:rPr>
-              <w:t xml:space="preserve">configs/disallowed_openings.yaml</w:t>
-            </w:r>
-            <w:r>
-              <w:t xml:space="preserve">(</w:t>
-            </w:r>
-            <w:r>
-              <w:rPr>
-                <w:bCs/>
-                <w:b/>
-              </w:rPr>
-              <w:t xml:space="preserve">C14</w:t>
-            </w:r>
-            <w:r>
-              <w:t xml:space="preserve">,动态扩容)</w:t>
+              <w:t xml:space="preserve">scripts/tail_train_log_to_aim.py</w:t>
+            </w:r>
+            <w:r>
+              <w:t xml:space="preserve">(train.log → Aim)</w:t>
             </w:r>
             <w:r>
               <w:t xml:space="preserve">•</w:t>
@@ -682,236 +1096,16 @@
             </w:r>
             <w:r>
               <w:rPr>
-                <w:rStyle w:val="VerbatimChar"/>
-              </w:rPr>
-              <w:t xml:space="preserve">configs/batches/v0.1_pilot.yaml</w:t>
-            </w:r>
-            <w:r>
-              <w:t xml:space="preserve">(</w:t>
-            </w:r>
-            <w:r>
-              <w:rPr>
-                <w:bCs/>
-                <w:b/>
-              </w:rPr>
-              <w:t xml:space="preserve">C12</w:t>
-            </w:r>
-            <w:r>
-              <w:t xml:space="preserve">,批配方完整声明)</w:t>
-            </w:r>
-            <w:r>
-              <w:t xml:space="preserve">•</w:t>
-            </w:r>
-            <w:r>
-              <w:t xml:space="preserve"> </w:t>
-            </w:r>
-            <w:r>
-              <w:rPr>
-                <w:rStyle w:val="VerbatimChar"/>
-              </w:rPr>
-              <w:t xml:space="preserve">data/seeds/*.parquet</w:t>
-            </w:r>
-            <w:r>
-              <w:t xml:space="preserve">(</w:t>
-            </w:r>
-            <w:r>
-              <w:rPr>
-                <w:bCs/>
-                <w:b/>
-              </w:rPr>
-              <w:t xml:space="preserve">⑤</w:t>
-            </w:r>
-            <w:r>
-              <w:t xml:space="preserve"> </w:t>
-            </w:r>
-            <w:r>
-              <w:t xml:space="preserve">新增 OpenStax + Stack-Edu + arXiv full)</w:t>
-            </w:r>
-            <w:r>
-              <w:rPr>
-                <w:bCs/>
-                <w:b/>
-              </w:rPr>
-              <w:t xml:space="preserve">【生成(W2–W5)】</w:t>
-            </w:r>
-            <w:r>
-              <w:t xml:space="preserve">• 基础 16 条方针:</w:t>
-            </w:r>
-            <w:r>
-              <w:rPr>
-                <w:bCs/>
-                <w:b/>
-              </w:rPr>
-              <w:t xml:space="preserve">C1–C12</w:t>
-            </w:r>
-            <w:r>
-              <w:t xml:space="preserve">(seed grounding / persona / 难度 / 模板 / 异步 / audit ...)</w:t>
-            </w:r>
-            <w:r>
-              <w:t xml:space="preserve">• ★超越点:</w:t>
-            </w:r>
-            <w:r>
-              <w:rPr>
-                <w:bCs/>
-                <w:b/>
-              </w:rPr>
-              <w:t xml:space="preserve">C13</w:t>
-            </w:r>
-            <w:r>
-              <w:t xml:space="preserve"> </w:t>
-            </w:r>
-            <w:r>
-              <w:t xml:space="preserve">instruction reversal ·</w:t>
-            </w:r>
-            <w:r>
-              <w:t xml:space="preserve"> </w:t>
-            </w:r>
-            <w:r>
-              <w:rPr>
-                <w:bCs/>
-                <w:b/>
-              </w:rPr>
-              <w:t xml:space="preserve">C14</w:t>
-            </w:r>
-            <w:r>
-              <w:t xml:space="preserve"> </w:t>
-            </w:r>
-            <w:r>
-              <w:t xml:space="preserve">反单调 ·</w:t>
-            </w:r>
-            <w:r>
-              <w:t xml:space="preserve"> </w:t>
-            </w:r>
-            <w:r>
-              <w:rPr>
-                <w:bCs/>
-                <w:b/>
-              </w:rPr>
-              <w:t xml:space="preserve">C15</w:t>
-            </w:r>
-            <w:r>
-              <w:t xml:space="preserve"> </w:t>
-            </w:r>
-            <w:r>
-              <w:t xml:space="preserve">rephrase 主路径 ·</w:t>
-            </w:r>
-            <w:r>
-              <w:t xml:space="preserve"> </w:t>
-            </w:r>
-            <w:r>
-              <w:rPr>
-                <w:bCs/>
-                <w:b/>
-              </w:rPr>
-              <w:t xml:space="preserve">C16</w:t>
-            </w:r>
-            <w:r>
-              <w:t xml:space="preserve"> </w:t>
-            </w:r>
-            <w:r>
-              <w:t xml:space="preserve">synthetic 贯穿</w:t>
-            </w:r>
-            <w:r>
-              <w:t xml:space="preserve">• 质量升级</w:t>
-            </w:r>
-            <w:r>
-              <w:t xml:space="preserve"> </w:t>
-            </w:r>
-            <w:r>
-              <w:rPr>
-                <w:bCs/>
-                <w:b/>
-              </w:rPr>
-              <w:t xml:space="preserve">①–⑦</w:t>
-            </w:r>
-            <w:r>
-              <w:t xml:space="preserve">(10B uniq / frontier 50% / Best-of-N / critic 50%×2 / 多源 seed / persona 10k / 模板 20)</w:t>
-            </w:r>
-            <w:r>
-              <w:rPr>
-                <w:bCs/>
-                <w:b/>
-              </w:rPr>
-              <w:t xml:space="preserve">【后处理(W6)】</w:t>
-            </w:r>
-            <w:r>
-              <w:t xml:space="preserve">Stage 1 MinHash dedup · Stage 2 BGE embed dedup · Stage 3 fineweb-edu classifier ≥3 · Stage 4 decontam(MMLU / MMLU-Pro / GSM8k / MATH / HumanEval / MBPP)</w:t>
-            </w:r>
-            <w:r>
-              <w:t xml:space="preserve">**【时间线】**W1 基建 5d → W2 pilot+G1/G2 → W3–W5 全量</w:t>
-            </w:r>
-            <w:r>
-              <w:t xml:space="preserve"> </w:t>
-            </w:r>
-            <w:r>
-              <w:rPr>
-                <w:bCs/>
-                <w:b/>
-              </w:rPr>
-              <w:t xml:space="preserve">10B uniq</w:t>
-            </w:r>
-            <w:r>
-              <w:t xml:space="preserve"> </w:t>
-            </w:r>
-            <w:r>
-              <w:t xml:space="preserve">→ ★W6 dedup+tokenize</w:t>
-            </w:r>
-          </w:p>
-        </w:tc>
-        <w:tc>
-          <w:tcPr/>
-          <w:p>
-            <w:pPr>
-              <w:pStyle w:val="Compact"/>
-              <w:jc w:val="left"/>
-            </w:pPr>
-            <w:r>
-              <w:t xml:space="preserve">• ★</w:t>
-            </w:r>
-            <w:r>
-              <w:rPr>
-                <w:bCs/>
-                <w:b/>
-              </w:rPr>
-              <w:t xml:space="preserve">⑧</w:t>
-            </w:r>
-            <w:r>
-              <w:t xml:space="preserve"> </w:t>
-            </w:r>
-            <w:r>
-              <w:t xml:space="preserve">multi-agent debate(expert 档 20%)</w:t>
-            </w:r>
-            <w:r>
-              <w:t xml:space="preserve">• ★</w:t>
-            </w:r>
-            <w:r>
-              <w:rPr>
-                <w:bCs/>
-                <w:b/>
-              </w:rPr>
-              <w:t xml:space="preserve">⑨</w:t>
-            </w:r>
-            <w:r>
-              <w:t xml:space="preserve"> </w:t>
-            </w:r>
-            <w:r>
-              <w:t xml:space="preserve">全局滚动 embed 索引(FAISS 1M 滑窗)</w:t>
-            </w:r>
-            <w:r>
-              <w:t xml:space="preserve">• uniq 10B →</w:t>
-            </w:r>
-            <w:r>
-              <w:t xml:space="preserve"> </w:t>
-            </w:r>
-            <w:r>
-              <w:rPr>
-                <w:bCs/>
-                <w:b/>
-              </w:rPr>
-              <w:t xml:space="preserve">30B v1.0 冻结</w:t>
-            </w:r>
-            <w:r>
-              <w:t xml:space="preserve">• C1–C16 主线保留,不新增 C 决策</w:t>
+                <w:bCs/>
+                <w:b/>
+              </w:rPr>
+              <w:t xml:space="preserve">T5</w:t>
+            </w:r>
+            <w:r>
+              <w:t xml:space="preserve"> </w:t>
+            </w:r>
+            <w:r>
+              <w:t xml:space="preserve">nanotron 原生直连 Aim / W&amp;B 🟡 R1 完成后替代 sidecar</w:t>
             </w:r>
           </w:p>
         </w:tc>
@@ -929,20 +1123,27 @@
                 <w:bCs/>
                 <w:b/>
               </w:rPr>
-              <w:t xml:space="preserve">训练管线</w:t>
-            </w:r>
-            <w:r>
-              <w:t xml:space="preserve">(ADR 0007 / 0008 / 0009)</w:t>
-            </w:r>
-          </w:p>
-        </w:tc>
-        <w:tc>
-          <w:tcPr/>
-          <w:p>
-            <w:pPr>
-              <w:pStyle w:val="Compact"/>
-              <w:jc w:val="left"/>
-            </w:pPr>
+              <w:t xml:space="preserve">P2 PoC</w:t>
+            </w:r>
+            <w:r>
+              <w:t xml:space="preserve">⏳ R1/R2 结束后启动</w:t>
+            </w:r>
+          </w:p>
+        </w:tc>
+        <w:tc>
+          <w:tcPr/>
+          <w:p>
+            <w:pPr>
+              <w:pStyle w:val="Compact"/>
+              <w:jc w:val="left"/>
+            </w:pPr>
+            <w:r>
+              <w:rPr>
+                <w:bCs/>
+                <w:b/>
+              </w:rPr>
+              <w:t xml:space="preserve">【配置层(W1 产物)】</w:t>
+            </w:r>
             <w:r>
               <w:t xml:space="preserve">•</w:t>
             </w:r>
@@ -951,10 +1152,405 @@
             </w:r>
             <w:r>
               <w:rPr>
-                <w:bCs/>
-                <w:b/>
-              </w:rPr>
-              <w:t xml:space="preserve">架构</w:t>
+                <w:rStyle w:val="VerbatimChar"/>
+              </w:rPr>
+              <w:t xml:space="preserve">configs/topics.yaml</w:t>
+            </w:r>
+            <w:r>
+              <w:t xml:space="preserve">(~90k,BISAC 34k + Wiki 2 层 + arXiv + MMLU 57 反锚)</w:t>
+            </w:r>
+            <w:r>
+              <w:t xml:space="preserve">•</w:t>
+            </w:r>
+            <w:r>
+              <w:t xml:space="preserve"> </w:t>
+            </w:r>
+            <w:r>
+              <w:rPr>
+                <w:rStyle w:val="VerbatimChar"/>
+              </w:rPr>
+              <w:t xml:space="preserve">configs/personas.yaml</w:t>
+            </w:r>
+            <w:r>
+              <w:t xml:space="preserve">(10k,</w:t>
+            </w:r>
+            <w:r>
+              <w:rPr>
+                <w:bCs/>
+                <w:b/>
+              </w:rPr>
+              <w:t xml:space="preserve">⑥</w:t>
+            </w:r>
+            <w:r>
+              <w:t xml:space="preserve"> </w:t>
+            </w:r>
+            <w:r>
+              <w:t xml:space="preserve">由 PersonaHub 过滤)</w:t>
+            </w:r>
+            <w:r>
+              <w:t xml:space="preserve">•</w:t>
+            </w:r>
+            <w:r>
+              <w:t xml:space="preserve"> </w:t>
+            </w:r>
+            <w:r>
+              <w:rPr>
+                <w:rStyle w:val="VerbatimChar"/>
+              </w:rPr>
+              <w:t xml:space="preserve">configs/generators.yaml</w:t>
+            </w:r>
+            <w:r>
+              <w:t xml:space="preserve">(ADR 0003,midtier / frontier / critic)</w:t>
+            </w:r>
+            <w:r>
+              <w:t xml:space="preserve">•</w:t>
+            </w:r>
+            <w:r>
+              <w:t xml:space="preserve"> </w:t>
+            </w:r>
+            <w:r>
+              <w:rPr>
+                <w:rStyle w:val="VerbatimChar"/>
+              </w:rPr>
+              <w:t xml:space="preserve">configs/disallowed_openings.yaml</w:t>
+            </w:r>
+            <w:r>
+              <w:t xml:space="preserve">(</w:t>
+            </w:r>
+            <w:r>
+              <w:rPr>
+                <w:bCs/>
+                <w:b/>
+              </w:rPr>
+              <w:t xml:space="preserve">C14</w:t>
+            </w:r>
+            <w:r>
+              <w:t xml:space="preserve">,动态扩容)</w:t>
+            </w:r>
+            <w:r>
+              <w:t xml:space="preserve">•</w:t>
+            </w:r>
+            <w:r>
+              <w:t xml:space="preserve"> </w:t>
+            </w:r>
+            <w:r>
+              <w:rPr>
+                <w:rStyle w:val="VerbatimChar"/>
+              </w:rPr>
+              <w:t xml:space="preserve">configs/batches/v0.1_pilot.yaml</w:t>
+            </w:r>
+            <w:r>
+              <w:t xml:space="preserve">(</w:t>
+            </w:r>
+            <w:r>
+              <w:rPr>
+                <w:bCs/>
+                <w:b/>
+              </w:rPr>
+              <w:t xml:space="preserve">C12</w:t>
+            </w:r>
+            <w:r>
+              <w:t xml:space="preserve">,批配方完整声明)</w:t>
+            </w:r>
+            <w:r>
+              <w:t xml:space="preserve">•</w:t>
+            </w:r>
+            <w:r>
+              <w:t xml:space="preserve"> </w:t>
+            </w:r>
+            <w:r>
+              <w:rPr>
+                <w:rStyle w:val="VerbatimChar"/>
+              </w:rPr>
+              <w:t xml:space="preserve">data/seeds/*.parquet</w:t>
+            </w:r>
+            <w:r>
+              <w:t xml:space="preserve">(</w:t>
+            </w:r>
+            <w:r>
+              <w:rPr>
+                <w:bCs/>
+                <w:b/>
+              </w:rPr>
+              <w:t xml:space="preserve">⑤</w:t>
+            </w:r>
+            <w:r>
+              <w:t xml:space="preserve"> </w:t>
+            </w:r>
+            <w:r>
+              <w:t xml:space="preserve">新增 OpenStax + Stack-Edu + arXiv full)</w:t>
+            </w:r>
+            <w:r>
+              <w:rPr>
+                <w:bCs/>
+                <w:b/>
+              </w:rPr>
+              <w:t xml:space="preserve">【生成(W2–W5)】</w:t>
+            </w:r>
+            <w:r>
+              <w:t xml:space="preserve">• 基础 16 条方针:</w:t>
+            </w:r>
+            <w:r>
+              <w:rPr>
+                <w:bCs/>
+                <w:b/>
+              </w:rPr>
+              <w:t xml:space="preserve">C1–C12</w:t>
+            </w:r>
+            <w:r>
+              <w:t xml:space="preserve">(seed grounding / persona / 难度 / 模板 / 异步 / audit ...)</w:t>
+            </w:r>
+            <w:r>
+              <w:t xml:space="preserve">• ★超越点:</w:t>
+            </w:r>
+            <w:r>
+              <w:rPr>
+                <w:bCs/>
+                <w:b/>
+              </w:rPr>
+              <w:t xml:space="preserve">C13</w:t>
+            </w:r>
+            <w:r>
+              <w:t xml:space="preserve"> </w:t>
+            </w:r>
+            <w:r>
+              <w:t xml:space="preserve">instruction reversal ·</w:t>
+            </w:r>
+            <w:r>
+              <w:t xml:space="preserve"> </w:t>
+            </w:r>
+            <w:r>
+              <w:rPr>
+                <w:bCs/>
+                <w:b/>
+              </w:rPr>
+              <w:t xml:space="preserve">C14</w:t>
+            </w:r>
+            <w:r>
+              <w:t xml:space="preserve"> </w:t>
+            </w:r>
+            <w:r>
+              <w:t xml:space="preserve">反单调 ·</w:t>
+            </w:r>
+            <w:r>
+              <w:t xml:space="preserve"> </w:t>
+            </w:r>
+            <w:r>
+              <w:rPr>
+                <w:bCs/>
+                <w:b/>
+              </w:rPr>
+              <w:t xml:space="preserve">C15</w:t>
+            </w:r>
+            <w:r>
+              <w:t xml:space="preserve"> </w:t>
+            </w:r>
+            <w:r>
+              <w:t xml:space="preserve">rephrase 主路径 ·</w:t>
+            </w:r>
+            <w:r>
+              <w:t xml:space="preserve"> </w:t>
+            </w:r>
+            <w:r>
+              <w:rPr>
+                <w:bCs/>
+                <w:b/>
+              </w:rPr>
+              <w:t xml:space="preserve">C16</w:t>
+            </w:r>
+            <w:r>
+              <w:t xml:space="preserve"> </w:t>
+            </w:r>
+            <w:r>
+              <w:t xml:space="preserve">synthetic 贯穿</w:t>
+            </w:r>
+            <w:r>
+              <w:t xml:space="preserve">• 质量升级</w:t>
+            </w:r>
+            <w:r>
+              <w:t xml:space="preserve"> </w:t>
+            </w:r>
+            <w:r>
+              <w:rPr>
+                <w:bCs/>
+                <w:b/>
+              </w:rPr>
+              <w:t xml:space="preserve">①–⑦</w:t>
+            </w:r>
+            <w:r>
+              <w:t xml:space="preserve">(10B uniq / frontier 50% / Best-of-N / critic 50%×2 / 多源 seed / persona 10k / 模板 20)</w:t>
+            </w:r>
+            <w:r>
+              <w:rPr>
+                <w:bCs/>
+                <w:b/>
+              </w:rPr>
+              <w:t xml:space="preserve">【后处理(W6)】</w:t>
+            </w:r>
+            <w:r>
+              <w:t xml:space="preserve">Stage 1 MinHash dedup · Stage 2 BGE embed dedup · Stage 3 fineweb-edu classifier ≥3 · Stage 4 decontam(MMLU / MMLU-Pro / GSM8k / MATH / HumanEval / MBPP)</w:t>
+            </w:r>
+            <w:r>
+              <w:t xml:space="preserve">**【时间线】**W1 基建 5d → W2 pilot+G1/G2 → W3–W5 全量</w:t>
+            </w:r>
+            <w:r>
+              <w:t xml:space="preserve"> </w:t>
+            </w:r>
+            <w:r>
+              <w:rPr>
+                <w:bCs/>
+                <w:b/>
+              </w:rPr>
+              <w:t xml:space="preserve">10B uniq</w:t>
+            </w:r>
+            <w:r>
+              <w:t xml:space="preserve"> </w:t>
+            </w:r>
+            <w:r>
+              <w:t xml:space="preserve">→ ★W6 dedup+tokenize</w:t>
+            </w:r>
+          </w:p>
+        </w:tc>
+        <w:tc>
+          <w:tcPr/>
+          <w:p>
+            <w:pPr>
+              <w:pStyle w:val="Compact"/>
+              <w:jc w:val="left"/>
+            </w:pPr>
+            <w:r>
+              <w:rPr>
+                <w:bCs/>
+                <w:b/>
+              </w:rPr>
+              <w:t xml:space="preserve">Track 1(从头训,ADR 0004)</w:t>
+            </w:r>
+            <w:r>
+              <w:t xml:space="preserve">•</w:t>
+            </w:r>
+            <w:r>
+              <w:t xml:space="preserve"> </w:t>
+            </w:r>
+            <w:r>
+              <w:rPr>
+                <w:bCs/>
+                <w:b/>
+              </w:rPr>
+              <w:t xml:space="preserve">E1</w:t>
+            </w:r>
+            <w:r>
+              <w:t xml:space="preserve"> </w:t>
+            </w:r>
+            <w:r>
+              <w:t xml:space="preserve">收尾(= R1+R2,基线本体)</w:t>
+            </w:r>
+            <w:r>
+              <w:t xml:space="preserve">• ★</w:t>
+            </w:r>
+            <w:r>
+              <w:rPr>
+                <w:bCs/>
+                <w:b/>
+              </w:rPr>
+              <w:t xml:space="preserve">E2</w:t>
+            </w:r>
+            <w:r>
+              <w:t xml:space="preserve"> </w:t>
+            </w:r>
+            <w:r>
+              <w:rPr>
+                <w:rStyle w:val="VerbatimChar"/>
+              </w:rPr>
+              <w:t xml:space="preserve">exp_inc_v01_qwen3_seed{42,1337}</w:t>
+            </w:r>
+            <w:r>
+              <w:t xml:space="preserve">(10B uniq × ~3 ep × 30B × 2 seeds,Incepedia v0.1 主打)</w:t>
+            </w:r>
+            <w:r>
+              <w:t xml:space="preserve">•</w:t>
+            </w:r>
+            <w:r>
+              <w:t xml:space="preserve"> </w:t>
+            </w:r>
+            <w:r>
+              <w:rPr>
+                <w:bCs/>
+                <w:b/>
+              </w:rPr>
+              <w:t xml:space="preserve">E3</w:t>
+            </w:r>
+            <w:r>
+              <w:t xml:space="preserve"> </w:t>
+            </w:r>
+            <w:r>
+              <w:rPr>
+                <w:rStyle w:val="VerbatimChar"/>
+              </w:rPr>
+              <w:t xml:space="preserve">exp_ctrl_cosmo_v2_subset3B_qwen3_seed42</w:t>
+            </w:r>
+            <w:r>
+              <w:t xml:space="preserve">(3B × 10 ep,剥离 epoch 效应)</w:t>
+            </w:r>
+            <w:r>
+              <w:t xml:space="preserve">•</w:t>
+            </w:r>
+            <w:r>
+              <w:t xml:space="preserve"> </w:t>
+            </w:r>
+            <w:r>
+              <w:rPr>
+                <w:bCs/>
+                <w:b/>
+              </w:rPr>
+              <w:t xml:space="preserve">E5</w:t>
+            </w:r>
+            <w:r>
+              <w:t xml:space="preserve"> </w:t>
+            </w:r>
+            <w:r>
+              <w:rPr>
+                <w:rStyle w:val="VerbatimChar"/>
+              </w:rPr>
+              <w:t xml:space="preserve">exp_inc_v01_qwen3_ep{1,3,10}</w:t>
+            </w:r>
+            <w:r>
+              <w:t xml:space="preserve">(epoch 边际收益扫描,Phi-4 式)</w:t>
+            </w:r>
+            <w:r>
+              <w:rPr>
+                <w:bCs/>
+                <w:b/>
+              </w:rPr>
+              <w:t xml:space="preserve">Track 2(共享 backbone + cooldown-fork,ADR 0004)</w:t>
+            </w:r>
+            <w:r>
+              <w:t xml:space="preserve">•</w:t>
+            </w:r>
+            <w:r>
+              <w:t xml:space="preserve"> </w:t>
+            </w:r>
+            <w:r>
+              <w:rPr>
+                <w:bCs/>
+                <w:b/>
+              </w:rPr>
+              <w:t xml:space="preserve">R3</w:t>
+            </w:r>
+            <w:r>
+              <w:t xml:space="preserve"> </w:t>
+            </w:r>
+            <w:r>
+              <w:t xml:space="preserve">backbone 20B(一次性,~1.3 天)</w:t>
+            </w:r>
+            <w:r>
+              <w:t xml:space="preserve">• P2 批准 6 组</w:t>
+            </w:r>
+            <w:r>
+              <w:rPr>
+                <w:bCs/>
+                <w:b/>
+              </w:rPr>
+              <w:t xml:space="preserve">重生成 ablation</w:t>
             </w:r>
             <w:r>
               <w:t xml:space="preserve">:</w:t>
@@ -964,33 +1560,186 @@
                 <w:bCs/>
                 <w:b/>
               </w:rPr>
-              <w:t xml:space="preserve">Protocol A</w:t>
-            </w:r>
-            <w:r>
-              <w:t xml:space="preserve">(Llama2-1.82B,Mistral-7B tokenizer,</w:t>
-            </w:r>
-            <w:r>
-              <w:rPr>
-                <w:bCs/>
-                <w:b/>
-              </w:rPr>
-              <w:t xml:space="preserve">仅用 2 次</w:t>
-            </w:r>
-            <w:r>
-              <w:t xml:space="preserve">)+</w:t>
-            </w:r>
-            <w:r>
-              <w:t xml:space="preserve"> </w:t>
-            </w:r>
-            <w:r>
-              <w:rPr>
-                <w:bCs/>
-                <w:b/>
-              </w:rPr>
-              <w:t xml:space="preserve">Protocol B</w:t>
-            </w:r>
-            <w:r>
-              <w:t xml:space="preserve">(Qwen3-1.7B,Qwen 151k,工作架构)</w:t>
+              <w:t xml:space="preserve">A1</w:t>
+            </w:r>
+            <w:r>
+              <w:t xml:space="preserve"> </w:t>
+            </w:r>
+            <w:r>
+              <w:t xml:space="preserve">seed-ground /</w:t>
+            </w:r>
+            <w:r>
+              <w:t xml:space="preserve"> </w:t>
+            </w:r>
+            <w:r>
+              <w:rPr>
+                <w:bCs/>
+                <w:b/>
+              </w:rPr>
+              <w:t xml:space="preserve">A2</w:t>
+            </w:r>
+            <w:r>
+              <w:t xml:space="preserve"> </w:t>
+            </w:r>
+            <w:r>
+              <w:t xml:space="preserve">rephrase path /</w:t>
+            </w:r>
+            <w:r>
+              <w:t xml:space="preserve"> </w:t>
+            </w:r>
+            <w:r>
+              <w:rPr>
+                <w:bCs/>
+                <w:b/>
+              </w:rPr>
+              <w:t xml:space="preserve">A5</w:t>
+            </w:r>
+            <w:r>
+              <w:t xml:space="preserve"> </w:t>
+            </w:r>
+            <w:r>
+              <w:t xml:space="preserve">难度 /</w:t>
+            </w:r>
+            <w:r>
+              <w:t xml:space="preserve"> </w:t>
+            </w:r>
+            <w:r>
+              <w:rPr>
+                <w:bCs/>
+                <w:b/>
+              </w:rPr>
+              <w:t xml:space="preserve">A6</w:t>
+            </w:r>
+            <w:r>
+              <w:t xml:space="preserve"> </w:t>
+            </w:r>
+            <w:r>
+              <w:t xml:space="preserve">generator 家族 /</w:t>
+            </w:r>
+            <w:r>
+              <w:t xml:space="preserve"> </w:t>
+            </w:r>
+            <w:r>
+              <w:rPr>
+                <w:bCs/>
+                <w:b/>
+              </w:rPr>
+              <w:t xml:space="preserve">A8</w:t>
+            </w:r>
+            <w:r>
+              <w:t xml:space="preserve"> </w:t>
+            </w:r>
+            <w:r>
+              <w:t xml:space="preserve">STEM 配比 /</w:t>
+            </w:r>
+            <w:r>
+              <w:t xml:space="preserve"> </w:t>
+            </w:r>
+            <w:r>
+              <w:rPr>
+                <w:bCs/>
+                <w:b/>
+              </w:rPr>
+              <w:t xml:space="preserve">A10</w:t>
+            </w:r>
+            <w:r>
+              <w:t xml:space="preserve"> </w:t>
+            </w:r>
+            <w:r>
+              <w:t xml:space="preserve">reversal(各 2B uniq × 6B cooldown × 2 seeds)</w:t>
+            </w:r>
+            <w:r>
+              <w:t xml:space="preserve">• 4 组 post-filter 模拟(不重生成):</w:t>
+            </w:r>
+            <w:r>
+              <w:rPr>
+                <w:bCs/>
+                <w:b/>
+              </w:rPr>
+              <w:t xml:space="preserve">A3</w:t>
+            </w:r>
+            <w:r>
+              <w:t xml:space="preserve"> </w:t>
+            </w:r>
+            <w:r>
+              <w:t xml:space="preserve">persona /</w:t>
+            </w:r>
+            <w:r>
+              <w:t xml:space="preserve"> </w:t>
+            </w:r>
+            <w:r>
+              <w:rPr>
+                <w:bCs/>
+                <w:b/>
+              </w:rPr>
+              <w:t xml:space="preserve">A4</w:t>
+            </w:r>
+            <w:r>
+              <w:t xml:space="preserve"> </w:t>
+            </w:r>
+            <w:r>
+              <w:t xml:space="preserve">模板 /</w:t>
+            </w:r>
+            <w:r>
+              <w:t xml:space="preserve"> </w:t>
+            </w:r>
+            <w:r>
+              <w:rPr>
+                <w:bCs/>
+                <w:b/>
+              </w:rPr>
+              <w:t xml:space="preserve">A7</w:t>
+            </w:r>
+            <w:r>
+              <w:t xml:space="preserve"> </w:t>
+            </w:r>
+            <w:r>
+              <w:t xml:space="preserve">critic /</w:t>
+            </w:r>
+            <w:r>
+              <w:t xml:space="preserve"> </w:t>
+            </w:r>
+            <w:r>
+              <w:rPr>
+                <w:bCs/>
+                <w:b/>
+              </w:rPr>
+              <w:t xml:space="preserve">A9</w:t>
+            </w:r>
+            <w:r>
+              <w:t xml:space="preserve"> </w:t>
+            </w:r>
+            <w:r>
+              <w:t xml:space="preserve">embed dedup</w:t>
+            </w:r>
+          </w:p>
+        </w:tc>
+        <w:tc>
+          <w:tcPr/>
+          <w:p>
+            <w:pPr>
+              <w:pStyle w:val="Compact"/>
+              <w:jc w:val="left"/>
+            </w:pPr>
+            <w:r>
+              <w:rPr>
+                <w:bCs/>
+                <w:b/>
+              </w:rPr>
+              <w:t xml:space="preserve">双轨并行产出</w:t>
+            </w:r>
+            <w:r>
+              <w:t xml:space="preserve">• Track 1 = E* 系列的全 benchmark 结果</w:t>
+            </w:r>
+            <w:r>
+              <w:t xml:space="preserve">• Track 2 = A* 系列的 Δ 分布</w:t>
+            </w:r>
+            <w:r>
+              <w:rPr>
+                <w:bCs/>
+                <w:b/>
+              </w:rPr>
+              <w:t xml:space="preserve">门控 G(P2 流程开关,§3.7)</w:t>
             </w:r>
             <w:r>
               <w:t xml:space="preserve">•</w:t>
@@ -1003,20 +1752,13 @@
                 <w:bCs/>
                 <w:b/>
               </w:rPr>
-              <w:t xml:space="preserve">后端</w:t>
-            </w:r>
-            <w:r>
-              <w:t xml:space="preserve">:FA2 默认 + ADR 0008 FA3 switch(</w:t>
-            </w:r>
-            <w:r>
-              <w:rPr>
-                <w:bCs/>
-                <w:b/>
-              </w:rPr>
-              <w:t xml:space="preserve">T1</w:t>
-            </w:r>
-            <w:r>
-              <w:t xml:space="preserve">,默认 OFF)</w:t>
+              <w:t xml:space="preserve">G1</w:t>
+            </w:r>
+            <w:r>
+              <w:t xml:space="preserve"> </w:t>
+            </w:r>
+            <w:r>
+              <w:t xml:space="preserve">人工抽检 10k(1 天,均分 ≥4.0)</w:t>
             </w:r>
             <w:r>
               <w:t xml:space="preserve">•</w:t>
@@ -1029,199 +1771,91 @@
                 <w:bCs/>
                 <w:b/>
               </w:rPr>
-              <w:t xml:space="preserve">数据</w:t>
-            </w:r>
-            <w:r>
-              <w:t xml:space="preserve">:</w:t>
+              <w:t xml:space="preserve">G2</w:t>
+            </w:r>
+            <w:r>
+              <w:t xml:space="preserve"> </w:t>
+            </w:r>
+            <w:r>
+              <w:t xml:space="preserve">自动化指标(edu-score 通过率 ≥85% / dup / decontam)</w:t>
+            </w:r>
+            <w:r>
+              <w:t xml:space="preserve">•</w:t>
+            </w:r>
+            <w:r>
+              <w:t xml:space="preserve"> </w:t>
+            </w:r>
+            <w:r>
+              <w:rPr>
+                <w:bCs/>
+                <w:b/>
+              </w:rPr>
+              <w:t xml:space="preserve">G3</w:t>
+            </w:r>
+            <w:r>
+              <w:t xml:space="preserve"> </w:t>
+            </w:r>
+            <w:r>
+              <w:t xml:space="preserve">1.5B pilot × cooldown-fork × 2 seeds(18h,</w:t>
+            </w:r>
+            <w:r>
+              <w:rPr>
+                <w:bCs/>
+                <w:b/>
+              </w:rPr>
+              <w:t xml:space="preserve">规则:无论结果都进 G4</w:t>
+            </w:r>
+            <w:r>
+              <w:t xml:space="preserve">,避免 false-negative)</w:t>
+            </w:r>
+            <w:r>
+              <w:t xml:space="preserve">• ★</w:t>
+            </w:r>
+            <w:r>
+              <w:rPr>
+                <w:bCs/>
+                <w:b/>
+              </w:rPr>
+              <w:t xml:space="preserve">G4</w:t>
+            </w:r>
+            <w:r>
+              <w:t xml:space="preserve"> </w:t>
+            </w:r>
+            <w:r>
+              <w:t xml:space="preserve">10B uniq × 30B × 2 seeds(= E2 本体,最终裁决:E2 ≥ E1 avg,任一 benchmark 显著胜)</w:t>
+            </w:r>
+          </w:p>
+        </w:tc>
+        <w:tc>
+          <w:tcPr/>
+          <w:p>
+            <w:pPr>
+              <w:pStyle w:val="Compact"/>
+              <w:jc w:val="left"/>
+            </w:pPr>
+            <w:r>
+              <w:t xml:space="preserve">(同 P1 的 L1 / L2 / L3)</w:t>
+            </w:r>
+            <w:r>
+              <w:t xml:space="preserve">+</w:t>
+            </w:r>
+            <w:r>
+              <w:t xml:space="preserve"> </w:t>
             </w:r>
             <w:r>
               <w:rPr>
                 <w:rStyle w:val="VerbatimChar"/>
               </w:rPr>
-              <w:t xml:space="preserve">cosmo_v2_qwen3</w:t>
-            </w:r>
-            <w:r>
-              <w:t xml:space="preserve"> </w:t>
-            </w:r>
-            <w:r>
-              <w:t xml:space="preserve">tokenized dataset</w:t>
-            </w:r>
-            <w:r>
-              <w:t xml:space="preserve">•</w:t>
-            </w:r>
-            <w:r>
-              <w:t xml:space="preserve"> </w:t>
-            </w:r>
-            <w:r>
-              <w:rPr>
-                <w:bCs/>
-                <w:b/>
-              </w:rPr>
-              <w:t xml:space="preserve">转换</w:t>
-            </w:r>
-            <w:r>
-              <w:t xml:space="preserve">:ADR 0009 nanotron → HF(eval 前置必经)</w:t>
-            </w:r>
-            <w:r>
-              <w:t xml:space="preserve">•</w:t>
-            </w:r>
-            <w:r>
-              <w:t xml:space="preserve"> </w:t>
-            </w:r>
-            <w:r>
-              <w:rPr>
-                <w:bCs/>
-                <w:b/>
-              </w:rPr>
-              <w:t xml:space="preserve">工程 TODO</w:t>
-            </w:r>
-            <w:r>
-              <w:t xml:space="preserve">:</w:t>
-            </w:r>
-            <w:r>
-              <w:rPr>
-                <w:bCs/>
-                <w:b/>
-              </w:rPr>
-              <w:t xml:space="preserve">T3</w:t>
-            </w:r>
-            <w:r>
-              <w:t xml:space="preserve"> </w:t>
-            </w:r>
-            <w:r>
-              <w:t xml:space="preserve">bootstrap_env.sh 自动 apply 4 个 nanotron 补丁 ·</w:t>
-            </w:r>
-            <w:r>
-              <w:t xml:space="preserve"> </w:t>
-            </w:r>
-            <w:r>
-              <w:rPr>
-                <w:bCs/>
-                <w:b/>
-              </w:rPr>
-              <w:t xml:space="preserve">T4</w:t>
-            </w:r>
-            <w:r>
-              <w:t xml:space="preserve"> </w:t>
-            </w:r>
-            <w:r>
-              <w:t xml:space="preserve">lint_nanotron_yaml.py YAML 审计</w:t>
-            </w:r>
-            <w:r>
-              <w:t xml:space="preserve">•</w:t>
-            </w:r>
-            <w:r>
-              <w:t xml:space="preserve"> </w:t>
-            </w:r>
-            <w:r>
-              <w:rPr>
-                <w:bCs/>
-                <w:b/>
-              </w:rPr>
-              <w:t xml:space="preserve">运行轨迹</w:t>
-            </w:r>
-            <w:r>
-              <w:t xml:space="preserve">:</w:t>
-            </w:r>
-            <w:r>
-              <w:rPr>
-                <w:bCs/>
-                <w:b/>
-              </w:rPr>
-              <w:t xml:space="preserve">R0</w:t>
-            </w:r>
-            <w:r>
-              <w:t xml:space="preserve">(弃)→ ★</w:t>
-            </w:r>
-            <w:r>
-              <w:rPr>
-                <w:bCs/>
-                <w:b/>
-              </w:rPr>
-              <w:t xml:space="preserve">R1</w:t>
-            </w:r>
-            <w:r>
-              <w:t xml:space="preserve"> </w:t>
-            </w:r>
-            <w:r>
-              <w:t xml:space="preserve">seed42 30B(40%)→</w:t>
-            </w:r>
-            <w:r>
-              <w:t xml:space="preserve"> </w:t>
-            </w:r>
-            <w:r>
-              <w:rPr>
-                <w:bCs/>
-                <w:b/>
-              </w:rPr>
-              <w:t xml:space="preserve">R2</w:t>
-            </w:r>
-            <w:r>
-              <w:t xml:space="preserve"> </w:t>
-            </w:r>
-            <w:r>
-              <w:t xml:space="preserve">seed1337 30B →</w:t>
-            </w:r>
-            <w:r>
-              <w:t xml:space="preserve"> </w:t>
-            </w:r>
-            <w:r>
-              <w:rPr>
-                <w:bCs/>
-                <w:b/>
-              </w:rPr>
-              <w:t xml:space="preserve">E1 = R1+R2</w:t>
-            </w:r>
-            <w:r>
-              <w:t xml:space="preserve"> </w:t>
-            </w:r>
-            <w:r>
-              <w:t xml:space="preserve">基线入账</w:t>
-            </w:r>
-          </w:p>
-        </w:tc>
-        <w:tc>
-          <w:tcPr/>
-          <w:p>
-            <w:pPr>
-              <w:pStyle w:val="Compact"/>
-              <w:jc w:val="left"/>
-            </w:pPr>
-            <w:r>
-              <w:rPr>
-                <w:bCs/>
-                <w:b/>
-              </w:rPr>
-              <w:t xml:space="preserve">Track 1(从头训,ADR 0004)</w:t>
-            </w:r>
-            <w:r>
-              <w:t xml:space="preserve">•</w:t>
-            </w:r>
-            <w:r>
-              <w:t xml:space="preserve"> </w:t>
-            </w:r>
-            <w:r>
-              <w:rPr>
-                <w:bCs/>
-                <w:b/>
-              </w:rPr>
-              <w:t xml:space="preserve">E1</w:t>
-            </w:r>
-            <w:r>
-              <w:t xml:space="preserve"> </w:t>
-            </w:r>
-            <w:r>
-              <w:t xml:space="preserve">收尾(= R1+R2,基线本体)</w:t>
-            </w:r>
-            <w:r>
-              <w:t xml:space="preserve">• ★</w:t>
-            </w:r>
-            <w:r>
-              <w:rPr>
-                <w:bCs/>
-                <w:b/>
-              </w:rPr>
-              <w:t xml:space="preserve">E2</w:t>
+              <w:t xml:space="preserve">scripts/sync_to_nas.sh gen &lt;batch_id&gt;</w:t>
+            </w:r>
+            <w:r>
+              <w:t xml:space="preserve"> </w:t>
+            </w:r>
+            <w:r>
+              <w:t xml:space="preserve">事件驱动备份生成数据</w:t>
+            </w:r>
+            <w:r>
+              <w:t xml:space="preserve">+</w:t>
             </w:r>
             <w:r>
               <w:t xml:space="preserve"> </w:t>
@@ -1230,300 +1864,38 @@
               <w:rPr>
                 <w:rStyle w:val="VerbatimChar"/>
               </w:rPr>
-              <w:t xml:space="preserve">exp_inc_v01_qwen3_seed{42,1337}</w:t>
-            </w:r>
-            <w:r>
-              <w:t xml:space="preserve">(10B uniq × ~3 ep × 30B × 2 seeds,Incepedia v0.1 主打)</w:t>
-            </w:r>
-            <w:r>
-              <w:t xml:space="preserve">•</w:t>
-            </w:r>
-            <w:r>
-              <w:t xml:space="preserve"> </w:t>
-            </w:r>
-            <w:r>
-              <w:rPr>
-                <w:bCs/>
-                <w:b/>
-              </w:rPr>
-              <w:t xml:space="preserve">E3</w:t>
-            </w:r>
-            <w:r>
-              <w:t xml:space="preserve"> </w:t>
-            </w:r>
-            <w:r>
-              <w:rPr>
-                <w:rStyle w:val="VerbatimChar"/>
-              </w:rPr>
-              <w:t xml:space="preserve">exp_ctrl_cosmo_v2_subset3B_qwen3_seed42</w:t>
-            </w:r>
-            <w:r>
-              <w:t xml:space="preserve">(3B × 10 ep,剥离 epoch 效应)</w:t>
-            </w:r>
-            <w:r>
-              <w:t xml:space="preserve">•</w:t>
-            </w:r>
-            <w:r>
-              <w:t xml:space="preserve"> </w:t>
-            </w:r>
-            <w:r>
-              <w:rPr>
-                <w:bCs/>
-                <w:b/>
-              </w:rPr>
-              <w:t xml:space="preserve">E5</w:t>
-            </w:r>
-            <w:r>
-              <w:t xml:space="preserve"> </w:t>
-            </w:r>
-            <w:r>
-              <w:rPr>
-                <w:rStyle w:val="VerbatimChar"/>
-              </w:rPr>
-              <w:t xml:space="preserve">exp_inc_v01_qwen3_ep{1,3,10}</w:t>
-            </w:r>
-            <w:r>
-              <w:t xml:space="preserve">(epoch 边际收益扫描,Phi-4 式)</w:t>
-            </w:r>
-            <w:r>
-              <w:rPr>
-                <w:bCs/>
-                <w:b/>
-              </w:rPr>
-              <w:t xml:space="preserve">Track 2(共享 backbone + cooldown-fork,ADR 0004)</w:t>
-            </w:r>
-            <w:r>
-              <w:t xml:space="preserve">•</w:t>
-            </w:r>
-            <w:r>
-              <w:t xml:space="preserve"> </w:t>
-            </w:r>
-            <w:r>
-              <w:rPr>
-                <w:bCs/>
-                <w:b/>
-              </w:rPr>
-              <w:t xml:space="preserve">R3</w:t>
-            </w:r>
-            <w:r>
-              <w:t xml:space="preserve"> </w:t>
-            </w:r>
-            <w:r>
-              <w:t xml:space="preserve">backbone 20B(一次性,~1.3 天)</w:t>
-            </w:r>
-            <w:r>
-              <w:t xml:space="preserve">• P2 批准 6 组</w:t>
-            </w:r>
-            <w:r>
-              <w:rPr>
-                <w:bCs/>
-                <w:b/>
-              </w:rPr>
-              <w:t xml:space="preserve">重生成 ablation</w:t>
-            </w:r>
-            <w:r>
-              <w:t xml:space="preserve">:</w:t>
-            </w:r>
-            <w:r>
-              <w:rPr>
-                <w:bCs/>
-                <w:b/>
-              </w:rPr>
-              <w:t xml:space="preserve">A1</w:t>
-            </w:r>
-            <w:r>
-              <w:t xml:space="preserve"> </w:t>
-            </w:r>
-            <w:r>
-              <w:t xml:space="preserve">seed-ground /</w:t>
-            </w:r>
-            <w:r>
-              <w:t xml:space="preserve"> </w:t>
-            </w:r>
-            <w:r>
-              <w:rPr>
-                <w:bCs/>
-                <w:b/>
-              </w:rPr>
-              <w:t xml:space="preserve">A2</w:t>
-            </w:r>
-            <w:r>
-              <w:t xml:space="preserve"> </w:t>
-            </w:r>
-            <w:r>
-              <w:t xml:space="preserve">rephrase path /</w:t>
-            </w:r>
-            <w:r>
-              <w:t xml:space="preserve"> </w:t>
-            </w:r>
-            <w:r>
-              <w:rPr>
-                <w:bCs/>
-                <w:b/>
-              </w:rPr>
-              <w:t xml:space="preserve">A5</w:t>
-            </w:r>
-            <w:r>
-              <w:t xml:space="preserve"> </w:t>
-            </w:r>
-            <w:r>
-              <w:t xml:space="preserve">难度 /</w:t>
-            </w:r>
-            <w:r>
-              <w:t xml:space="preserve"> </w:t>
-            </w:r>
-            <w:r>
-              <w:rPr>
-                <w:bCs/>
-                <w:b/>
-              </w:rPr>
-              <w:t xml:space="preserve">A6</w:t>
-            </w:r>
-            <w:r>
-              <w:t xml:space="preserve"> </w:t>
-            </w:r>
-            <w:r>
-              <w:t xml:space="preserve">generator 家族 /</w:t>
-            </w:r>
-            <w:r>
-              <w:t xml:space="preserve"> </w:t>
-            </w:r>
-            <w:r>
-              <w:rPr>
-                <w:bCs/>
-                <w:b/>
-              </w:rPr>
-              <w:t xml:space="preserve">A8</w:t>
-            </w:r>
-            <w:r>
-              <w:t xml:space="preserve"> </w:t>
-            </w:r>
-            <w:r>
-              <w:t xml:space="preserve">STEM 配比 /</w:t>
-            </w:r>
-            <w:r>
-              <w:t xml:space="preserve"> </w:t>
-            </w:r>
-            <w:r>
-              <w:rPr>
-                <w:bCs/>
-                <w:b/>
-              </w:rPr>
-              <w:t xml:space="preserve">A10</w:t>
-            </w:r>
-            <w:r>
-              <w:t xml:space="preserve"> </w:t>
-            </w:r>
-            <w:r>
-              <w:t xml:space="preserve">reversal(各 2B uniq × 6B cooldown × 2 seeds)</w:t>
-            </w:r>
-            <w:r>
-              <w:t xml:space="preserve">• 4 组 post-filter 模拟(不重生成):</w:t>
-            </w:r>
-            <w:r>
-              <w:rPr>
-                <w:bCs/>
-                <w:b/>
-              </w:rPr>
-              <w:t xml:space="preserve">A3</w:t>
-            </w:r>
-            <w:r>
-              <w:t xml:space="preserve"> </w:t>
-            </w:r>
-            <w:r>
-              <w:t xml:space="preserve">persona /</w:t>
-            </w:r>
-            <w:r>
-              <w:t xml:space="preserve"> </w:t>
-            </w:r>
-            <w:r>
-              <w:rPr>
-                <w:bCs/>
-                <w:b/>
-              </w:rPr>
-              <w:t xml:space="preserve">A4</w:t>
-            </w:r>
-            <w:r>
-              <w:t xml:space="preserve"> </w:t>
-            </w:r>
-            <w:r>
-              <w:t xml:space="preserve">模板 /</w:t>
-            </w:r>
-            <w:r>
-              <w:t xml:space="preserve"> </w:t>
-            </w:r>
-            <w:r>
-              <w:rPr>
-                <w:bCs/>
-                <w:b/>
-              </w:rPr>
-              <w:t xml:space="preserve">A7</w:t>
-            </w:r>
-            <w:r>
-              <w:t xml:space="preserve"> </w:t>
-            </w:r>
-            <w:r>
-              <w:t xml:space="preserve">critic /</w:t>
-            </w:r>
-            <w:r>
-              <w:t xml:space="preserve"> </w:t>
-            </w:r>
-            <w:r>
-              <w:rPr>
-                <w:bCs/>
-                <w:b/>
-              </w:rPr>
-              <w:t xml:space="preserve">A9</w:t>
-            </w:r>
-            <w:r>
-              <w:t xml:space="preserve"> </w:t>
-            </w:r>
-            <w:r>
-              <w:t xml:space="preserve">embed dedup</w:t>
-            </w:r>
-          </w:p>
-        </w:tc>
-        <w:tc>
-          <w:tcPr/>
-          <w:p>
-            <w:pPr>
-              <w:pStyle w:val="Compact"/>
-              <w:jc w:val="left"/>
-            </w:pPr>
-            <w:r>
-              <w:t xml:space="preserve">• ★</w:t>
-            </w:r>
-            <w:r>
-              <w:rPr>
-                <w:bCs/>
-                <w:b/>
-              </w:rPr>
-              <w:t xml:space="preserve">Protocol A 锚验证</w:t>
-            </w:r>
-            <w:r>
-              <w:t xml:space="preserve">(Llama2-1.82B,~5 天 GPU)→ 对齐 SmolLM 公开数字 ±0.5pp</w:t>
-            </w:r>
-            <w:r>
-              <w:t xml:space="preserve">•</w:t>
-            </w:r>
-            <w:r>
-              <w:t xml:space="preserve"> </w:t>
-            </w:r>
-            <w:r>
-              <w:rPr>
-                <w:bCs/>
-                <w:b/>
-              </w:rPr>
-              <w:t xml:space="preserve">Protocol B</w:t>
-            </w:r>
-            <w:r>
-              <w:t xml:space="preserve"> </w:t>
-            </w:r>
-            <w:r>
-              <w:t xml:space="preserve">v1.0 多 seed 主跑(30B uniq × N seeds)</w:t>
-            </w:r>
-            <w:r>
-              <w:t xml:space="preserve">• 同 P2 的 FA3 / HF 转换 / 补丁 基础设施延续</w:t>
+              <w:t xml:space="preserve">scripts/sync_to_nas.sh hf_ckpt</w:t>
+            </w:r>
+            <w:r>
+              <w:t xml:space="preserve">(R1 产物上行)</w:t>
+            </w:r>
+          </w:p>
+        </w:tc>
+        <w:tc>
+          <w:tcPr/>
+          <w:p>
+            <w:pPr>
+              <w:pStyle w:val="Compact"/>
+              <w:jc w:val="left"/>
+            </w:pPr>
+            <w:r>
+              <w:t xml:space="preserve">(同 P1,期望 T5 已完成)</w:t>
+            </w:r>
+            <w:r>
+              <w:t xml:space="preserve">+</w:t>
+            </w:r>
+            <w:r>
+              <w:t xml:space="preserve"> </w:t>
+            </w:r>
+            <w:r>
+              <w:rPr>
+                <w:bCs/>
+                <w:b/>
+              </w:rPr>
+              <w:t xml:space="preserve">生成侧实时监控</w:t>
+            </w:r>
+            <w:r>
+              <w:t xml:space="preserve">(C8 成功率 / 成本 / dup · C9 成本闸门,偏差 &gt;20% 自动暂停)</w:t>
             </w:r>
           </w:p>
         </w:tc>
@@ -1541,20 +1913,90 @@
                 <w:bCs/>
                 <w:b/>
               </w:rPr>
-              <w:t xml:space="preserve">评测管线</w:t>
-            </w:r>
-            <w:r>
-              <w:t xml:space="preserve">(ADR 0004 / 0006 / 0009)</w:t>
-            </w:r>
-          </w:p>
-        </w:tc>
-        <w:tc>
-          <w:tcPr/>
-          <w:p>
-            <w:pPr>
-              <w:pStyle w:val="Compact"/>
-              <w:jc w:val="left"/>
-            </w:pPr>
+              <w:t xml:space="preserve">P3 扩容发布</w:t>
+            </w:r>
+            <w:r>
+              <w:t xml:space="preserve">⏳</w:t>
+            </w:r>
+          </w:p>
+        </w:tc>
+        <w:tc>
+          <w:tcPr/>
+          <w:p>
+            <w:pPr>
+              <w:pStyle w:val="Compact"/>
+              <w:jc w:val="left"/>
+            </w:pPr>
+            <w:r>
+              <w:t xml:space="preserve">• ★</w:t>
+            </w:r>
+            <w:r>
+              <w:rPr>
+                <w:bCs/>
+                <w:b/>
+              </w:rPr>
+              <w:t xml:space="preserve">⑧</w:t>
+            </w:r>
+            <w:r>
+              <w:t xml:space="preserve"> </w:t>
+            </w:r>
+            <w:r>
+              <w:t xml:space="preserve">multi-agent debate(expert 档 20%)</w:t>
+            </w:r>
+            <w:r>
+              <w:t xml:space="preserve">• ★</w:t>
+            </w:r>
+            <w:r>
+              <w:rPr>
+                <w:bCs/>
+                <w:b/>
+              </w:rPr>
+              <w:t xml:space="preserve">⑨</w:t>
+            </w:r>
+            <w:r>
+              <w:t xml:space="preserve"> </w:t>
+            </w:r>
+            <w:r>
+              <w:t xml:space="preserve">全局滚动 embed 索引(FAISS 1M 滑窗)</w:t>
+            </w:r>
+            <w:r>
+              <w:t xml:space="preserve">• uniq 10B →</w:t>
+            </w:r>
+            <w:r>
+              <w:t xml:space="preserve"> </w:t>
+            </w:r>
+            <w:r>
+              <w:rPr>
+                <w:bCs/>
+                <w:b/>
+              </w:rPr>
+              <w:t xml:space="preserve">30B v1.0 冻结</w:t>
+            </w:r>
+            <w:r>
+              <w:t xml:space="preserve">• C1–C16 主线保留,不新增 C 决策</w:t>
+            </w:r>
+          </w:p>
+        </w:tc>
+        <w:tc>
+          <w:tcPr/>
+          <w:p>
+            <w:pPr>
+              <w:pStyle w:val="Compact"/>
+              <w:jc w:val="left"/>
+            </w:pPr>
+            <w:r>
+              <w:t xml:space="preserve">• ★</w:t>
+            </w:r>
+            <w:r>
+              <w:rPr>
+                <w:bCs/>
+                <w:b/>
+              </w:rPr>
+              <w:t xml:space="preserve">Protocol A 锚验证</w:t>
+            </w:r>
+            <w:r>
+              <w:t xml:space="preserve">(Llama2-1.82B,~5 天 GPU)→ 对齐 SmolLM 公开数字 ±0.5pp</w:t>
+            </w:r>
             <w:r>
               <w:t xml:space="preserve">•</w:t>
             </w:r>
@@ -1566,42 +2008,34 @@
                 <w:bCs/>
                 <w:b/>
               </w:rPr>
-              <w:t xml:space="preserve">轨道</w:t>
-            </w:r>
-            <w:r>
-              <w:t xml:space="preserve">:Track 1 / Track 2 双轨协议就位(ADR 0004),P1 主用 Track 1 跑通端到端</w:t>
-            </w:r>
-            <w:r>
-              <w:t xml:space="preserve">•</w:t>
-            </w:r>
-            <w:r>
-              <w:t xml:space="preserve"> </w:t>
-            </w:r>
-            <w:r>
-              <w:rPr>
-                <w:bCs/>
-                <w:b/>
-              </w:rPr>
-              <w:t xml:space="preserve">工具链</w:t>
-            </w:r>
-            <w:r>
-              <w:t xml:space="preserve">:lighteval pinned(ADR 0006)</w:t>
-            </w:r>
-            <w:r>
-              <w:t xml:space="preserve">•</w:t>
-            </w:r>
-            <w:r>
-              <w:t xml:space="preserve"> </w:t>
-            </w:r>
-            <w:r>
-              <w:rPr>
-                <w:bCs/>
-                <w:b/>
-              </w:rPr>
-              <w:t xml:space="preserve">输入</w:t>
-            </w:r>
-            <w:r>
-              <w:t xml:space="preserve">:ADR 0009 HF ckpt(通过</w:t>
+              <w:t xml:space="preserve">Protocol B</w:t>
+            </w:r>
+            <w:r>
+              <w:t xml:space="preserve"> </w:t>
+            </w:r>
+            <w:r>
+              <w:t xml:space="preserve">v1.0 多 seed 主跑(30B uniq × N seeds)</w:t>
+            </w:r>
+            <w:r>
+              <w:t xml:space="preserve">• 同 P2 的 FA3 / HF 转换 / 补丁 基础设施延续</w:t>
+            </w:r>
+          </w:p>
+        </w:tc>
+        <w:tc>
+          <w:tcPr/>
+          <w:p>
+            <w:pPr>
+              <w:pStyle w:val="Compact"/>
+              <w:jc w:val="left"/>
+            </w:pPr>
+            <w:r>
+              <w:t xml:space="preserve">• 跨多 benchmark + emergence 窗口</w:t>
+            </w:r>
+            <w:r>
+              <w:t xml:space="preserve">• 多 seed 均值 + 置信区间</w:t>
+            </w:r>
+            <w:r>
+              <w:t xml:space="preserve">• 外部复现包:HF model card +</w:t>
             </w:r>
             <w:r>
               <w:t xml:space="preserve"> </w:t>
@@ -1610,223 +2044,27 @@
               <w:rPr>
                 <w:rStyle w:val="VerbatimChar"/>
               </w:rPr>
-              <w:t xml:space="preserve">scripts/convert_nanotron_qwen2_to_hf.py</w:t>
-            </w:r>
-            <w:r>
-              <w:t xml:space="preserve">)</w:t>
-            </w:r>
-            <w:r>
-              <w:t xml:space="preserve">•</w:t>
-            </w:r>
-            <w:r>
-              <w:t xml:space="preserve"> </w:t>
-            </w:r>
-            <w:r>
-              <w:rPr>
-                <w:bCs/>
-                <w:b/>
-              </w:rPr>
-              <w:t xml:space="preserve">任务组</w:t>
-            </w:r>
-            <w:r>
-              <w:t xml:space="preserve">:</w:t>
+              <w:t xml:space="preserve">configs/eval/</w:t>
+            </w:r>
+            <w:r>
+              <w:t xml:space="preserve"> </w:t>
+            </w:r>
+            <w:r>
+              <w:t xml:space="preserve">可一键运行</w:t>
+            </w:r>
+            <w:r>
+              <w:t xml:space="preserve">• P3 仍复用</w:t>
+            </w:r>
+            <w:r>
+              <w:t xml:space="preserve"> </w:t>
             </w:r>
             <w:r>
               <w:rPr>
                 <w:rStyle w:val="VerbatimChar"/>
-                <w:bCs/>
-                <w:b/>
               </w:rPr>
               <w:t xml:space="preserve">cosmopedia-full</w:t>
             </w:r>
             <w:r>
-              <w:t xml:space="preserve">(129 任务,与 SmolLM</w:t>
-            </w:r>
-            <w:r>
-              <w:t xml:space="preserve"> </w:t>
-            </w:r>
-            <w:r>
-              <w:rPr>
-                <w:rStyle w:val="VerbatimChar"/>
-              </w:rPr>
-              <w:t xml:space="preserve">eval.slurm</w:t>
-            </w:r>
-            <w:r>
-              <w:t xml:space="preserve"> </w:t>
-            </w:r>
-            <w:r>
-              <w:t xml:space="preserve">对齐,发表级)+</w:t>
-            </w:r>
-            <w:r>
-              <w:t xml:space="preserve"> </w:t>
-            </w:r>
-            <w:r>
-              <w:rPr>
-                <w:rStyle w:val="VerbatimChar"/>
-              </w:rPr>
-              <w:t xml:space="preserve">early-signal</w:t>
-            </w:r>
-            <w:r>
-              <w:t xml:space="preserve">(debug,不作为对外声明)</w:t>
-            </w:r>
-          </w:p>
-        </w:tc>
-        <w:tc>
-          <w:tcPr/>
-          <w:p>
-            <w:pPr>
-              <w:pStyle w:val="Compact"/>
-              <w:jc w:val="left"/>
-            </w:pPr>
-            <w:r>
-              <w:rPr>
-                <w:bCs/>
-                <w:b/>
-              </w:rPr>
-              <w:t xml:space="preserve">双轨并行产出</w:t>
-            </w:r>
-            <w:r>
-              <w:t xml:space="preserve">• Track 1 = E* 系列的全 benchmark 结果</w:t>
-            </w:r>
-            <w:r>
-              <w:t xml:space="preserve">• Track 2 = A* 系列的 Δ 分布</w:t>
-            </w:r>
-            <w:r>
-              <w:rPr>
-                <w:bCs/>
-                <w:b/>
-              </w:rPr>
-              <w:t xml:space="preserve">门控 G(P2 流程开关,§3.7)</w:t>
-            </w:r>
-            <w:r>
-              <w:t xml:space="preserve">•</w:t>
-            </w:r>
-            <w:r>
-              <w:t xml:space="preserve"> </w:t>
-            </w:r>
-            <w:r>
-              <w:rPr>
-                <w:bCs/>
-                <w:b/>
-              </w:rPr>
-              <w:t xml:space="preserve">G1</w:t>
-            </w:r>
-            <w:r>
-              <w:t xml:space="preserve"> </w:t>
-            </w:r>
-            <w:r>
-              <w:t xml:space="preserve">人工抽检 10k(1 天,均分 ≥4.0)</w:t>
-            </w:r>
-            <w:r>
-              <w:t xml:space="preserve">•</w:t>
-            </w:r>
-            <w:r>
-              <w:t xml:space="preserve"> </w:t>
-            </w:r>
-            <w:r>
-              <w:rPr>
-                <w:bCs/>
-                <w:b/>
-              </w:rPr>
-              <w:t xml:space="preserve">G2</w:t>
-            </w:r>
-            <w:r>
-              <w:t xml:space="preserve"> </w:t>
-            </w:r>
-            <w:r>
-              <w:t xml:space="preserve">自动化指标(edu-score 通过率 ≥85% / dup / decontam)</w:t>
-            </w:r>
-            <w:r>
-              <w:t xml:space="preserve">•</w:t>
-            </w:r>
-            <w:r>
-              <w:t xml:space="preserve"> </w:t>
-            </w:r>
-            <w:r>
-              <w:rPr>
-                <w:bCs/>
-                <w:b/>
-              </w:rPr>
-              <w:t xml:space="preserve">G3</w:t>
-            </w:r>
-            <w:r>
-              <w:t xml:space="preserve"> </w:t>
-            </w:r>
-            <w:r>
-              <w:t xml:space="preserve">1.5B pilot × cooldown-fork × 2 seeds(18h,</w:t>
-            </w:r>
-            <w:r>
-              <w:rPr>
-                <w:bCs/>
-                <w:b/>
-              </w:rPr>
-              <w:t xml:space="preserve">规则:无论结果都进 G4</w:t>
-            </w:r>
-            <w:r>
-              <w:t xml:space="preserve">,避免 false-negative)</w:t>
-            </w:r>
-            <w:r>
-              <w:t xml:space="preserve">• ★</w:t>
-            </w:r>
-            <w:r>
-              <w:rPr>
-                <w:bCs/>
-                <w:b/>
-              </w:rPr>
-              <w:t xml:space="preserve">G4</w:t>
-            </w:r>
-            <w:r>
-              <w:t xml:space="preserve"> </w:t>
-            </w:r>
-            <w:r>
-              <w:t xml:space="preserve">10B uniq × 30B × 2 seeds(= E2 本体,最终裁决:E2 ≥ E1 avg,任一 benchmark 显著胜)</w:t>
-            </w:r>
-          </w:p>
-        </w:tc>
-        <w:tc>
-          <w:tcPr/>
-          <w:p>
-            <w:pPr>
-              <w:pStyle w:val="Compact"/>
-              <w:jc w:val="left"/>
-            </w:pPr>
-            <w:r>
-              <w:t xml:space="preserve">• 跨多 benchmark + emergence 窗口</w:t>
-            </w:r>
-            <w:r>
-              <w:t xml:space="preserve">• 多 seed 均值 + 置信区间</w:t>
-            </w:r>
-            <w:r>
-              <w:t xml:space="preserve">• 外部复现包:HF model card +</w:t>
-            </w:r>
-            <w:r>
-              <w:t xml:space="preserve"> </w:t>
-            </w:r>
-            <w:r>
-              <w:rPr>
-                <w:rStyle w:val="VerbatimChar"/>
-              </w:rPr>
-              <w:t xml:space="preserve">configs/eval/</w:t>
-            </w:r>
-            <w:r>
-              <w:t xml:space="preserve"> </w:t>
-            </w:r>
-            <w:r>
-              <w:t xml:space="preserve">可一键运行</w:t>
-            </w:r>
-            <w:r>
-              <w:t xml:space="preserve">• P3 仍复用</w:t>
-            </w:r>
-            <w:r>
-              <w:t xml:space="preserve"> </w:t>
-            </w:r>
-            <w:r>
-              <w:rPr>
-                <w:rStyle w:val="VerbatimChar"/>
-              </w:rPr>
-              <w:t xml:space="preserve">cosmopedia-full</w:t>
-            </w:r>
-            <w:r>
               <w:t xml:space="preserve"> </w:t>
             </w:r>
             <w:r>
@@ -1834,144 +2072,6 @@
             </w:r>
           </w:p>
         </w:tc>
-      </w:tr>
-      <w:tr>
-        <w:tc>
-          <w:tcPr/>
-          <w:p>
-            <w:pPr>
-              <w:pStyle w:val="Compact"/>
-              <w:jc w:val="left"/>
-            </w:pPr>
-            <w:r>
-              <w:rPr>
-                <w:bCs/>
-                <w:b/>
-              </w:rPr>
-              <w:t xml:space="preserve">存储</w:t>
-            </w:r>
-            <w:r>
-              <w:t xml:space="preserve">(ADR 0001)</w:t>
-            </w:r>
-          </w:p>
-        </w:tc>
-        <w:tc>
-          <w:tcPr/>
-          <w:p>
-            <w:pPr>
-              <w:pStyle w:val="Compact"/>
-              <w:jc w:val="left"/>
-            </w:pPr>
-            <w:r>
-              <w:rPr>
-                <w:bCs/>
-                <w:b/>
-              </w:rPr>
-              <w:t xml:space="preserve">L1</w:t>
-            </w:r>
-            <w:r>
-              <w:t xml:space="preserve"> </w:t>
-            </w:r>
-            <w:r>
-              <w:t xml:space="preserve">本地 NVMe</w:t>
-            </w:r>
-            <w:r>
-              <w:t xml:space="preserve"> </w:t>
-            </w:r>
-            <w:r>
-              <w:rPr>
-                <w:rStyle w:val="VerbatimChar"/>
-              </w:rPr>
-              <w:t xml:space="preserve">/home/ubuntu/lilei/projects/Incepedia/</w:t>
-            </w:r>
-            <w:r>
-              <w:t xml:space="preserve">(single source of truth)</w:t>
-            </w:r>
-            <w:r>
-              <w:rPr>
-                <w:bCs/>
-                <w:b/>
-              </w:rPr>
-              <w:t xml:space="preserve">L2</w:t>
-            </w:r>
-            <w:r>
-              <w:t xml:space="preserve"> </w:t>
-            </w:r>
-            <w:r>
-              <w:t xml:space="preserve">NAS</w:t>
-            </w:r>
-            <w:r>
-              <w:t xml:space="preserve"> </w:t>
-            </w:r>
-            <w:r>
-              <w:rPr>
-                <w:rStyle w:val="VerbatimChar"/>
-              </w:rPr>
-              <w:t xml:space="preserve">/lambda/nfs/us-south-2/incepedia_exp_bak/</w:t>
-            </w:r>
-            <w:r>
-              <w:t xml:space="preserve">(事件驱动 rsync 冷镜像)</w:t>
-            </w:r>
-            <w:r>
-              <w:rPr>
-                <w:bCs/>
-                <w:b/>
-              </w:rPr>
-              <w:t xml:space="preserve">L3</w:t>
-            </w:r>
-            <w:r>
-              <w:t xml:space="preserve"> </w:t>
-            </w:r>
-            <w:r>
-              <w:t xml:space="preserve">git remote(&lt;100MB 结构化产物兜底)</w:t>
-            </w:r>
-          </w:p>
-        </w:tc>
-        <w:tc>
-          <w:tcPr/>
-          <w:p>
-            <w:pPr>
-              <w:pStyle w:val="Compact"/>
-              <w:jc w:val="left"/>
-            </w:pPr>
-            <w:r>
-              <w:t xml:space="preserve">(同 P1 的 L1 / L2 / L3)</w:t>
-            </w:r>
-            <w:r>
-              <w:t xml:space="preserve">+</w:t>
-            </w:r>
-            <w:r>
-              <w:t xml:space="preserve"> </w:t>
-            </w:r>
-            <w:r>
-              <w:rPr>
-                <w:rStyle w:val="VerbatimChar"/>
-              </w:rPr>
-              <w:t xml:space="preserve">scripts/sync_to_nas.sh gen &lt;batch_id&gt;</w:t>
-            </w:r>
-            <w:r>
-              <w:t xml:space="preserve"> </w:t>
-            </w:r>
-            <w:r>
-              <w:t xml:space="preserve">事件驱动备份生成数据</w:t>
-            </w:r>
-            <w:r>
-              <w:t xml:space="preserve">+</w:t>
-            </w:r>
-            <w:r>
-              <w:t xml:space="preserve"> </w:t>
-            </w:r>
-            <w:r>
-              <w:rPr>
-                <w:rStyle w:val="VerbatimChar"/>
-              </w:rPr>
-              <w:t xml:space="preserve">scripts/sync_to_nas.sh hf_ckpt</w:t>
-            </w:r>
-            <w:r>
-              <w:t xml:space="preserve">(R1 产物上行)</w:t>
-            </w:r>
-          </w:p>
-        </w:tc>
         <w:tc>
           <w:tcPr/>
           <w:p>
@@ -1984,108 +2084,6 @@
             </w:r>
             <w:r>
               <w:t xml:space="preserve">+ HF Hub 公开发布层(数据集 / 模型 / tokenizer / model card)</w:t>
-            </w:r>
-          </w:p>
-        </w:tc>
-      </w:tr>
-      <w:tr>
-        <w:tc>
-          <w:tcPr/>
-          <w:p>
-            <w:pPr>
-              <w:pStyle w:val="Compact"/>
-              <w:jc w:val="left"/>
-            </w:pPr>
-            <w:r>
-              <w:rPr>
-                <w:bCs/>
-                <w:b/>
-              </w:rPr>
-              <w:t xml:space="preserve">监控</w:t>
-            </w:r>
-          </w:p>
-        </w:tc>
-        <w:tc>
-          <w:tcPr/>
-          <w:p>
-            <w:pPr>
-              <w:pStyle w:val="Compact"/>
-              <w:jc w:val="left"/>
-            </w:pPr>
-            <w:r>
-              <w:t xml:space="preserve">•</w:t>
-            </w:r>
-            <w:r>
-              <w:t xml:space="preserve"> </w:t>
-            </w:r>
-            <w:r>
-              <w:rPr>
-                <w:bCs/>
-                <w:b/>
-              </w:rPr>
-              <w:t xml:space="preserve">T2</w:t>
-            </w:r>
-            <w:r>
-              <w:t xml:space="preserve"> </w:t>
-            </w:r>
-            <w:r>
-              <w:t xml:space="preserve">sidecar:</w:t>
-            </w:r>
-            <w:r>
-              <w:rPr>
-                <w:rStyle w:val="VerbatimChar"/>
-              </w:rPr>
-              <w:t xml:space="preserve">scripts/tail_train_log_to_aim.py</w:t>
-            </w:r>
-            <w:r>
-              <w:t xml:space="preserve">(train.log → Aim)</w:t>
-            </w:r>
-            <w:r>
-              <w:t xml:space="preserve">•</w:t>
-            </w:r>
-            <w:r>
-              <w:t xml:space="preserve"> </w:t>
-            </w:r>
-            <w:r>
-              <w:rPr>
-                <w:bCs/>
-                <w:b/>
-              </w:rPr>
-              <w:t xml:space="preserve">T5</w:t>
-            </w:r>
-            <w:r>
-              <w:t xml:space="preserve"> </w:t>
-            </w:r>
-            <w:r>
-              <w:t xml:space="preserve">nanotron 原生直连 Aim / W&amp;B 🟡 R1 完成后替代 sidecar</w:t>
-            </w:r>
-          </w:p>
-        </w:tc>
-        <w:tc>
-          <w:tcPr/>
-          <w:p>
-            <w:pPr>
-              <w:pStyle w:val="Compact"/>
-              <w:jc w:val="left"/>
-            </w:pPr>
-            <w:r>
-              <w:t xml:space="preserve">(同 P1,期望 T5 已完成)</w:t>
-            </w:r>
-            <w:r>
-              <w:t xml:space="preserve">+</w:t>
-            </w:r>
-            <w:r>
-              <w:t xml:space="preserve"> </w:t>
-            </w:r>
-            <w:r>
-              <w:rPr>
-                <w:bCs/>
-                <w:b/>
-              </w:rPr>
-              <w:t xml:space="preserve">生成侧实时监控</w:t>
-            </w:r>
-            <w:r>
-              <w:t xml:space="preserve">(C8 成功率 / 成本 / dup · C9 成本闸门,偏差 &gt;20% 自动暂停)</w:t>
             </w:r>
           </w:p>
         </w:tc>

</xml_diff>

<commit_message>
docs(cheatsheet): add v0.2 recipe — C17-C20 + ①⑩-⑭ + A12-A15
To beat FinePhrase's measured 0.17 at 21B tokens, the v0.2 recipe
adds four strategies that FinePhrase explicitly listed as open
problems or did not test, plus a task-routed multi-provider
generator allocation.

- §3.3: C17 (cross-document synthesis), C18 (multi-turn refinement),
  C19 (DSPy prompt optimization), C20 (retrieval-augmented grounding)
- §3.4: ⑩ task-routed generators (local SmolLM2 + Vertex + OR),
  ⑪–⑭ corresponding upgrade items locked into v0.2
- §3.6: A12–A15 decision-driving ablations to validate C17–C20
- §2.1 P3 cell updated to reference the v0.2 enhancements
- maintenance conventions renumbered for next available codes
- docx regenerated (29 KB)

Made-with: Cursor
</commit_message>
<xml_diff>
--- a/docs/codenames-cheatsheet.docx
+++ b/docs/codenames-cheatsheet.docx
@@ -1935,14 +1935,151 @@
                 <w:bCs/>
                 <w:b/>
               </w:rPr>
+              <w:t xml:space="preserve">v0.2 增强配方上线</w:t>
+            </w:r>
+            <w:r>
+              <w:t xml:space="preserve">:</w:t>
+            </w:r>
+            <w:r>
+              <w:rPr>
+                <w:bCs/>
+                <w:b/>
+              </w:rPr>
+              <w:t xml:space="preserve">C17</w:t>
+            </w:r>
+            <w:r>
+              <w:t xml:space="preserve"> </w:t>
+            </w:r>
+            <w:r>
+              <w:t xml:space="preserve">cross-doc /</w:t>
+            </w:r>
+            <w:r>
+              <w:t xml:space="preserve"> </w:t>
+            </w:r>
+            <w:r>
+              <w:rPr>
+                <w:bCs/>
+                <w:b/>
+              </w:rPr>
+              <w:t xml:space="preserve">C18</w:t>
+            </w:r>
+            <w:r>
+              <w:t xml:space="preserve"> </w:t>
+            </w:r>
+            <w:r>
+              <w:t xml:space="preserve">multi-turn /</w:t>
+            </w:r>
+            <w:r>
+              <w:t xml:space="preserve"> </w:t>
+            </w:r>
+            <w:r>
+              <w:rPr>
+                <w:bCs/>
+                <w:b/>
+              </w:rPr>
+              <w:t xml:space="preserve">C19</w:t>
+            </w:r>
+            <w:r>
+              <w:t xml:space="preserve"> </w:t>
+            </w:r>
+            <w:r>
+              <w:t xml:space="preserve">DSPy /</w:t>
+            </w:r>
+            <w:r>
+              <w:t xml:space="preserve"> </w:t>
+            </w:r>
+            <w:r>
+              <w:rPr>
+                <w:bCs/>
+                <w:b/>
+              </w:rPr>
+              <w:t xml:space="preserve">C20</w:t>
+            </w:r>
+            <w:r>
+              <w:t xml:space="preserve"> </w:t>
+            </w:r>
+            <w:r>
+              <w:t xml:space="preserve">RAG</w:t>
+            </w:r>
+            <w:r>
+              <w:t xml:space="preserve">• ★</w:t>
+            </w:r>
+            <w:r>
+              <w:rPr>
+                <w:bCs/>
+                <w:b/>
+              </w:rPr>
+              <w:t xml:space="preserve">⑩</w:t>
+            </w:r>
+            <w:r>
+              <w:t xml:space="preserve"> </w:t>
+            </w:r>
+            <w:r>
+              <w:t xml:space="preserve">任务路由式生成器(本地 SmolLM2 + Vertex Batch + OR 三层)</w:t>
+            </w:r>
+            <w:r>
+              <w:t xml:space="preserve">•</w:t>
+            </w:r>
+            <w:r>
+              <w:t xml:space="preserve"> </w:t>
+            </w:r>
+            <w:r>
+              <w:rPr>
+                <w:bCs/>
+                <w:b/>
+              </w:rPr>
               <w:t xml:space="preserve">⑧</w:t>
             </w:r>
             <w:r>
               <w:t xml:space="preserve"> </w:t>
             </w:r>
             <w:r>
-              <w:t xml:space="preserve">multi-agent debate(expert 档 20%)</w:t>
-            </w:r>
+              <w:t xml:space="preserve">multi-agent debate(expert 档)</w:t>
+            </w:r>
+            <w:r>
+              <w:t xml:space="preserve">•</w:t>
+            </w:r>
+            <w:r>
+              <w:t xml:space="preserve"> </w:t>
+            </w:r>
+            <w:r>
+              <w:rPr>
+                <w:bCs/>
+                <w:b/>
+              </w:rPr>
+              <w:t xml:space="preserve">⑨</w:t>
+            </w:r>
+            <w:r>
+              <w:t xml:space="preserve"> </w:t>
+            </w:r>
+            <w:r>
+              <w:t xml:space="preserve">全局滚动 embed 索引</w:t>
+            </w:r>
+            <w:r>
+              <w:t xml:space="preserve">• uniq 10B →</w:t>
+            </w:r>
+            <w:r>
+              <w:t xml:space="preserve"> </w:t>
+            </w:r>
+            <w:r>
+              <w:rPr>
+                <w:bCs/>
+                <w:b/>
+              </w:rPr>
+              <w:t xml:space="preserve">30B v1.0 冻结</w:t>
+            </w:r>
+            <w:r>
+              <w:t xml:space="preserve">• C1–C20 全开</w:t>
+            </w:r>
+          </w:p>
+        </w:tc>
+        <w:tc>
+          <w:tcPr/>
+          <w:p>
+            <w:pPr>
+              <w:pStyle w:val="Compact"/>
+              <w:jc w:val="left"/>
+            </w:pPr>
             <w:r>
               <w:t xml:space="preserve">• ★</w:t>
             </w:r>
@@ -1951,39 +2088,84 @@
                 <w:bCs/>
                 <w:b/>
               </w:rPr>
-              <w:t xml:space="preserve">⑨</w:t>
-            </w:r>
-            <w:r>
-              <w:t xml:space="preserve"> </w:t>
-            </w:r>
-            <w:r>
-              <w:t xml:space="preserve">全局滚动 embed 索引(FAISS 1M 滑窗)</w:t>
-            </w:r>
-            <w:r>
-              <w:t xml:space="preserve">• uniq 10B →</w:t>
-            </w:r>
-            <w:r>
-              <w:t xml:space="preserve"> </w:t>
-            </w:r>
-            <w:r>
-              <w:rPr>
-                <w:bCs/>
-                <w:b/>
-              </w:rPr>
-              <w:t xml:space="preserve">30B v1.0 冻结</w:t>
-            </w:r>
-            <w:r>
-              <w:t xml:space="preserve">• C1–C16 主线保留,不新增 C 决策</w:t>
-            </w:r>
-          </w:p>
-        </w:tc>
-        <w:tc>
-          <w:tcPr/>
-          <w:p>
-            <w:pPr>
-              <w:pStyle w:val="Compact"/>
-              <w:jc w:val="left"/>
-            </w:pPr>
+              <w:t xml:space="preserve">Protocol A 锚验证</w:t>
+            </w:r>
+            <w:r>
+              <w:t xml:space="preserve">(Llama2-1.82B,~5 天 GPU)→ 对齐 SmolLM 公开数字 ±0.5pp</w:t>
+            </w:r>
+            <w:r>
+              <w:t xml:space="preserve">•</w:t>
+            </w:r>
+            <w:r>
+              <w:t xml:space="preserve"> </w:t>
+            </w:r>
+            <w:r>
+              <w:rPr>
+                <w:bCs/>
+                <w:b/>
+              </w:rPr>
+              <w:t xml:space="preserve">Protocol B</w:t>
+            </w:r>
+            <w:r>
+              <w:t xml:space="preserve"> </w:t>
+            </w:r>
+            <w:r>
+              <w:t xml:space="preserve">v1.0 多 seed 主跑(30B uniq × N seeds)</w:t>
+            </w:r>
+            <w:r>
+              <w:t xml:space="preserve">• 同 P2 的 FA3 / HF 转换 / 补丁 基础设施延续</w:t>
+            </w:r>
+          </w:p>
+        </w:tc>
+        <w:tc>
+          <w:tcPr/>
+          <w:p>
+            <w:pPr>
+              <w:pStyle w:val="Compact"/>
+              <w:jc w:val="left"/>
+            </w:pPr>
+            <w:r>
+              <w:t xml:space="preserve">• 跨多 benchmark + emergence 窗口</w:t>
+            </w:r>
+            <w:r>
+              <w:t xml:space="preserve">• 多 seed 均值 + 置信区间</w:t>
+            </w:r>
+            <w:r>
+              <w:t xml:space="preserve">• 外部复现包:HF model card +</w:t>
+            </w:r>
+            <w:r>
+              <w:t xml:space="preserve"> </w:t>
+            </w:r>
+            <w:r>
+              <w:rPr>
+                <w:rStyle w:val="VerbatimChar"/>
+              </w:rPr>
+              <w:t xml:space="preserve">configs/eval/</w:t>
+            </w:r>
+            <w:r>
+              <w:t xml:space="preserve"> </w:t>
+            </w:r>
+            <w:r>
+              <w:t xml:space="preserve">可一键运行</w:t>
+            </w:r>
+            <w:r>
+              <w:t xml:space="preserve">• P3 仍复用</w:t>
+            </w:r>
+            <w:r>
+              <w:t xml:space="preserve"> </w:t>
+            </w:r>
+            <w:r>
+              <w:rPr>
+                <w:rStyle w:val="VerbatimChar"/>
+              </w:rPr>
+              <w:t xml:space="preserve">cosmopedia-full</w:t>
+            </w:r>
+            <w:r>
+              <w:t xml:space="preserve"> </w:t>
+            </w:r>
+            <w:r>
+              <w:t xml:space="preserve">+ 可能追加更重的 benchmark</w:t>
+            </w:r>
             <w:r>
               <w:t xml:space="preserve">• ★</w:t>
             </w:r>
@@ -1992,83 +2174,13 @@
                 <w:bCs/>
                 <w:b/>
               </w:rPr>
-              <w:t xml:space="preserve">Protocol A 锚验证</w:t>
-            </w:r>
-            <w:r>
-              <w:t xml:space="preserve">(Llama2-1.82B,~5 天 GPU)→ 对齐 SmolLM 公开数字 ±0.5pp</w:t>
-            </w:r>
-            <w:r>
-              <w:t xml:space="preserve">•</w:t>
-            </w:r>
-            <w:r>
-              <w:t xml:space="preserve"> </w:t>
-            </w:r>
-            <w:r>
-              <w:rPr>
-                <w:bCs/>
-                <w:b/>
-              </w:rPr>
-              <w:t xml:space="preserve">Protocol B</w:t>
-            </w:r>
-            <w:r>
-              <w:t xml:space="preserve"> </w:t>
-            </w:r>
-            <w:r>
-              <w:t xml:space="preserve">v1.0 多 seed 主跑(30B uniq × N seeds)</w:t>
-            </w:r>
-            <w:r>
-              <w:t xml:space="preserve">• 同 P2 的 FA3 / HF 转换 / 补丁 基础设施延续</w:t>
-            </w:r>
-          </w:p>
-        </w:tc>
-        <w:tc>
-          <w:tcPr/>
-          <w:p>
-            <w:pPr>
-              <w:pStyle w:val="Compact"/>
-              <w:jc w:val="left"/>
-            </w:pPr>
-            <w:r>
-              <w:t xml:space="preserve">• 跨多 benchmark + emergence 窗口</w:t>
-            </w:r>
-            <w:r>
-              <w:t xml:space="preserve">• 多 seed 均值 + 置信区间</w:t>
-            </w:r>
-            <w:r>
-              <w:t xml:space="preserve">• 外部复现包:HF model card +</w:t>
-            </w:r>
-            <w:r>
-              <w:t xml:space="preserve"> </w:t>
-            </w:r>
-            <w:r>
-              <w:rPr>
-                <w:rStyle w:val="VerbatimChar"/>
-              </w:rPr>
-              <w:t xml:space="preserve">configs/eval/</w:t>
-            </w:r>
-            <w:r>
-              <w:t xml:space="preserve"> </w:t>
-            </w:r>
-            <w:r>
-              <w:t xml:space="preserve">可一键运行</w:t>
-            </w:r>
-            <w:r>
-              <w:t xml:space="preserve">• P3 仍复用</w:t>
-            </w:r>
-            <w:r>
-              <w:t xml:space="preserve"> </w:t>
-            </w:r>
-            <w:r>
-              <w:rPr>
-                <w:rStyle w:val="VerbatimChar"/>
-              </w:rPr>
-              <w:t xml:space="preserve">cosmopedia-full</w:t>
-            </w:r>
-            <w:r>
-              <w:t xml:space="preserve"> </w:t>
-            </w:r>
-            <w:r>
-              <w:t xml:space="preserve">+ 可能追加更重的 benchmark</w:t>
+              <w:t xml:space="preserve">A12-A15</w:t>
+            </w:r>
+            <w:r>
+              <w:t xml:space="preserve"> </w:t>
+            </w:r>
+            <w:r>
+              <w:t xml:space="preserve">验证 C17-C20 各自贡献</w:t>
             </w:r>
           </w:p>
         </w:tc>
@@ -4263,6 +4375,250 @@
           </w:p>
         </w:tc>
       </w:tr>
+      <w:tr>
+        <w:tc>
+          <w:tcPr/>
+          <w:p>
+            <w:pPr>
+              <w:pStyle w:val="Compact"/>
+              <w:jc w:val="left"/>
+            </w:pPr>
+            <w:r>
+              <w:rPr>
+                <w:bCs/>
+                <w:b/>
+              </w:rPr>
+              <w:t xml:space="preserve">C17</w:t>
+            </w:r>
+          </w:p>
+        </w:tc>
+        <w:tc>
+          <w:tcPr/>
+          <w:p>
+            <w:pPr>
+              <w:pStyle w:val="Compact"/>
+              <w:jc w:val="left"/>
+            </w:pPr>
+            <w:r>
+              <w:rPr>
+                <w:bCs/>
+                <w:b/>
+              </w:rPr>
+              <w:t xml:space="preserve">Cross-document synthesis</w:t>
+            </w:r>
+            <w:r>
+              <w:t xml:space="preserve">(2-3 个同主题 seed → 一份综合教程)</w:t>
+            </w:r>
+          </w:p>
+        </w:tc>
+        <w:tc>
+          <w:tcPr/>
+          <w:p>
+            <w:pPr>
+              <w:pStyle w:val="Compact"/>
+              <w:jc w:val="left"/>
+            </w:pPr>
+            <w:r>
+              <w:t xml:space="preserve">超越 FinePhrase</w:t>
+            </w:r>
+          </w:p>
+        </w:tc>
+        <w:tc>
+          <w:tcPr/>
+          <w:p>
+            <w:pPr>
+              <w:pStyle w:val="Compact"/>
+              <w:jc w:val="left"/>
+            </w:pPr>
+            <w:r>
+              <w:t xml:space="preserve">A12</w:t>
+            </w:r>
+          </w:p>
+        </w:tc>
+      </w:tr>
+      <w:tr>
+        <w:tc>
+          <w:tcPr/>
+          <w:p>
+            <w:pPr>
+              <w:pStyle w:val="Compact"/>
+              <w:jc w:val="left"/>
+            </w:pPr>
+            <w:r>
+              <w:rPr>
+                <w:bCs/>
+                <w:b/>
+              </w:rPr>
+              <w:t xml:space="preserve">C18</w:t>
+            </w:r>
+          </w:p>
+        </w:tc>
+        <w:tc>
+          <w:tcPr/>
+          <w:p>
+            <w:pPr>
+              <w:pStyle w:val="Compact"/>
+              <w:jc w:val="left"/>
+            </w:pPr>
+            <w:r>
+              <w:rPr>
+                <w:bCs/>
+                <w:b/>
+              </w:rPr>
+              <w:t xml:space="preserve">Multi-turn refinement</w:t>
+            </w:r>
+            <w:r>
+              <w:t xml:space="preserve">(outline → draft → refine,Phi-4 隐式采用)</w:t>
+            </w:r>
+          </w:p>
+        </w:tc>
+        <w:tc>
+          <w:tcPr/>
+          <w:p>
+            <w:pPr>
+              <w:pStyle w:val="Compact"/>
+              <w:jc w:val="left"/>
+            </w:pPr>
+            <w:r>
+              <w:t xml:space="preserve">超越 FinePhrase</w:t>
+            </w:r>
+          </w:p>
+        </w:tc>
+        <w:tc>
+          <w:tcPr/>
+          <w:p>
+            <w:pPr>
+              <w:pStyle w:val="Compact"/>
+              <w:jc w:val="left"/>
+            </w:pPr>
+            <w:r>
+              <w:t xml:space="preserve">A13</w:t>
+            </w:r>
+          </w:p>
+        </w:tc>
+      </w:tr>
+      <w:tr>
+        <w:tc>
+          <w:tcPr/>
+          <w:p>
+            <w:pPr>
+              <w:pStyle w:val="Compact"/>
+              <w:jc w:val="left"/>
+            </w:pPr>
+            <w:r>
+              <w:rPr>
+                <w:bCs/>
+                <w:b/>
+              </w:rPr>
+              <w:t xml:space="preserve">C19</w:t>
+            </w:r>
+          </w:p>
+        </w:tc>
+        <w:tc>
+          <w:tcPr/>
+          <w:p>
+            <w:pPr>
+              <w:pStyle w:val="Compact"/>
+              <w:jc w:val="left"/>
+            </w:pPr>
+            <w:r>
+              <w:rPr>
+                <w:bCs/>
+                <w:b/>
+              </w:rPr>
+              <w:t xml:space="preserve">DSPy prompt 自动优化</w:t>
+            </w:r>
+            <w:r>
+              <w:t xml:space="preserve">(FinePhrase 明确列为 next)</w:t>
+            </w:r>
+          </w:p>
+        </w:tc>
+        <w:tc>
+          <w:tcPr/>
+          <w:p>
+            <w:pPr>
+              <w:pStyle w:val="Compact"/>
+              <w:jc w:val="left"/>
+            </w:pPr>
+            <w:r>
+              <w:t xml:space="preserve">超越 FinePhrase</w:t>
+            </w:r>
+          </w:p>
+        </w:tc>
+        <w:tc>
+          <w:tcPr/>
+          <w:p>
+            <w:pPr>
+              <w:pStyle w:val="Compact"/>
+              <w:jc w:val="left"/>
+            </w:pPr>
+            <w:r>
+              <w:t xml:space="preserve">A14</w:t>
+            </w:r>
+          </w:p>
+        </w:tc>
+      </w:tr>
+      <w:tr>
+        <w:tc>
+          <w:tcPr/>
+          <w:p>
+            <w:pPr>
+              <w:pStyle w:val="Compact"/>
+              <w:jc w:val="left"/>
+            </w:pPr>
+            <w:r>
+              <w:rPr>
+                <w:bCs/>
+                <w:b/>
+              </w:rPr>
+              <w:t xml:space="preserve">C20</w:t>
+            </w:r>
+          </w:p>
+        </w:tc>
+        <w:tc>
+          <w:tcPr/>
+          <w:p>
+            <w:pPr>
+              <w:pStyle w:val="Compact"/>
+              <w:jc w:val="left"/>
+            </w:pPr>
+            <w:r>
+              <w:rPr>
+                <w:bCs/>
+                <w:b/>
+              </w:rPr>
+              <w:t xml:space="preserve">Retrieval-augmented grounding</w:t>
+            </w:r>
+            <w:r>
+              <w:t xml:space="preserve">(每个 seed 辅助 2-3 同主题文档作背景)</w:t>
+            </w:r>
+          </w:p>
+        </w:tc>
+        <w:tc>
+          <w:tcPr/>
+          <w:p>
+            <w:pPr>
+              <w:pStyle w:val="Compact"/>
+              <w:jc w:val="left"/>
+            </w:pPr>
+            <w:r>
+              <w:t xml:space="preserve">超越 FinePhrase</w:t>
+            </w:r>
+          </w:p>
+        </w:tc>
+        <w:tc>
+          <w:tcPr/>
+          <w:p>
+            <w:pPr>
+              <w:pStyle w:val="Compact"/>
+              <w:jc w:val="left"/>
+            </w:pPr>
+            <w:r>
+              <w:t xml:space="preserve">A15</w:t>
+            </w:r>
+          </w:p>
+        </w:tc>
+      </w:tr>
     </w:tbl>
     <w:bookmarkEnd w:id="26"/>
     <w:bookmarkStart w:id="27" w:name="Xe3d51257089eebafa47a66d3111bd2e8ce285b8"/>
@@ -4808,19 +5164,19 @@
               <w:jc w:val="left"/>
             </w:pPr>
             <w:r>
-              <w:t xml:space="preserve">Multi-agent debate(expert 档 20%)</w:t>
-            </w:r>
-          </w:p>
-        </w:tc>
-        <w:tc>
-          <w:tcPr/>
-          <w:p>
-            <w:pPr>
-              <w:pStyle w:val="Compact"/>
-              <w:jc w:val="left"/>
-            </w:pPr>
-            <w:r>
-              <w:t xml:space="preserve">⏳ 留 v0.2</w:t>
+              <w:t xml:space="preserve">Multi-agent debate(expert 档 5-20%,C20 关联)</w:t>
+            </w:r>
+          </w:p>
+        </w:tc>
+        <w:tc>
+          <w:tcPr/>
+          <w:p>
+            <w:pPr>
+              <w:pStyle w:val="Compact"/>
+              <w:jc w:val="left"/>
+            </w:pPr>
+            <w:r>
+              <w:t xml:space="preserve">⏳ v0.2 候选</w:t>
             </w:r>
           </w:p>
         </w:tc>
@@ -4870,7 +5226,7 @@
               <w:jc w:val="left"/>
             </w:pPr>
             <w:r>
-              <w:t xml:space="preserve">⏳ 留 v0.2</w:t>
+              <w:t xml:space="preserve">⏳ v0.2 候选</w:t>
             </w:r>
           </w:p>
         </w:tc>
@@ -4883,6 +5239,322 @@
             </w:pPr>
             <w:r>
               <w:t xml:space="preserve">+2 GPU</w:t>
+            </w:r>
+          </w:p>
+        </w:tc>
+      </w:tr>
+      <w:tr>
+        <w:tc>
+          <w:tcPr/>
+          <w:p>
+            <w:pPr>
+              <w:pStyle w:val="Compact"/>
+              <w:jc w:val="left"/>
+            </w:pPr>
+            <w:r>
+              <w:rPr>
+                <w:bCs/>
+                <w:b/>
+              </w:rPr>
+              <w:t xml:space="preserve">⑩</w:t>
+            </w:r>
+          </w:p>
+        </w:tc>
+        <w:tc>
+          <w:tcPr/>
+          <w:p>
+            <w:pPr>
+              <w:pStyle w:val="Compact"/>
+              <w:jc w:val="left"/>
+            </w:pPr>
+            <w:r>
+              <w:rPr>
+                <w:bCs/>
+                <w:b/>
+              </w:rPr>
+              <w:t xml:space="preserve">任务路由式生成器</w:t>
+            </w:r>
+            <w:r>
+              <w:t xml:space="preserve">(rephrase 用本地 SmolLM2,math/code/sci 用 frontier,critic 用 Opus)</w:t>
+            </w:r>
+          </w:p>
+        </w:tc>
+        <w:tc>
+          <w:tcPr/>
+          <w:p>
+            <w:pPr>
+              <w:pStyle w:val="Compact"/>
+              <w:jc w:val="left"/>
+            </w:pPr>
+            <w:r>
+              <w:t xml:space="preserve">✅</w:t>
+            </w:r>
+            <w:r>
+              <w:t xml:space="preserve"> </w:t>
+            </w:r>
+            <w:r>
+              <w:rPr>
+                <w:bCs/>
+                <w:b/>
+              </w:rPr>
+              <w:t xml:space="preserve">v0.2 锁定</w:t>
+            </w:r>
+          </w:p>
+        </w:tc>
+        <w:tc>
+          <w:tcPr/>
+          <w:p>
+            <w:pPr>
+              <w:pStyle w:val="Compact"/>
+              <w:jc w:val="left"/>
+            </w:pPr>
+            <w:r>
+              <w:t xml:space="preserve">API 总额</w:t>
+            </w:r>
+            <w:r>
+              <w:t xml:space="preserve"> </w:t>
+            </w:r>
+            <w:r>
+              <w:rPr>
+                <w:bCs/>
+                <w:b/>
+              </w:rPr>
+              <w:t xml:space="preserve">降 60%</w:t>
+            </w:r>
+            <w:r>
+              <w:t xml:space="preserve">(rephrase 不走 API)</w:t>
+            </w:r>
+          </w:p>
+        </w:tc>
+      </w:tr>
+      <w:tr>
+        <w:tc>
+          <w:tcPr/>
+          <w:p>
+            <w:pPr>
+              <w:pStyle w:val="Compact"/>
+              <w:jc w:val="left"/>
+            </w:pPr>
+            <w:r>
+              <w:rPr>
+                <w:bCs/>
+                <w:b/>
+              </w:rPr>
+              <w:t xml:space="preserve">⑪</w:t>
+            </w:r>
+          </w:p>
+        </w:tc>
+        <w:tc>
+          <w:tcPr/>
+          <w:p>
+            <w:pPr>
+              <w:pStyle w:val="Compact"/>
+              <w:jc w:val="left"/>
+            </w:pPr>
+            <w:r>
+              <w:rPr>
+                <w:bCs/>
+                <w:b/>
+              </w:rPr>
+              <w:t xml:space="preserve">Cross-document synthesis(C17,5%)</w:t>
+            </w:r>
+          </w:p>
+        </w:tc>
+        <w:tc>
+          <w:tcPr/>
+          <w:p>
+            <w:pPr>
+              <w:pStyle w:val="Compact"/>
+              <w:jc w:val="left"/>
+            </w:pPr>
+            <w:r>
+              <w:t xml:space="preserve">✅ v0.2 锁定</w:t>
+            </w:r>
+          </w:p>
+        </w:tc>
+        <w:tc>
+          <w:tcPr/>
+          <w:p>
+            <w:pPr>
+              <w:pStyle w:val="Compact"/>
+              <w:jc w:val="left"/>
+            </w:pPr>
+            <w:r>
+              <w:t xml:space="preserve">+$2-3k(frontier 生成)</w:t>
+            </w:r>
+          </w:p>
+        </w:tc>
+      </w:tr>
+      <w:tr>
+        <w:tc>
+          <w:tcPr/>
+          <w:p>
+            <w:pPr>
+              <w:pStyle w:val="Compact"/>
+              <w:jc w:val="left"/>
+            </w:pPr>
+            <w:r>
+              <w:rPr>
+                <w:bCs/>
+                <w:b/>
+              </w:rPr>
+              <w:t xml:space="preserve">⑫</w:t>
+            </w:r>
+          </w:p>
+        </w:tc>
+        <w:tc>
+          <w:tcPr/>
+          <w:p>
+            <w:pPr>
+              <w:pStyle w:val="Compact"/>
+              <w:jc w:val="left"/>
+            </w:pPr>
+            <w:r>
+              <w:rPr>
+                <w:bCs/>
+                <w:b/>
+              </w:rPr>
+              <w:t xml:space="preserve">Multi-turn refinement(C18,frontier 30%)</w:t>
+            </w:r>
+          </w:p>
+        </w:tc>
+        <w:tc>
+          <w:tcPr/>
+          <w:p>
+            <w:pPr>
+              <w:pStyle w:val="Compact"/>
+              <w:jc w:val="left"/>
+            </w:pPr>
+            <w:r>
+              <w:t xml:space="preserve">✅ v0.2 锁定</w:t>
+            </w:r>
+          </w:p>
+        </w:tc>
+        <w:tc>
+          <w:tcPr/>
+          <w:p>
+            <w:pPr>
+              <w:pStyle w:val="Compact"/>
+              <w:jc w:val="left"/>
+            </w:pPr>
+            <w:r>
+              <w:t xml:space="preserve">+30% frontier API 成本 ≈ +$8k</w:t>
+            </w:r>
+          </w:p>
+        </w:tc>
+      </w:tr>
+      <w:tr>
+        <w:tc>
+          <w:tcPr/>
+          <w:p>
+            <w:pPr>
+              <w:pStyle w:val="Compact"/>
+              <w:jc w:val="left"/>
+            </w:pPr>
+            <w:r>
+              <w:rPr>
+                <w:bCs/>
+                <w:b/>
+              </w:rPr>
+              <w:t xml:space="preserve">⑬</w:t>
+            </w:r>
+          </w:p>
+        </w:tc>
+        <w:tc>
+          <w:tcPr/>
+          <w:p>
+            <w:pPr>
+              <w:pStyle w:val="Compact"/>
+              <w:jc w:val="left"/>
+            </w:pPr>
+            <w:r>
+              <w:rPr>
+                <w:bCs/>
+                <w:b/>
+              </w:rPr>
+              <w:t xml:space="preserve">DSPy prompt 优化(C19,W1 一次性)</w:t>
+            </w:r>
+          </w:p>
+        </w:tc>
+        <w:tc>
+          <w:tcPr/>
+          <w:p>
+            <w:pPr>
+              <w:pStyle w:val="Compact"/>
+              <w:jc w:val="left"/>
+            </w:pPr>
+            <w:r>
+              <w:t xml:space="preserve">✅ v0.2 锁定</w:t>
+            </w:r>
+          </w:p>
+        </w:tc>
+        <w:tc>
+          <w:tcPr/>
+          <w:p>
+            <w:pPr>
+              <w:pStyle w:val="Compact"/>
+              <w:jc w:val="left"/>
+            </w:pPr>
+            <w:r>
+              <w:t xml:space="preserve">$200(扫 4 个 prompt 各 100 样本)</w:t>
+            </w:r>
+          </w:p>
+        </w:tc>
+      </w:tr>
+      <w:tr>
+        <w:tc>
+          <w:tcPr/>
+          <w:p>
+            <w:pPr>
+              <w:pStyle w:val="Compact"/>
+              <w:jc w:val="left"/>
+            </w:pPr>
+            <w:r>
+              <w:rPr>
+                <w:bCs/>
+                <w:b/>
+              </w:rPr>
+              <w:t xml:space="preserve">⑭</w:t>
+            </w:r>
+          </w:p>
+        </w:tc>
+        <w:tc>
+          <w:tcPr/>
+          <w:p>
+            <w:pPr>
+              <w:pStyle w:val="Compact"/>
+              <w:jc w:val="left"/>
+            </w:pPr>
+            <w:r>
+              <w:rPr>
+                <w:bCs/>
+                <w:b/>
+              </w:rPr>
+              <w:t xml:space="preserve">Retrieval-augmented grounding(C20,20% 路径)</w:t>
+            </w:r>
+          </w:p>
+        </w:tc>
+        <w:tc>
+          <w:tcPr/>
+          <w:p>
+            <w:pPr>
+              <w:pStyle w:val="Compact"/>
+              <w:jc w:val="left"/>
+            </w:pPr>
+            <w:r>
+              <w:t xml:space="preserve">✅ v0.2 锁定</w:t>
+            </w:r>
+          </w:p>
+        </w:tc>
+        <w:tc>
+          <w:tcPr/>
+          <w:p>
+            <w:pPr>
+              <w:pStyle w:val="Compact"/>
+              <w:jc w:val="left"/>
+            </w:pPr>
+            <w:r>
+              <w:t xml:space="preserve">input token +30%(成本 +5%)</w:t>
             </w:r>
           </w:p>
         </w:tc>
@@ -7025,6 +7697,458 @@
           </w:p>
         </w:tc>
       </w:tr>
+      <w:tr>
+        <w:tc>
+          <w:tcPr/>
+          <w:p>
+            <w:pPr>
+              <w:pStyle w:val="Compact"/>
+              <w:jc w:val="left"/>
+            </w:pPr>
+            <w:r>
+              <w:rPr>
+                <w:bCs/>
+                <w:b/>
+              </w:rPr>
+              <w:t xml:space="preserve">A12</w:t>
+            </w:r>
+          </w:p>
+        </w:tc>
+        <w:tc>
+          <w:tcPr/>
+          <w:p>
+            <w:pPr>
+              <w:pStyle w:val="Compact"/>
+              <w:jc w:val="left"/>
+            </w:pPr>
+            <w:r>
+              <w:rPr>
+                <w:bCs/>
+                <w:b/>
+              </w:rPr>
+              <w:t xml:space="preserve">Cross-document synthesis</w:t>
+            </w:r>
+          </w:p>
+        </w:tc>
+        <w:tc>
+          <w:tcPr/>
+          <w:p>
+            <w:pPr>
+              <w:pStyle w:val="Compact"/>
+              <w:jc w:val="left"/>
+            </w:pPr>
+            <w:r>
+              <w:t xml:space="preserve">关(单 seed)</w:t>
+            </w:r>
+          </w:p>
+        </w:tc>
+        <w:tc>
+          <w:tcPr/>
+          <w:p>
+            <w:pPr>
+              <w:pStyle w:val="Compact"/>
+              <w:jc w:val="left"/>
+            </w:pPr>
+            <w:r>
+              <w:t xml:space="preserve">5% 路径走多 seed 融合(C17)</w:t>
+            </w:r>
+          </w:p>
+        </w:tc>
+        <w:tc>
+          <w:tcPr/>
+          <w:p>
+            <w:pPr>
+              <w:pStyle w:val="Compact"/>
+              <w:jc w:val="left"/>
+            </w:pPr>
+            <w:r>
+              <w:t xml:space="preserve">C17</w:t>
+            </w:r>
+          </w:p>
+        </w:tc>
+        <w:tc>
+          <w:tcPr/>
+          <w:p>
+            <w:pPr>
+              <w:pStyle w:val="Compact"/>
+              <w:jc w:val="left"/>
+            </w:pPr>
+            <w:r>
+              <w:rPr>
+                <w:bCs/>
+                <w:b/>
+              </w:rPr>
+              <w:t xml:space="preserve">是</w:t>
+            </w:r>
+            <w:r>
+              <w:t xml:space="preserve">(2B uniq 重生成)</w:t>
+            </w:r>
+          </w:p>
+        </w:tc>
+        <w:tc>
+          <w:tcPr/>
+          <w:p>
+            <w:pPr>
+              <w:pStyle w:val="Compact"/>
+              <w:jc w:val="left"/>
+            </w:pPr>
+            <w:r>
+              <w:t xml:space="preserve">+0.3-0.5pp 知识连贯</w:t>
+            </w:r>
+          </w:p>
+        </w:tc>
+        <w:tc>
+          <w:tcPr/>
+          <w:p>
+            <w:pPr>
+              <w:pStyle w:val="Compact"/>
+              <w:jc w:val="left"/>
+            </w:pPr>
+            <w:r>
+              <w:t xml:space="preserve">🆕 v0.2</w:t>
+            </w:r>
+          </w:p>
+        </w:tc>
+      </w:tr>
+      <w:tr>
+        <w:tc>
+          <w:tcPr/>
+          <w:p>
+            <w:pPr>
+              <w:pStyle w:val="Compact"/>
+              <w:jc w:val="left"/>
+            </w:pPr>
+            <w:r>
+              <w:rPr>
+                <w:bCs/>
+                <w:b/>
+              </w:rPr>
+              <w:t xml:space="preserve">A13</w:t>
+            </w:r>
+          </w:p>
+        </w:tc>
+        <w:tc>
+          <w:tcPr/>
+          <w:p>
+            <w:pPr>
+              <w:pStyle w:val="Compact"/>
+              <w:jc w:val="left"/>
+            </w:pPr>
+            <w:r>
+              <w:rPr>
+                <w:bCs/>
+                <w:b/>
+              </w:rPr>
+              <w:t xml:space="preserve">Multi-turn refinement</w:t>
+            </w:r>
+          </w:p>
+        </w:tc>
+        <w:tc>
+          <w:tcPr/>
+          <w:p>
+            <w:pPr>
+              <w:pStyle w:val="Compact"/>
+              <w:jc w:val="left"/>
+            </w:pPr>
+            <w:r>
+              <w:t xml:space="preserve">单 pass</w:t>
+            </w:r>
+          </w:p>
+        </w:tc>
+        <w:tc>
+          <w:tcPr/>
+          <w:p>
+            <w:pPr>
+              <w:pStyle w:val="Compact"/>
+              <w:jc w:val="left"/>
+            </w:pPr>
+            <w:r>
+              <w:t xml:space="preserve">frontier 30% 走 outline→draft→refine(C18)</w:t>
+            </w:r>
+          </w:p>
+        </w:tc>
+        <w:tc>
+          <w:tcPr/>
+          <w:p>
+            <w:pPr>
+              <w:pStyle w:val="Compact"/>
+              <w:jc w:val="left"/>
+            </w:pPr>
+            <w:r>
+              <w:t xml:space="preserve">C18</w:t>
+            </w:r>
+          </w:p>
+        </w:tc>
+        <w:tc>
+          <w:tcPr/>
+          <w:p>
+            <w:pPr>
+              <w:pStyle w:val="Compact"/>
+              <w:jc w:val="left"/>
+            </w:pPr>
+            <w:r>
+              <w:rPr>
+                <w:bCs/>
+                <w:b/>
+              </w:rPr>
+              <w:t xml:space="preserve">是</w:t>
+            </w:r>
+            <w:r>
+              <w:t xml:space="preserve">(frontier 部分重生成)</w:t>
+            </w:r>
+          </w:p>
+        </w:tc>
+        <w:tc>
+          <w:tcPr/>
+          <w:p>
+            <w:pPr>
+              <w:pStyle w:val="Compact"/>
+              <w:jc w:val="left"/>
+            </w:pPr>
+            <w:r>
+              <w:t xml:space="preserve">+0.2-0.4pp</w:t>
+            </w:r>
+          </w:p>
+        </w:tc>
+        <w:tc>
+          <w:tcPr/>
+          <w:p>
+            <w:pPr>
+              <w:pStyle w:val="Compact"/>
+              <w:jc w:val="left"/>
+            </w:pPr>
+            <w:r>
+              <w:t xml:space="preserve">🆕 v0.2</w:t>
+            </w:r>
+          </w:p>
+        </w:tc>
+      </w:tr>
+      <w:tr>
+        <w:tc>
+          <w:tcPr/>
+          <w:p>
+            <w:pPr>
+              <w:pStyle w:val="Compact"/>
+              <w:jc w:val="left"/>
+            </w:pPr>
+            <w:r>
+              <w:rPr>
+                <w:bCs/>
+                <w:b/>
+              </w:rPr>
+              <w:t xml:space="preserve">A14</w:t>
+            </w:r>
+          </w:p>
+        </w:tc>
+        <w:tc>
+          <w:tcPr/>
+          <w:p>
+            <w:pPr>
+              <w:pStyle w:val="Compact"/>
+              <w:jc w:val="left"/>
+            </w:pPr>
+            <w:r>
+              <w:rPr>
+                <w:bCs/>
+                <w:b/>
+              </w:rPr>
+              <w:t xml:space="preserve">DSPy 自动 prompt 优化</w:t>
+            </w:r>
+          </w:p>
+        </w:tc>
+        <w:tc>
+          <w:tcPr/>
+          <w:p>
+            <w:pPr>
+              <w:pStyle w:val="Compact"/>
+              <w:jc w:val="left"/>
+            </w:pPr>
+            <w:r>
+              <w:t xml:space="preserve">手写 prompt</w:t>
+            </w:r>
+          </w:p>
+        </w:tc>
+        <w:tc>
+          <w:tcPr/>
+          <w:p>
+            <w:pPr>
+              <w:pStyle w:val="Compact"/>
+              <w:jc w:val="left"/>
+            </w:pPr>
+            <w:r>
+              <w:t xml:space="preserve">DSPy 扫出的优化版 prompt(C19)</w:t>
+            </w:r>
+          </w:p>
+        </w:tc>
+        <w:tc>
+          <w:tcPr/>
+          <w:p>
+            <w:pPr>
+              <w:pStyle w:val="Compact"/>
+              <w:jc w:val="left"/>
+            </w:pPr>
+            <w:r>
+              <w:t xml:space="preserve">C19</w:t>
+            </w:r>
+          </w:p>
+        </w:tc>
+        <w:tc>
+          <w:tcPr/>
+          <w:p>
+            <w:pPr>
+              <w:pStyle w:val="Compact"/>
+              <w:jc w:val="left"/>
+            </w:pPr>
+            <w:r>
+              <w:rPr>
+                <w:bCs/>
+                <w:b/>
+              </w:rPr>
+              <w:t xml:space="preserve">是</w:t>
+            </w:r>
+            <w:r>
+              <w:t xml:space="preserve">(全 rephrase 重生成)</w:t>
+            </w:r>
+          </w:p>
+        </w:tc>
+        <w:tc>
+          <w:tcPr/>
+          <w:p>
+            <w:pPr>
+              <w:pStyle w:val="Compact"/>
+              <w:jc w:val="left"/>
+            </w:pPr>
+            <w:r>
+              <w:t xml:space="preserve">+0.1-0.3pp</w:t>
+            </w:r>
+          </w:p>
+        </w:tc>
+        <w:tc>
+          <w:tcPr/>
+          <w:p>
+            <w:pPr>
+              <w:pStyle w:val="Compact"/>
+              <w:jc w:val="left"/>
+            </w:pPr>
+            <w:r>
+              <w:t xml:space="preserve">🆕 v0.2</w:t>
+            </w:r>
+          </w:p>
+        </w:tc>
+      </w:tr>
+      <w:tr>
+        <w:tc>
+          <w:tcPr/>
+          <w:p>
+            <w:pPr>
+              <w:pStyle w:val="Compact"/>
+              <w:jc w:val="left"/>
+            </w:pPr>
+            <w:r>
+              <w:rPr>
+                <w:bCs/>
+                <w:b/>
+              </w:rPr>
+              <w:t xml:space="preserve">A15</w:t>
+            </w:r>
+          </w:p>
+        </w:tc>
+        <w:tc>
+          <w:tcPr/>
+          <w:p>
+            <w:pPr>
+              <w:pStyle w:val="Compact"/>
+              <w:jc w:val="left"/>
+            </w:pPr>
+            <w:r>
+              <w:rPr>
+                <w:bCs/>
+                <w:b/>
+              </w:rPr>
+              <w:t xml:space="preserve">RAG 多 doc grounding</w:t>
+            </w:r>
+          </w:p>
+        </w:tc>
+        <w:tc>
+          <w:tcPr/>
+          <w:p>
+            <w:pPr>
+              <w:pStyle w:val="Compact"/>
+              <w:jc w:val="left"/>
+            </w:pPr>
+            <w:r>
+              <w:t xml:space="preserve">单 seed</w:t>
+            </w:r>
+          </w:p>
+        </w:tc>
+        <w:tc>
+          <w:tcPr/>
+          <w:p>
+            <w:pPr>
+              <w:pStyle w:val="Compact"/>
+              <w:jc w:val="left"/>
+            </w:pPr>
+            <w:r>
+              <w:t xml:space="preserve">2-3 同主题 doc 拼成上下文(C20)</w:t>
+            </w:r>
+          </w:p>
+        </w:tc>
+        <w:tc>
+          <w:tcPr/>
+          <w:p>
+            <w:pPr>
+              <w:pStyle w:val="Compact"/>
+              <w:jc w:val="left"/>
+            </w:pPr>
+            <w:r>
+              <w:t xml:space="preserve">C20</w:t>
+            </w:r>
+          </w:p>
+        </w:tc>
+        <w:tc>
+          <w:tcPr/>
+          <w:p>
+            <w:pPr>
+              <w:pStyle w:val="Compact"/>
+              <w:jc w:val="left"/>
+            </w:pPr>
+            <w:r>
+              <w:rPr>
+                <w:bCs/>
+                <w:b/>
+              </w:rPr>
+              <w:t xml:space="preserve">是</w:t>
+            </w:r>
+            <w:r>
+              <w:t xml:space="preserve">(20% 路径重生成)</w:t>
+            </w:r>
+          </w:p>
+        </w:tc>
+        <w:tc>
+          <w:tcPr/>
+          <w:p>
+            <w:pPr>
+              <w:pStyle w:val="Compact"/>
+              <w:jc w:val="left"/>
+            </w:pPr>
+            <w:r>
+              <w:t xml:space="preserve">+0.2-0.4pp</w:t>
+            </w:r>
+          </w:p>
+        </w:tc>
+        <w:tc>
+          <w:tcPr/>
+          <w:p>
+            <w:pPr>
+              <w:pStyle w:val="Compact"/>
+              <w:jc w:val="left"/>
+            </w:pPr>
+            <w:r>
+              <w:t xml:space="preserve">🆕 v0.2</w:t>
+            </w:r>
+          </w:p>
+        </w:tc>
+      </w:tr>
     </w:tbl>
     <w:p>
       <w:pPr>
@@ -10863,7 +11987,7 @@
           <w:bCs/>
           <w:b/>
         </w:rPr>
-        <w:t xml:space="preserve">新增 C 策略(C17+)</w:t>
+        <w:t xml:space="preserve">新增 C 策略(C21+)</w:t>
       </w:r>
       <w:r>
         <w:t xml:space="preserve"> </w:t>
@@ -10934,7 +12058,7 @@
           <w:bCs/>
           <w:b/>
         </w:rPr>
-        <w:t xml:space="preserve">新增 A 消融(A12+)</w:t>
+        <w:t xml:space="preserve">新增 A 消融(A16+)</w:t>
       </w:r>
       <w:r>
         <w:t xml:space="preserve"> </w:t>
@@ -10978,7 +12102,7 @@
           <w:bCs/>
           <w:b/>
         </w:rPr>
-        <w:t xml:space="preserve">新增 ⑩ 升级项</w:t>
+        <w:t xml:space="preserve">新增 ⑮ 升级项</w:t>
       </w:r>
       <w:r>
         <w:t xml:space="preserve"> </w:t>
@@ -11089,7 +12213,7 @@
           <w:bCs/>
           <w:b/>
         </w:rPr>
-        <w:t xml:space="preserve">A1–A11 编号歧义</w:t>
+        <w:t xml:space="preserve">A1–A15 编号歧义</w:t>
       </w:r>
       <w:r>
         <w:t xml:space="preserve">:本表 §3.6 是规范版,</w:t>

</xml_diff>

<commit_message>
docs(cheatsheet): downgrade C17-C20 to v0.3; lock v0.2 conservative
v0.2 now follows the conservative recipe (Q3.5 / user-approved):
60% rephrase + 25% frontier novel gen + 15% instruction reversal,
dropping Cosmopedia-style (HellaSwag-claim retracted as factually
wrong) and all C17-C20 exploration strategies.

- §3.4: C17-C20 upgrades ⑪-⑭ downgraded from "v0.2 locked" to
  "v0.3 candidate"; only ⑩ task-routed generator remains locked
- §3.5.1 (new): v0.2 conservative path_mix table, 8 atomic rows,
  flat sum verified = 100%; cost estimate ~$31k + 0 GPU (3-4 days
  calendar), projected ~0.18 at 21B (FinePhrase +6%, higher
  confidence than aggressive version's 0.19)
- §3.6: A12-A15 ablations re-tagged from v0.2 to v0.3

Made-with: Cursor
</commit_message>
<xml_diff>
--- a/docs/codenames-cheatsheet.docx
+++ b/docs/codenames-cheatsheet.docx
@@ -2,7 +2,7 @@
 <file path=word/document.xml><?xml version="1.0" encoding="utf-8"?>
 <w:document xmlns:w="http://schemas.openxmlformats.org/wordprocessingml/2006/main" xmlns:m="http://schemas.openxmlformats.org/officeDocument/2006/math" xmlns:r="http://schemas.openxmlformats.org/officeDocument/2006/relationships" xmlns:o="urn:schemas-microsoft-com:office:office" xmlns:v="urn:schemas-microsoft-com:vml" xmlns:w10="urn:schemas-microsoft-com:office:word" xmlns:a="http://schemas.openxmlformats.org/drawingml/2006/main" xmlns:pic="http://schemas.openxmlformats.org/drawingml/2006/picture" xmlns:wp="http://schemas.openxmlformats.org/drawingml/2006/wordprocessingDrawing">
   <w:body>
-    <w:bookmarkStart w:id="52" w:name="incepedia--项目代号对照表一页纸"/>
+    <w:bookmarkStart w:id="53" w:name="incepedia--项目代号对照表一页纸"/>
     <w:p>
       <w:pPr>
         <w:pStyle w:val="Heading1"/>
@@ -2447,7 +2447,7 @@
     </w:p>
     <w:bookmarkEnd w:id="22"/>
     <w:bookmarkEnd w:id="23"/>
-    <w:bookmarkStart w:id="37" w:name="X56a4e33593119e3b277a93e477db45e7d941b5a"/>
+    <w:bookmarkStart w:id="38" w:name="X56a4e33593119e3b277a93e477db45e7d941b5a"/>
     <w:p>
       <w:pPr>
         <w:pStyle w:val="Heading2"/>
@@ -5336,10 +5336,6 @@
               <w:jc w:val="left"/>
             </w:pPr>
             <w:r>
-              <w:rPr>
-                <w:bCs/>
-                <w:b/>
-              </w:rPr>
               <w:t xml:space="preserve">⑪</w:t>
             </w:r>
           </w:p>
@@ -5368,7 +5364,7 @@
               <w:jc w:val="left"/>
             </w:pPr>
             <w:r>
-              <w:t xml:space="preserve">✅ v0.2 锁定</w:t>
+              <w:t xml:space="preserve">⏳ v0.3 候选</w:t>
             </w:r>
           </w:p>
         </w:tc>
@@ -5394,10 +5390,6 @@
               <w:jc w:val="left"/>
             </w:pPr>
             <w:r>
-              <w:rPr>
-                <w:bCs/>
-                <w:b/>
-              </w:rPr>
               <w:t xml:space="preserve">⑫</w:t>
             </w:r>
           </w:p>
@@ -5426,7 +5418,7 @@
               <w:jc w:val="left"/>
             </w:pPr>
             <w:r>
-              <w:t xml:space="preserve">✅ v0.2 锁定</w:t>
+              <w:t xml:space="preserve">⏳ v0.3 候选</w:t>
             </w:r>
           </w:p>
         </w:tc>
@@ -5452,10 +5444,6 @@
               <w:jc w:val="left"/>
             </w:pPr>
             <w:r>
-              <w:rPr>
-                <w:bCs/>
-                <w:b/>
-              </w:rPr>
               <w:t xml:space="preserve">⑬</w:t>
             </w:r>
           </w:p>
@@ -5484,7 +5472,7 @@
               <w:jc w:val="left"/>
             </w:pPr>
             <w:r>
-              <w:t xml:space="preserve">✅ v0.2 锁定</w:t>
+              <w:t xml:space="preserve">⏳ v0.3 候选</w:t>
             </w:r>
           </w:p>
         </w:tc>
@@ -5510,10 +5498,6 @@
               <w:jc w:val="left"/>
             </w:pPr>
             <w:r>
-              <w:rPr>
-                <w:bCs/>
-                <w:b/>
-              </w:rPr>
               <w:t xml:space="preserve">⑭</w:t>
             </w:r>
           </w:p>
@@ -5542,7 +5526,7 @@
               <w:jc w:val="left"/>
             </w:pPr>
             <w:r>
-              <w:t xml:space="preserve">✅ v0.2 锁定</w:t>
+              <w:t xml:space="preserve">⏳ v0.3 候选</w:t>
             </w:r>
           </w:p>
         </w:tc>
@@ -5560,6 +5544,21 @@
         </w:tc>
       </w:tr>
     </w:tbl>
+    <w:p>
+      <w:pPr>
+        <w:pStyle w:val="BodyText"/>
+      </w:pPr>
+      <w:r>
+        <w:rPr>
+          <w:bCs/>
+          <w:b/>
+        </w:rPr>
+        <w:t xml:space="preserve">v0.2 保守版(已锁定)</w:t>
+      </w:r>
+      <w:r>
+        <w:t xml:space="preserve">:只开启 C1–C16 + ①–⑩,扣掉所有 ⑪–⑭ 新 exploration。依据:C17–C20 暂无实验证据支撑,留 A12–A15 ablation 验证后再进 v0.3。</w:t>
+      </w:r>
+    </w:p>
     <w:bookmarkEnd w:id="27"/>
     <w:bookmarkStart w:id="28" w:name="X60ff645c2ea1ba52e2bb6b91e97e061aafe7f63"/>
     <w:p>
@@ -6363,7 +6362,954 @@
       </w:r>
     </w:p>
     <w:bookmarkEnd w:id="28"/>
-    <w:bookmarkStart w:id="29" w:name="Xd47d13bb9dc4c7ccaec7b6472835793469dc78b"/>
+    <w:bookmarkStart w:id="29" w:name="Xe122ec2457e1a3b325e159cab764c80d7f6e57f"/>
+    <w:p>
+      <w:pPr>
+        <w:pStyle w:val="Heading3"/>
+      </w:pPr>
+      <w:r>
+        <w:t xml:space="preserve">3.5.1 v0.2 保守版 · path_mix 配比(</w:t>
+      </w:r>
+      <w:r>
+        <w:rPr>
+          <w:bCs/>
+          <w:b/>
+        </w:rPr>
+        <w:t xml:space="preserve">已锁定</w:t>
+      </w:r>
+      <w:r>
+        <w:t xml:space="preserve">,2026-04-24)</w:t>
+      </w:r>
+    </w:p>
+    <w:p>
+      <w:pPr>
+        <w:pStyle w:val="FirstParagraph"/>
+      </w:pPr>
+      <w:r>
+        <w:rPr>
+          <w:bCs/>
+          <w:b/>
+        </w:rPr>
+        <w:t xml:space="preserve">设计原则</w:t>
+      </w:r>
+      <w:r>
+        <w:t xml:space="preserve">:只用有明确文献证据的路径,扣掉所有未验证的 exploration(Cosmopedia-style / C17-C20)。projected 21B 分数</w:t>
+      </w:r>
+      <w:r>
+        <w:t xml:space="preserve"> </w:t>
+      </w:r>
+      <w:r>
+        <w:rPr>
+          <w:bCs/>
+          <w:b/>
+        </w:rPr>
+        <w:t xml:space="preserve">~0.18(FinePhrase +6%)</w:t>
+      </w:r>
+      <w:r>
+        <w:t xml:space="preserve">,置信度高。激进版(+C17-C20 + Cosmopedia-style)留 v0.3 做。</w:t>
+      </w:r>
+    </w:p>
+    <w:tbl>
+      <w:tblPr>
+        <w:tblStyle w:val="Table"/>
+        <w:tblW w:type="auto" w:w="0"/>
+        <w:tblLook w:firstRow="1" w:lastRow="0" w:firstColumn="0" w:lastColumn="0" w:noHBand="0" w:noVBand="0" w:val="0020"/>
+        <w:jc w:val="start"/>
+      </w:tblPr>
+      <w:tblGrid>
+        <w:gridCol w:w="1320"/>
+        <w:gridCol w:w="1320"/>
+        <w:gridCol w:w="1320"/>
+        <w:gridCol w:w="1320"/>
+        <w:gridCol w:w="1320"/>
+        <w:gridCol w:w="1320"/>
+      </w:tblGrid>
+      <w:tr>
+        <w:trPr>
+          <w:tblHeader w:val="true"/>
+        </w:trPr>
+        <w:tc>
+          <w:tcPr/>
+          <w:p>
+            <w:pPr>
+              <w:pStyle w:val="Compact"/>
+              <w:jc w:val="left"/>
+            </w:pPr>
+            <w:r>
+              <w:t xml:space="preserve">#</w:t>
+            </w:r>
+          </w:p>
+        </w:tc>
+        <w:tc>
+          <w:tcPr/>
+          <w:p>
+            <w:pPr>
+              <w:pStyle w:val="Compact"/>
+              <w:jc w:val="left"/>
+            </w:pPr>
+            <w:r>
+              <w:t xml:space="preserve">路径</w:t>
+            </w:r>
+          </w:p>
+        </w:tc>
+        <w:tc>
+          <w:tcPr/>
+          <w:p>
+            <w:pPr>
+              <w:pStyle w:val="Compact"/>
+              <w:jc w:val="left"/>
+            </w:pPr>
+            <w:r>
+              <w:t xml:space="preserve">占比</w:t>
+            </w:r>
+          </w:p>
+        </w:tc>
+        <w:tc>
+          <w:tcPr/>
+          <w:p>
+            <w:pPr>
+              <w:pStyle w:val="Compact"/>
+              <w:jc w:val="left"/>
+            </w:pPr>
+            <w:r>
+              <w:t xml:space="preserve">量(10B)</w:t>
+            </w:r>
+          </w:p>
+        </w:tc>
+        <w:tc>
+          <w:tcPr/>
+          <w:p>
+            <w:pPr>
+              <w:pStyle w:val="Compact"/>
+              <w:jc w:val="left"/>
+            </w:pPr>
+            <w:r>
+              <w:t xml:space="preserve">生成器</w:t>
+            </w:r>
+          </w:p>
+        </w:tc>
+        <w:tc>
+          <w:tcPr/>
+          <w:p>
+            <w:pPr>
+              <w:pStyle w:val="Compact"/>
+              <w:jc w:val="left"/>
+            </w:pPr>
+            <w:r>
+              <w:t xml:space="preserve">证据</w:t>
+            </w:r>
+          </w:p>
+        </w:tc>
+      </w:tr>
+      <w:tr>
+        <w:tc>
+          <w:tcPr/>
+          <w:p>
+            <w:pPr>
+              <w:pStyle w:val="Compact"/>
+              <w:jc w:val="left"/>
+            </w:pPr>
+            <w:r>
+              <w:t xml:space="preserve">1</w:t>
+            </w:r>
+          </w:p>
+        </w:tc>
+        <w:tc>
+          <w:tcPr/>
+          <w:p>
+            <w:pPr>
+              <w:pStyle w:val="Compact"/>
+              <w:jc w:val="left"/>
+            </w:pPr>
+            <w:r>
+              <w:t xml:space="preserve">rephrase_as_tutorial</w:t>
+            </w:r>
+          </w:p>
+        </w:tc>
+        <w:tc>
+          <w:tcPr/>
+          <w:p>
+            <w:pPr>
+              <w:pStyle w:val="Compact"/>
+              <w:jc w:val="left"/>
+            </w:pPr>
+            <w:r>
+              <w:t xml:space="preserve">15.0%</w:t>
+            </w:r>
+          </w:p>
+        </w:tc>
+        <w:tc>
+          <w:tcPr/>
+          <w:p>
+            <w:pPr>
+              <w:pStyle w:val="Compact"/>
+              <w:jc w:val="left"/>
+            </w:pPr>
+            <w:r>
+              <w:t xml:space="preserve">1.50B</w:t>
+            </w:r>
+          </w:p>
+        </w:tc>
+        <w:tc>
+          <w:tcPr/>
+          <w:p>
+            <w:pPr>
+              <w:pStyle w:val="Compact"/>
+              <w:jc w:val="left"/>
+            </w:pPr>
+            <w:r>
+              <w:t xml:space="preserve">本地 SmolLM2</w:t>
+            </w:r>
+          </w:p>
+        </w:tc>
+        <w:tc>
+          <w:tcPr/>
+          <w:p>
+            <w:pPr>
+              <w:pStyle w:val="Compact"/>
+              <w:jc w:val="left"/>
+            </w:pPr>
+            <w:r>
+              <w:t xml:space="preserve">FinePhrase 4 赢家</w:t>
+            </w:r>
+          </w:p>
+        </w:tc>
+      </w:tr>
+      <w:tr>
+        <w:tc>
+          <w:tcPr/>
+          <w:p>
+            <w:pPr>
+              <w:pStyle w:val="Compact"/>
+              <w:jc w:val="left"/>
+            </w:pPr>
+            <w:r>
+              <w:t xml:space="preserve">2</w:t>
+            </w:r>
+          </w:p>
+        </w:tc>
+        <w:tc>
+          <w:tcPr/>
+          <w:p>
+            <w:pPr>
+              <w:pStyle w:val="Compact"/>
+              <w:jc w:val="left"/>
+            </w:pPr>
+            <w:r>
+              <w:t xml:space="preserve">rephrase_as_faq</w:t>
+            </w:r>
+          </w:p>
+        </w:tc>
+        <w:tc>
+          <w:tcPr/>
+          <w:p>
+            <w:pPr>
+              <w:pStyle w:val="Compact"/>
+              <w:jc w:val="left"/>
+            </w:pPr>
+            <w:r>
+              <w:t xml:space="preserve">15.0%</w:t>
+            </w:r>
+          </w:p>
+        </w:tc>
+        <w:tc>
+          <w:tcPr/>
+          <w:p>
+            <w:pPr>
+              <w:pStyle w:val="Compact"/>
+              <w:jc w:val="left"/>
+            </w:pPr>
+            <w:r>
+              <w:t xml:space="preserve">1.50B</w:t>
+            </w:r>
+          </w:p>
+        </w:tc>
+        <w:tc>
+          <w:tcPr/>
+          <w:p>
+            <w:pPr>
+              <w:pStyle w:val="Compact"/>
+              <w:jc w:val="left"/>
+            </w:pPr>
+            <w:r>
+              <w:t xml:space="preserve">本地 SmolLM2</w:t>
+            </w:r>
+          </w:p>
+        </w:tc>
+        <w:tc>
+          <w:tcPr/>
+          <w:p>
+            <w:pPr>
+              <w:pStyle w:val="Compact"/>
+              <w:jc w:val="left"/>
+            </w:pPr>
+            <w:r>
+              <w:t xml:space="preserve">FinePhrase 4 赢家</w:t>
+            </w:r>
+          </w:p>
+        </w:tc>
+      </w:tr>
+      <w:tr>
+        <w:tc>
+          <w:tcPr/>
+          <w:p>
+            <w:pPr>
+              <w:pStyle w:val="Compact"/>
+              <w:jc w:val="left"/>
+            </w:pPr>
+            <w:r>
+              <w:t xml:space="preserve">3</w:t>
+            </w:r>
+          </w:p>
+        </w:tc>
+        <w:tc>
+          <w:tcPr/>
+          <w:p>
+            <w:pPr>
+              <w:pStyle w:val="Compact"/>
+              <w:jc w:val="left"/>
+            </w:pPr>
+            <w:r>
+              <w:t xml:space="preserve">rephrase_as_table</w:t>
+            </w:r>
+          </w:p>
+        </w:tc>
+        <w:tc>
+          <w:tcPr/>
+          <w:p>
+            <w:pPr>
+              <w:pStyle w:val="Compact"/>
+              <w:jc w:val="left"/>
+            </w:pPr>
+            <w:r>
+              <w:t xml:space="preserve">15.0%</w:t>
+            </w:r>
+          </w:p>
+        </w:tc>
+        <w:tc>
+          <w:tcPr/>
+          <w:p>
+            <w:pPr>
+              <w:pStyle w:val="Compact"/>
+              <w:jc w:val="left"/>
+            </w:pPr>
+            <w:r>
+              <w:t xml:space="preserve">1.50B</w:t>
+            </w:r>
+          </w:p>
+        </w:tc>
+        <w:tc>
+          <w:tcPr/>
+          <w:p>
+            <w:pPr>
+              <w:pStyle w:val="Compact"/>
+              <w:jc w:val="left"/>
+            </w:pPr>
+            <w:r>
+              <w:t xml:space="preserve">本地 SmolLM2</w:t>
+            </w:r>
+          </w:p>
+        </w:tc>
+        <w:tc>
+          <w:tcPr/>
+          <w:p>
+            <w:pPr>
+              <w:pStyle w:val="Compact"/>
+              <w:jc w:val="left"/>
+            </w:pPr>
+            <w:r>
+              <w:t xml:space="preserve">FinePhrase 4 赢家(ARC 冠军)</w:t>
+            </w:r>
+          </w:p>
+        </w:tc>
+      </w:tr>
+      <w:tr>
+        <w:tc>
+          <w:tcPr/>
+          <w:p>
+            <w:pPr>
+              <w:pStyle w:val="Compact"/>
+              <w:jc w:val="left"/>
+            </w:pPr>
+            <w:r>
+              <w:t xml:space="preserve">4</w:t>
+            </w:r>
+          </w:p>
+        </w:tc>
+        <w:tc>
+          <w:tcPr/>
+          <w:p>
+            <w:pPr>
+              <w:pStyle w:val="Compact"/>
+              <w:jc w:val="left"/>
+            </w:pPr>
+            <w:r>
+              <w:t xml:space="preserve">rephrase_as_math_word_problem</w:t>
+            </w:r>
+          </w:p>
+        </w:tc>
+        <w:tc>
+          <w:tcPr/>
+          <w:p>
+            <w:pPr>
+              <w:pStyle w:val="Compact"/>
+              <w:jc w:val="left"/>
+            </w:pPr>
+            <w:r>
+              <w:t xml:space="preserve">15.0%</w:t>
+            </w:r>
+          </w:p>
+        </w:tc>
+        <w:tc>
+          <w:tcPr/>
+          <w:p>
+            <w:pPr>
+              <w:pStyle w:val="Compact"/>
+              <w:jc w:val="left"/>
+            </w:pPr>
+            <w:r>
+              <w:t xml:space="preserve">1.50B</w:t>
+            </w:r>
+          </w:p>
+        </w:tc>
+        <w:tc>
+          <w:tcPr/>
+          <w:p>
+            <w:pPr>
+              <w:pStyle w:val="Compact"/>
+              <w:jc w:val="left"/>
+            </w:pPr>
+            <w:r>
+              <w:t xml:space="preserve">本地 SmolLM2</w:t>
+            </w:r>
+          </w:p>
+        </w:tc>
+        <w:tc>
+          <w:tcPr/>
+          <w:p>
+            <w:pPr>
+              <w:pStyle w:val="Compact"/>
+              <w:jc w:val="left"/>
+            </w:pPr>
+            <w:r>
+              <w:t xml:space="preserve">FinePhrase 4 赢家(GSM8K 冠军)</w:t>
+            </w:r>
+          </w:p>
+        </w:tc>
+      </w:tr>
+      <w:tr>
+        <w:tc>
+          <w:tcPr/>
+          <w:p>
+            <w:pPr>
+              <w:pStyle w:val="Compact"/>
+              <w:jc w:val="left"/>
+            </w:pPr>
+            <w:r>
+              <w:t xml:space="preserve">5</w:t>
+            </w:r>
+          </w:p>
+        </w:tc>
+        <w:tc>
+          <w:tcPr/>
+          <w:p>
+            <w:pPr>
+              <w:pStyle w:val="Compact"/>
+              <w:jc w:val="left"/>
+            </w:pPr>
+            <w:r>
+              <w:t xml:space="preserve">math_worked_example(凭空 + 解)</w:t>
+            </w:r>
+          </w:p>
+        </w:tc>
+        <w:tc>
+          <w:tcPr/>
+          <w:p>
+            <w:pPr>
+              <w:pStyle w:val="Compact"/>
+              <w:jc w:val="left"/>
+            </w:pPr>
+            <w:r>
+              <w:t xml:space="preserve">10.0%</w:t>
+            </w:r>
+          </w:p>
+        </w:tc>
+        <w:tc>
+          <w:tcPr/>
+          <w:p>
+            <w:pPr>
+              <w:pStyle w:val="Compact"/>
+              <w:jc w:val="left"/>
+            </w:pPr>
+            <w:r>
+              <w:t xml:space="preserve">1.00B</w:t>
+            </w:r>
+          </w:p>
+        </w:tc>
+        <w:tc>
+          <w:tcPr/>
+          <w:p>
+            <w:pPr>
+              <w:pStyle w:val="Compact"/>
+              <w:jc w:val="left"/>
+            </w:pPr>
+            <w:r>
+              <w:t xml:space="preserve">Vertex Gemini 2.5 Pro / DeepSeek-R1</w:t>
+            </w:r>
+          </w:p>
+        </w:tc>
+        <w:tc>
+          <w:tcPr/>
+          <w:p>
+            <w:pPr>
+              <w:pStyle w:val="Compact"/>
+              <w:jc w:val="left"/>
+            </w:pPr>
+            <w:r>
+              <w:t xml:space="preserve">Phi-4 实证</w:t>
+            </w:r>
+          </w:p>
+        </w:tc>
+      </w:tr>
+      <w:tr>
+        <w:tc>
+          <w:tcPr/>
+          <w:p>
+            <w:pPr>
+              <w:pStyle w:val="Compact"/>
+              <w:jc w:val="left"/>
+            </w:pPr>
+            <w:r>
+              <w:t xml:space="preserve">6</w:t>
+            </w:r>
+          </w:p>
+        </w:tc>
+        <w:tc>
+          <w:tcPr/>
+          <w:p>
+            <w:pPr>
+              <w:pStyle w:val="Compact"/>
+              <w:jc w:val="left"/>
+            </w:pPr>
+            <w:r>
+              <w:t xml:space="preserve">code_tutorial(凭空)</w:t>
+            </w:r>
+          </w:p>
+        </w:tc>
+        <w:tc>
+          <w:tcPr/>
+          <w:p>
+            <w:pPr>
+              <w:pStyle w:val="Compact"/>
+              <w:jc w:val="left"/>
+            </w:pPr>
+            <w:r>
+              <w:t xml:space="preserve">10.0%</w:t>
+            </w:r>
+          </w:p>
+        </w:tc>
+        <w:tc>
+          <w:tcPr/>
+          <w:p>
+            <w:pPr>
+              <w:pStyle w:val="Compact"/>
+              <w:jc w:val="left"/>
+            </w:pPr>
+            <w:r>
+              <w:t xml:space="preserve">1.00B</w:t>
+            </w:r>
+          </w:p>
+        </w:tc>
+        <w:tc>
+          <w:tcPr/>
+          <w:p>
+            <w:pPr>
+              <w:pStyle w:val="Compact"/>
+              <w:jc w:val="left"/>
+            </w:pPr>
+            <w:r>
+              <w:t xml:space="preserve">Vertex Claude 4 Sonnet / Qwen3-Coder</w:t>
+            </w:r>
+          </w:p>
+        </w:tc>
+        <w:tc>
+          <w:tcPr/>
+          <w:p>
+            <w:pPr>
+              <w:pStyle w:val="Compact"/>
+              <w:jc w:val="left"/>
+            </w:pPr>
+            <w:r>
+              <w:t xml:space="preserve">Phi-4 / DeepSeek-Coder 实证</w:t>
+            </w:r>
+          </w:p>
+        </w:tc>
+      </w:tr>
+      <w:tr>
+        <w:tc>
+          <w:tcPr/>
+          <w:p>
+            <w:pPr>
+              <w:pStyle w:val="Compact"/>
+              <w:jc w:val="left"/>
+            </w:pPr>
+            <w:r>
+              <w:t xml:space="preserve">7</w:t>
+            </w:r>
+          </w:p>
+        </w:tc>
+        <w:tc>
+          <w:tcPr/>
+          <w:p>
+            <w:pPr>
+              <w:pStyle w:val="Compact"/>
+              <w:jc w:val="left"/>
+            </w:pPr>
+            <w:r>
+              <w:t xml:space="preserve">scientific_reasoning(长链 CoT)</w:t>
+            </w:r>
+          </w:p>
+        </w:tc>
+        <w:tc>
+          <w:tcPr/>
+          <w:p>
+            <w:pPr>
+              <w:pStyle w:val="Compact"/>
+              <w:jc w:val="left"/>
+            </w:pPr>
+            <w:r>
+              <w:t xml:space="preserve">5.0%</w:t>
+            </w:r>
+          </w:p>
+        </w:tc>
+        <w:tc>
+          <w:tcPr/>
+          <w:p>
+            <w:pPr>
+              <w:pStyle w:val="Compact"/>
+              <w:jc w:val="left"/>
+            </w:pPr>
+            <w:r>
+              <w:t xml:space="preserve">0.50B</w:t>
+            </w:r>
+          </w:p>
+        </w:tc>
+        <w:tc>
+          <w:tcPr/>
+          <w:p>
+            <w:pPr>
+              <w:pStyle w:val="Compact"/>
+              <w:jc w:val="left"/>
+            </w:pPr>
+            <w:r>
+              <w:t xml:space="preserve">Vertex DeepSeek-R1 / o1 / Gemini Pro</w:t>
+            </w:r>
+          </w:p>
+        </w:tc>
+        <w:tc>
+          <w:tcPr/>
+          <w:p>
+            <w:pPr>
+              <w:pStyle w:val="Compact"/>
+              <w:jc w:val="left"/>
+            </w:pPr>
+            <w:r>
+              <w:t xml:space="preserve">长链推理必须 frontier</w:t>
+            </w:r>
+          </w:p>
+        </w:tc>
+      </w:tr>
+      <w:tr>
+        <w:tc>
+          <w:tcPr/>
+          <w:p>
+            <w:pPr>
+              <w:pStyle w:val="Compact"/>
+              <w:jc w:val="left"/>
+            </w:pPr>
+            <w:r>
+              <w:t xml:space="preserve">8</w:t>
+            </w:r>
+          </w:p>
+        </w:tc>
+        <w:tc>
+          <w:tcPr/>
+          <w:p>
+            <w:pPr>
+              <w:pStyle w:val="Compact"/>
+              <w:jc w:val="left"/>
+            </w:pPr>
+            <w:r>
+              <w:t xml:space="preserve">instruction_reversal(C13)</w:t>
+            </w:r>
+          </w:p>
+        </w:tc>
+        <w:tc>
+          <w:tcPr/>
+          <w:p>
+            <w:pPr>
+              <w:pStyle w:val="Compact"/>
+              <w:jc w:val="left"/>
+            </w:pPr>
+            <w:r>
+              <w:t xml:space="preserve">15.0%</w:t>
+            </w:r>
+          </w:p>
+        </w:tc>
+        <w:tc>
+          <w:tcPr/>
+          <w:p>
+            <w:pPr>
+              <w:pStyle w:val="Compact"/>
+              <w:jc w:val="left"/>
+            </w:pPr>
+            <w:r>
+              <w:t xml:space="preserve">1.50B</w:t>
+            </w:r>
+          </w:p>
+        </w:tc>
+        <w:tc>
+          <w:tcPr/>
+          <w:p>
+            <w:pPr>
+              <w:pStyle w:val="Compact"/>
+              <w:jc w:val="left"/>
+            </w:pPr>
+            <w:r>
+              <w:t xml:space="preserve">Vertex Claude 4 Sonnet / GPT-4o</w:t>
+            </w:r>
+          </w:p>
+        </w:tc>
+        <w:tc>
+          <w:tcPr/>
+          <w:p>
+            <w:pPr>
+              <w:pStyle w:val="Compact"/>
+              <w:jc w:val="left"/>
+            </w:pPr>
+            <w:r>
+              <w:t xml:space="preserve">Phi-4 明确 10-15% 占比</w:t>
+            </w:r>
+          </w:p>
+        </w:tc>
+      </w:tr>
+      <w:tr>
+        <w:tc>
+          <w:tcPr/>
+          <w:p>
+            <w:pPr>
+              <w:pStyle w:val="Compact"/>
+              <w:jc w:val="left"/>
+            </w:pPr>
+            <w:r>
+              <w:rPr>
+                <w:bCs/>
+                <w:b/>
+              </w:rPr>
+              <w:t xml:space="preserve">合计</w:t>
+            </w:r>
+          </w:p>
+        </w:tc>
+        <w:tc>
+          <w:tcPr/>
+          <w:p>
+            <w:pPr>
+              <w:pStyle w:val="Compact"/>
+            </w:pPr>
+          </w:p>
+        </w:tc>
+        <w:tc>
+          <w:tcPr/>
+          <w:p>
+            <w:pPr>
+              <w:pStyle w:val="Compact"/>
+              <w:jc w:val="left"/>
+            </w:pPr>
+            <w:r>
+              <w:rPr>
+                <w:bCs/>
+                <w:b/>
+              </w:rPr>
+              <w:t xml:space="preserve">100.0%</w:t>
+            </w:r>
+          </w:p>
+        </w:tc>
+        <w:tc>
+          <w:tcPr/>
+          <w:p>
+            <w:pPr>
+              <w:pStyle w:val="Compact"/>
+              <w:jc w:val="left"/>
+            </w:pPr>
+            <w:r>
+              <w:rPr>
+                <w:bCs/>
+                <w:b/>
+              </w:rPr>
+              <w:t xml:space="preserve">10B</w:t>
+            </w:r>
+          </w:p>
+        </w:tc>
+        <w:tc>
+          <w:tcPr/>
+          <w:p>
+            <w:pPr>
+              <w:pStyle w:val="Compact"/>
+            </w:pPr>
+          </w:p>
+        </w:tc>
+        <w:tc>
+          <w:tcPr/>
+          <w:p>
+            <w:pPr>
+              <w:pStyle w:val="Compact"/>
+            </w:pPr>
+          </w:p>
+        </w:tc>
+      </w:tr>
+    </w:tbl>
+    <w:p>
+      <w:pPr>
+        <w:pStyle w:val="BodyText"/>
+      </w:pPr>
+      <w:r>
+        <w:rPr>
+          <w:bCs/>
+          <w:b/>
+        </w:rPr>
+        <w:t xml:space="preserve">扁平求和核验</w:t>
+      </w:r>
+      <w:r>
+        <w:t xml:space="preserve">:15 × 4 + 10 × 2 + 5 + 15 =</w:t>
+      </w:r>
+      <w:r>
+        <w:t xml:space="preserve"> </w:t>
+      </w:r>
+      <w:r>
+        <w:rPr>
+          <w:bCs/>
+          <w:b/>
+        </w:rPr>
+        <w:t xml:space="preserve">60 + 20 + 5 + 15 = 100% ✓</w:t>
+      </w:r>
+    </w:p>
+    <w:p>
+      <w:pPr>
+        <w:pStyle w:val="BodyText"/>
+      </w:pPr>
+      <w:r>
+        <w:rPr>
+          <w:bCs/>
+          <w:b/>
+        </w:rPr>
+        <w:t xml:space="preserve">生成成本</w:t>
+      </w:r>
+      <w:r>
+        <w:t xml:space="preserve">(Vertex Batch 50% off · 本地 vLLM $0):</w:t>
+      </w:r>
+    </w:p>
+    <w:p>
+      <w:pPr>
+        <w:numPr>
+          <w:ilvl w:val="0"/>
+          <w:numId w:val="1001"/>
+        </w:numPr>
+        <w:pStyle w:val="Compact"/>
+      </w:pPr>
+      <w:r>
+        <w:t xml:space="preserve">路径 1-4(60%,6B):</w:t>
+      </w:r>
+      <w:r>
+        <w:rPr>
+          <w:bCs/>
+          <w:b/>
+        </w:rPr>
+        <w:t xml:space="preserve">本地 SmolLM2 + 8×H100 vLLM,$0 API</w:t>
+      </w:r>
+      <w:r>
+        <w:t xml:space="preserve">,~2 天</w:t>
+      </w:r>
+    </w:p>
+    <w:p>
+      <w:pPr>
+        <w:numPr>
+          <w:ilvl w:val="0"/>
+          <w:numId w:val="1001"/>
+        </w:numPr>
+        <w:pStyle w:val="Compact"/>
+      </w:pPr>
+      <w:r>
+        <w:t xml:space="preserve">路径 5-7(25%,2.5B):</w:t>
+      </w:r>
+      <w:r>
+        <w:rPr>
+          <w:bCs/>
+          <w:b/>
+        </w:rPr>
+        <w:t xml:space="preserve">Vertex Batch · Gemini Pro / Claude Sonnet / DeepSeek-R1</w:t>
+      </w:r>
+      <w:r>
+        <w:t xml:space="preserve">,~$20k,~48h</w:t>
+      </w:r>
+    </w:p>
+    <w:p>
+      <w:pPr>
+        <w:numPr>
+          <w:ilvl w:val="0"/>
+          <w:numId w:val="1001"/>
+        </w:numPr>
+        <w:pStyle w:val="Compact"/>
+      </w:pPr>
+      <w:r>
+        <w:t xml:space="preserve">路径 8(15%,1.5B):</w:t>
+      </w:r>
+      <w:r>
+        <w:rPr>
+          <w:bCs/>
+          <w:b/>
+        </w:rPr>
+        <w:t xml:space="preserve">Vertex Batch · Claude Sonnet + GPT-4o</w:t>
+      </w:r>
+      <w:r>
+        <w:t xml:space="preserve">,~$11k,~48h</w:t>
+      </w:r>
+    </w:p>
+    <w:p>
+      <w:pPr>
+        <w:numPr>
+          <w:ilvl w:val="0"/>
+          <w:numId w:val="1001"/>
+        </w:numPr>
+        <w:pStyle w:val="Compact"/>
+      </w:pPr>
+      <w:r>
+        <w:rPr>
+          <w:bCs/>
+          <w:b/>
+        </w:rPr>
+        <w:t xml:space="preserve">总计 ~$31k + 0 GPU 电费,3-4 天 calendar</w:t>
+      </w:r>
+      <w:r>
+        <w:t xml:space="preserve">(并行)</w:t>
+      </w:r>
+    </w:p>
+    <w:p>
+      <w:pPr>
+        <w:pStyle w:val="FirstParagraph"/>
+      </w:pPr>
+      <w:r>
+        <w:rPr>
+          <w:bCs/>
+          <w:b/>
+        </w:rPr>
+        <w:t xml:space="preserve">比 v0.2 激进版省 $45k + 3 个新 C 决策风险</w:t>
+      </w:r>
+      <w:r>
+        <w:t xml:space="preserve">,代价:projected 分数 0.18 vs 0.19(差 +1pp 置信期望值)。</w:t>
+      </w:r>
+    </w:p>
+    <w:bookmarkEnd w:id="29"/>
+    <w:bookmarkStart w:id="30" w:name="Xd47d13bb9dc4c7ccaec7b6472835793469dc78b"/>
     <w:p>
       <w:pPr>
         <w:pStyle w:val="Heading3"/>
@@ -7805,7 +8751,7 @@
               <w:jc w:val="left"/>
             </w:pPr>
             <w:r>
-              <w:t xml:space="preserve">🆕 v0.2</w:t>
+              <w:t xml:space="preserve">🆕 v0.3</w:t>
             </w:r>
           </w:p>
         </w:tc>
@@ -7918,7 +8864,7 @@
               <w:jc w:val="left"/>
             </w:pPr>
             <w:r>
-              <w:t xml:space="preserve">🆕 v0.2</w:t>
+              <w:t xml:space="preserve">🆕 v0.3</w:t>
             </w:r>
           </w:p>
         </w:tc>
@@ -8031,7 +8977,7 @@
               <w:jc w:val="left"/>
             </w:pPr>
             <w:r>
-              <w:t xml:space="preserve">🆕 v0.2</w:t>
+              <w:t xml:space="preserve">🆕 v0.3</w:t>
             </w:r>
           </w:p>
         </w:tc>
@@ -8144,7 +9090,7 @@
               <w:jc w:val="left"/>
             </w:pPr>
             <w:r>
-              <w:t xml:space="preserve">🆕 v0.2</w:t>
+              <w:t xml:space="preserve">🆕 v0.3</w:t>
             </w:r>
           </w:p>
         </w:tc>
@@ -8215,8 +9161,8 @@
         <w:t xml:space="preserve">,结果直接决定 E2-mix 的 ratio 取值。</w:t>
       </w:r>
     </w:p>
-    <w:bookmarkEnd w:id="29"/>
-    <w:bookmarkStart w:id="30" w:name="Xb369bdf820507b51b6b0f51593cfe68a7edbf61"/>
+    <w:bookmarkEnd w:id="30"/>
+    <w:bookmarkStart w:id="31" w:name="Xb369bdf820507b51b6b0f51593cfe68a7edbf61"/>
     <w:p>
       <w:pPr>
         <w:pStyle w:val="Heading3"/>
@@ -8756,8 +9702,8 @@
         </w:tc>
       </w:tr>
     </w:tbl>
-    <w:bookmarkEnd w:id="30"/>
-    <w:bookmarkStart w:id="31" w:name="X75e83d9f8cc0dcf043fbbb2aa8b8e3b077025f7"/>
+    <w:bookmarkEnd w:id="31"/>
+    <w:bookmarkStart w:id="32" w:name="X75e83d9f8cc0dcf043fbbb2aa8b8e3b077025f7"/>
     <w:p>
       <w:pPr>
         <w:pStyle w:val="Heading3"/>
@@ -9225,8 +10171,8 @@
         </w:tc>
       </w:tr>
     </w:tbl>
-    <w:bookmarkEnd w:id="31"/>
-    <w:bookmarkStart w:id="32" w:name="X59b80b05c4cddb198c78b0dccb093e02c1d370b"/>
+    <w:bookmarkEnd w:id="32"/>
+    <w:bookmarkStart w:id="33" w:name="X59b80b05c4cddb198c78b0dccb093e02c1d370b"/>
     <w:p>
       <w:pPr>
         <w:pStyle w:val="Heading3"/>
@@ -9445,8 +10391,8 @@
         </w:tc>
       </w:tr>
     </w:tbl>
-    <w:bookmarkEnd w:id="32"/>
-    <w:bookmarkStart w:id="33" w:name="Xfa6ac3ad0da7d5687fb803f643548640962603b"/>
+    <w:bookmarkEnd w:id="33"/>
+    <w:bookmarkStart w:id="34" w:name="Xfa6ac3ad0da7d5687fb803f643548640962603b"/>
     <w:p>
       <w:pPr>
         <w:pStyle w:val="Heading3"/>
@@ -9720,8 +10666,8 @@
         </w:tc>
       </w:tr>
     </w:tbl>
-    <w:bookmarkEnd w:id="33"/>
-    <w:bookmarkStart w:id="34" w:name="X24a973218cb99fd605abc1485e6ab5434d80b87"/>
+    <w:bookmarkEnd w:id="34"/>
+    <w:bookmarkStart w:id="35" w:name="X24a973218cb99fd605abc1485e6ab5434d80b87"/>
     <w:p>
       <w:pPr>
         <w:pStyle w:val="Heading3"/>
@@ -9917,8 +10863,8 @@
         </w:tc>
       </w:tr>
     </w:tbl>
-    <w:bookmarkEnd w:id="34"/>
-    <w:bookmarkStart w:id="35" w:name="X8400d32dc50e01fa1b21802873e611070027fdc"/>
+    <w:bookmarkEnd w:id="35"/>
+    <w:bookmarkStart w:id="36" w:name="X8400d32dc50e01fa1b21802873e611070027fdc"/>
     <w:p>
       <w:pPr>
         <w:pStyle w:val="Heading3"/>
@@ -10161,8 +11107,8 @@
         </w:tc>
       </w:tr>
     </w:tbl>
-    <w:bookmarkEnd w:id="35"/>
-    <w:bookmarkStart w:id="36" w:name="Xf044149d2c8e59ca6cd465329e39a5d140de685"/>
+    <w:bookmarkEnd w:id="36"/>
+    <w:bookmarkStart w:id="37" w:name="Xf044149d2c8e59ca6cd465329e39a5d140de685"/>
     <w:p>
       <w:pPr>
         <w:pStyle w:val="Heading3"/>
@@ -10466,9 +11412,9 @@
         </w:pict>
       </w:r>
     </w:p>
-    <w:bookmarkEnd w:id="36"/>
     <w:bookmarkEnd w:id="37"/>
-    <w:bookmarkStart w:id="38" w:name="Xe5aeb13a055745a2d3854050886451e463bdce5"/>
+    <w:bookmarkEnd w:id="38"/>
+    <w:bookmarkStart w:id="39" w:name="Xe5aeb13a055745a2d3854050886451e463bdce5"/>
     <w:p>
       <w:pPr>
         <w:pStyle w:val="Heading2"/>
@@ -11464,8 +12410,8 @@
         </w:pict>
       </w:r>
     </w:p>
-    <w:bookmarkEnd w:id="38"/>
-    <w:bookmarkStart w:id="50" w:name="Xa519d1f2d4b82259b1373c560b2e2e5f39736ec"/>
+    <w:bookmarkEnd w:id="39"/>
+    <w:bookmarkStart w:id="51" w:name="Xa519d1f2d4b82259b1373c560b2e2e5f39736ec"/>
     <w:p>
       <w:pPr>
         <w:pStyle w:val="Heading2"/>
@@ -11474,7 +12420,7 @@
         <w:t xml:space="preserve">5. 按"我想问什么"反查</w:t>
       </w:r>
     </w:p>
-    <w:bookmarkStart w:id="39" w:name="现在-r1-是什么"/>
+    <w:bookmarkStart w:id="40" w:name="现在-r1-是什么"/>
     <w:p>
       <w:pPr>
         <w:pStyle w:val="Heading3"/>
@@ -11504,60 +12450,14 @@
         <w:t xml:space="preserve">。</w:t>
       </w:r>
     </w:p>
-    <w:bookmarkEnd w:id="39"/>
-    <w:bookmarkStart w:id="40" w:name="p1--p2--p3-怎么衔接"/>
+    <w:bookmarkEnd w:id="40"/>
+    <w:bookmarkStart w:id="41" w:name="p1--p2--p3-怎么衔接"/>
     <w:p>
       <w:pPr>
         <w:pStyle w:val="Heading3"/>
       </w:pPr>
       <w:r>
         <w:t xml:space="preserve">"P1 / P2 / P3 怎么衔接?"</w:t>
-      </w:r>
-    </w:p>
-    <w:p>
-      <w:pPr>
-        <w:numPr>
-          <w:ilvl w:val="0"/>
-          <w:numId w:val="1001"/>
-        </w:numPr>
-        <w:pStyle w:val="Compact"/>
-      </w:pPr>
-      <w:r>
-        <w:t xml:space="preserve">P1 = R1/R2 出分 → E1 入账</w:t>
-      </w:r>
-    </w:p>
-    <w:p>
-      <w:pPr>
-        <w:numPr>
-          <w:ilvl w:val="0"/>
-          <w:numId w:val="1001"/>
-        </w:numPr>
-        <w:pStyle w:val="Compact"/>
-      </w:pPr>
-      <w:r>
-        <w:t xml:space="preserve">P2 = W1 基建 → W2 pilot + G3 → W3–W5 生成 10B → W6 训 E2/E3 = G4 决策</w:t>
-      </w:r>
-    </w:p>
-    <w:p>
-      <w:pPr>
-        <w:numPr>
-          <w:ilvl w:val="0"/>
-          <w:numId w:val="1001"/>
-        </w:numPr>
-        <w:pStyle w:val="Compact"/>
-      </w:pPr>
-      <w:r>
-        <w:t xml:space="preserve">P3 = E2 胜出 → 放大到 30B uniq v1.0 + ⑧⑨ 升级 + Protocol A 锚验证</w:t>
-      </w:r>
-    </w:p>
-    <w:bookmarkEnd w:id="40"/>
-    <w:bookmarkStart w:id="41" w:name="c--e--a-之间什么关系"/>
-    <w:p>
-      <w:pPr>
-        <w:pStyle w:val="Heading3"/>
-      </w:pPr>
-      <w:r>
-        <w:t xml:space="preserve">"C / E / A 之间什么关系?"</w:t>
       </w:r>
     </w:p>
     <w:p>
@@ -11569,17 +12469,7 @@
         <w:pStyle w:val="Compact"/>
       </w:pPr>
       <w:r>
-        <w:rPr>
-          <w:bCs/>
-          <w:b/>
-        </w:rPr>
-        <w:t xml:space="preserve">C</w:t>
-      </w:r>
-      <w:r>
-        <w:t xml:space="preserve"> </w:t>
-      </w:r>
-      <w:r>
-        <w:t xml:space="preserve">= 静态方针(我们决定这么生成,16 条)</w:t>
+        <w:t xml:space="preserve">P1 = R1/R2 出分 → E1 入账</w:t>
       </w:r>
     </w:p>
     <w:p>
@@ -11591,17 +12481,7 @@
         <w:pStyle w:val="Compact"/>
       </w:pPr>
       <w:r>
-        <w:rPr>
-          <w:bCs/>
-          <w:b/>
-        </w:rPr>
-        <w:t xml:space="preserve">E</w:t>
-      </w:r>
-      <w:r>
-        <w:t xml:space="preserve"> </w:t>
-      </w:r>
-      <w:r>
-        <w:t xml:space="preserve">= Track 1 实验(v0.1 整体好不好,5 组)</w:t>
+        <w:t xml:space="preserve">P2 = W1 基建 → W2 pilot + G3 → W3–W5 生成 10B → W6 训 E2/E3 = G4 决策</w:t>
       </w:r>
     </w:p>
     <w:p>
@@ -11613,313 +12493,17 @@
         <w:pStyle w:val="Compact"/>
       </w:pPr>
       <w:r>
-        <w:rPr>
-          <w:bCs/>
-          <w:b/>
-        </w:rPr>
-        <w:t xml:space="preserve">A</w:t>
-      </w:r>
-      <w:r>
-        <w:t xml:space="preserve"> </w:t>
-      </w:r>
-      <w:r>
-        <w:t xml:space="preserve">= Track 2 ablation(每条 C 值多少分,10 组;P2 批准 6 组重生成)</w:t>
-      </w:r>
-    </w:p>
-    <w:p>
-      <w:pPr>
-        <w:numPr>
-          <w:ilvl w:val="0"/>
-          <w:numId w:val="1002"/>
-        </w:numPr>
-        <w:pStyle w:val="Compact"/>
-      </w:pPr>
-      <w:r>
-        <w:rPr>
-          <w:bCs/>
-          <w:b/>
-        </w:rPr>
-        <w:t xml:space="preserve">G</w:t>
-      </w:r>
-      <w:r>
-        <w:t xml:space="preserve"> </w:t>
-      </w:r>
-      <w:r>
-        <w:t xml:space="preserve">= 门控,把以上流程分阶段卡住</w:t>
+        <w:t xml:space="preserve">P3 = E2 胜出 → 放大到 30B uniq v1.0 + ⑧⑨ 升级 + Protocol A 锚验证</w:t>
       </w:r>
     </w:p>
     <w:bookmarkEnd w:id="41"/>
-    <w:bookmarkStart w:id="42" w:name="c13-跟-a10-是一样的吗"/>
+    <w:bookmarkStart w:id="42" w:name="c--e--a-之间什么关系"/>
     <w:p>
       <w:pPr>
         <w:pStyle w:val="Heading3"/>
       </w:pPr>
       <w:r>
-        <w:t xml:space="preserve">"C13 跟 A10 是一样的吗?"</w:t>
-      </w:r>
-    </w:p>
-    <w:p>
-      <w:pPr>
-        <w:pStyle w:val="FirstParagraph"/>
-      </w:pPr>
-      <w:r>
-        <w:t xml:space="preserve">不一样。</w:t>
-      </w:r>
-      <w:r>
-        <w:rPr>
-          <w:bCs/>
-          <w:b/>
-        </w:rPr>
-        <w:t xml:space="preserve">C13 是我们做 instruction reversal 这件事</w:t>
-      </w:r>
-      <w:r>
-        <w:t xml:space="preserve">(生成配方里 10% 走这条路径),</w:t>
-      </w:r>
-      <w:r>
-        <w:rPr>
-          <w:bCs/>
-          <w:b/>
-        </w:rPr>
-        <w:t xml:space="preserve">A10 是验证 C13 值多少分</w:t>
-      </w:r>
-      <w:r>
-        <w:t xml:space="preserve">(关闭 reversal vs 开启,对比 Δ benchmark)。C13 是因,A10 是证据。C1↔A1、C2↔A3、C3↔A5、C4↔A4、C10↔A7、C15↔A2 同理。</w:t>
-      </w:r>
-    </w:p>
-    <w:bookmarkEnd w:id="42"/>
-    <w:bookmarkStart w:id="43" w:name="Xba7082c994dbd41d80a18d976d308e98a97e868"/>
-    <w:p>
-      <w:pPr>
-        <w:pStyle w:val="Heading3"/>
-      </w:pPr>
-      <w:r>
-        <w:t xml:space="preserve">"①–⑨ 跟 C 什么关系?"</w:t>
-      </w:r>
-    </w:p>
-    <w:p>
-      <w:pPr>
-        <w:pStyle w:val="FirstParagraph"/>
-      </w:pPr>
-      <w:r>
-        <w:t xml:space="preserve">① 调 uniq 总量、② 调 frontier 占比、③ 调 Best-of-N、④ 调 critic 覆盖与轮数、⑤ 调 seed 来源、⑥ 调 persona 规模、⑦ 调 结构数量 ——</w:t>
-      </w:r>
-      <w:r>
-        <w:t xml:space="preserve"> </w:t>
-      </w:r>
-      <w:r>
-        <w:rPr>
-          <w:bCs/>
-          <w:b/>
-        </w:rPr>
-        <w:t xml:space="preserve">都是在现有 C 决策上调参数,不是新策略</w:t>
-      </w:r>
-      <w:r>
-        <w:t xml:space="preserve">。C 是定性,①–⑨ 是定量。</w:t>
-      </w:r>
-    </w:p>
-    <w:bookmarkEnd w:id="43"/>
-    <w:bookmarkStart w:id="44" w:name="g3-打输怎么办"/>
-    <w:p>
-      <w:pPr>
-        <w:pStyle w:val="Heading3"/>
-      </w:pPr>
-      <w:r>
-        <w:t xml:space="preserve">"G3 打输怎么办?"</w:t>
-      </w:r>
-    </w:p>
-    <w:p>
-      <w:pPr>
-        <w:pStyle w:val="FirstParagraph"/>
-      </w:pPr>
-      <w:r>
-        <w:t xml:space="preserve">P2 规则:</w:t>
-      </w:r>
-      <w:r>
-        <w:rPr>
-          <w:bCs/>
-          <w:b/>
-        </w:rPr>
-        <w:t xml:space="preserve">无论 G3 结果都进 G4</w:t>
-      </w:r>
-      <w:r>
-        <w:t xml:space="preserve">,避免 cooldown-fork 的 false-negative(Hägele et al. 报告相关系数 0.88,小 gap 有翻盘概率)。G3 只是"早期信号",G4 才是最终裁决。</w:t>
-      </w:r>
-    </w:p>
-    <w:bookmarkEnd w:id="44"/>
-    <w:bookmarkStart w:id="45" w:name="e2-要训多久"/>
-    <w:p>
-      <w:pPr>
-        <w:pStyle w:val="Heading3"/>
-      </w:pPr>
-      <w:r>
-        <w:t xml:space="preserve">"E2 要训多久?"</w:t>
-      </w:r>
-    </w:p>
-    <w:p>
-      <w:pPr>
-        <w:pStyle w:val="FirstParagraph"/>
-      </w:pPr>
-      <w:r>
-        <w:t xml:space="preserve">10B uniq × 30B 训练 × 2 seeds × Qwen3-1.7B ≈</w:t>
-      </w:r>
-      <w:r>
-        <w:t xml:space="preserve"> </w:t>
-      </w:r>
-      <w:r>
-        <w:rPr>
-          <w:bCs/>
-          <w:b/>
-        </w:rPr>
-        <w:t xml:space="preserve">4 天</w:t>
-      </w:r>
-      <w:r>
-        <w:t xml:space="preserve">(8×H100,对齐 R1 实测 45–55h/seed × 2 seeds)。加上 E3(3B × 10ep × 1 seed,~2 天)= W6 约 6 天 GPU。</w:t>
-      </w:r>
-    </w:p>
-    <w:bookmarkEnd w:id="45"/>
-    <w:bookmarkStart w:id="46" w:name="w1w6-跟-r1-冲突吗"/>
-    <w:p>
-      <w:pPr>
-        <w:pStyle w:val="Heading3"/>
-      </w:pPr>
-      <w:r>
-        <w:t xml:space="preserve">"W1–W6 跟 R1 冲突吗?"</w:t>
-      </w:r>
-    </w:p>
-    <w:p>
-      <w:pPr>
-        <w:pStyle w:val="FirstParagraph"/>
-      </w:pPr>
-      <w:r>
-        <w:t xml:space="preserve">不冲突。W1 是纯工程 + 数据准备 + 少量 API 开销,W2 pilot 的 G3 fork 需要 backbone(需要 R3 先跑,~1.3 天),所以</w:t>
-      </w:r>
-      <w:r>
-        <w:rPr>
-          <w:bCs/>
-          <w:b/>
-        </w:rPr>
-        <w:t xml:space="preserve">顺序</w:t>
-      </w:r>
-      <w:r>
-        <w:t xml:space="preserve">:R1(主训练机)→ R2 → R3(backbone)→ W2 fork。W1 本身不抢 GPU,可与 R1/R2 并行做。</w:t>
-      </w:r>
-    </w:p>
-    <w:bookmarkEnd w:id="46"/>
-    <w:bookmarkStart w:id="47" w:name="l1-l2-l3-和-p1-p2-p3-冲突吗"/>
-    <w:p>
-      <w:pPr>
-        <w:pStyle w:val="Heading3"/>
-      </w:pPr>
-      <w:r>
-        <w:t xml:space="preserve">"L1 L2 L3 和 P1 P2 P3 冲突吗?"</w:t>
-      </w:r>
-    </w:p>
-    <w:p>
-      <w:pPr>
-        <w:pStyle w:val="FirstParagraph"/>
-      </w:pPr>
-      <w:r>
-        <w:t xml:space="preserve">完全不同两个轴。</w:t>
-      </w:r>
-      <w:r>
-        <w:rPr>
-          <w:bCs/>
-          <w:b/>
-        </w:rPr>
-        <w:t xml:space="preserve">L</w:t>
-      </w:r>
-      <w:r>
-        <w:t xml:space="preserve"> </w:t>
-      </w:r>
-      <w:r>
-        <w:t xml:space="preserve">= Layer(存储层),</w:t>
-      </w:r>
-      <w:r>
-        <w:rPr>
-          <w:bCs/>
-          <w:b/>
-        </w:rPr>
-        <w:t xml:space="preserve">P</w:t>
-      </w:r>
-      <w:r>
-        <w:t xml:space="preserve"> </w:t>
-      </w:r>
-      <w:r>
-        <w:t xml:space="preserve">= Phase(时间)。</w:t>
-      </w:r>
-    </w:p>
-    <w:bookmarkEnd w:id="47"/>
-    <w:bookmarkStart w:id="48" w:name="adr-0007-和-protocol-ab-是一回事"/>
-    <w:p>
-      <w:pPr>
-        <w:pStyle w:val="Heading3"/>
-      </w:pPr>
-      <w:r>
-        <w:t xml:space="preserve">"ADR 0007 和 Protocol A/B 是一回事?"</w:t>
-      </w:r>
-    </w:p>
-    <w:p>
-      <w:pPr>
-        <w:pStyle w:val="FirstParagraph"/>
-      </w:pPr>
-      <w:r>
-        <w:t xml:space="preserve">ADR 0007 是</w:t>
-      </w:r>
-      <w:r>
-        <w:rPr>
-          <w:bCs/>
-          <w:b/>
-        </w:rPr>
-        <w:t xml:space="preserve">决策文档</w:t>
-      </w:r>
-      <w:r>
-        <w:t xml:space="preserve">,Protocol A/B 是</w:t>
-      </w:r>
-      <w:r>
-        <w:rPr>
-          <w:bCs/>
-          <w:b/>
-        </w:rPr>
-        <w:t xml:space="preserve">决策产物</w:t>
-      </w:r>
-      <w:r>
-        <w:t xml:space="preserve">。读 ADR 0007 即理解 Protocol A/B。</w:t>
-      </w:r>
-    </w:p>
-    <w:bookmarkEnd w:id="48"/>
-    <w:bookmarkStart w:id="49" w:name="我要新加一条生成策略-c17怎么办"/>
-    <w:p>
-      <w:pPr>
-        <w:pStyle w:val="Heading3"/>
-      </w:pPr>
-      <w:r>
-        <w:t xml:space="preserve">"我要新加一条生成策略 C17,怎么办?"</w:t>
-      </w:r>
-    </w:p>
-    <w:p>
-      <w:pPr>
-        <w:pStyle w:val="FirstParagraph"/>
-      </w:pPr>
-      <w:r>
-        <w:t xml:space="preserve">见下面维护约定。</w:t>
-      </w:r>
-    </w:p>
-    <w:p>
-      <w:r>
-        <w:pict>
-          <v:rect style="width:0;height:1.5pt" o:hralign="center" o:hrstd="t" o:hr="t"/>
-        </w:pict>
-      </w:r>
-    </w:p>
-    <w:bookmarkEnd w:id="49"/>
-    <w:bookmarkEnd w:id="50"/>
-    <w:bookmarkStart w:id="51" w:name="Xd8f8c1297734e2df32999e899ccebb73cb6cd6e"/>
-    <w:p>
-      <w:pPr>
-        <w:pStyle w:val="Heading2"/>
-      </w:pPr>
-      <w:r>
-        <w:t xml:space="preserve">6. 维护约定</w:t>
+        <w:t xml:space="preserve">"C / E / A 之间什么关系?"</w:t>
       </w:r>
     </w:p>
     <w:p>
@@ -11935,43 +12519,13 @@
           <w:bCs/>
           <w:b/>
         </w:rPr>
-        <w:t xml:space="preserve">新增 ADR</w:t>
+        <w:t xml:space="preserve">C</w:t>
       </w:r>
       <w:r>
         <w:t xml:space="preserve"> </w:t>
       </w:r>
       <w:r>
-        <w:t xml:space="preserve">→</w:t>
-      </w:r>
-      <w:r>
-        <w:t xml:space="preserve"> </w:t>
-      </w:r>
-      <w:r>
-        <w:rPr>
-          <w:rStyle w:val="VerbatimChar"/>
-        </w:rPr>
-        <w:t xml:space="preserve">docs/decisions/0010-*.md</w:t>
-      </w:r>
-      <w:r>
-        <w:t xml:space="preserve"> </w:t>
-      </w:r>
-      <w:r>
-        <w:t xml:space="preserve">+ 更新</w:t>
-      </w:r>
-      <w:r>
-        <w:t xml:space="preserve"> </w:t>
-      </w:r>
-      <w:r>
-        <w:rPr>
-          <w:rStyle w:val="VerbatimChar"/>
-        </w:rPr>
-        <w:t xml:space="preserve">decisions/README.md</w:t>
-      </w:r>
-      <w:r>
-        <w:t xml:space="preserve"> </w:t>
-      </w:r>
-      <w:r>
-        <w:t xml:space="preserve">索引 + 本表 §3.2。</w:t>
+        <w:t xml:space="preserve">= 静态方针(我们决定这么生成,16 条)</w:t>
       </w:r>
     </w:p>
     <w:p>
@@ -11987,28 +12541,13 @@
           <w:bCs/>
           <w:b/>
         </w:rPr>
-        <w:t xml:space="preserve">新增 C 策略(C21+)</w:t>
+        <w:t xml:space="preserve">E</w:t>
       </w:r>
       <w:r>
         <w:t xml:space="preserve"> </w:t>
       </w:r>
       <w:r>
-        <w:t xml:space="preserve">→ 加到</w:t>
-      </w:r>
-      <w:r>
-        <w:t xml:space="preserve"> </w:t>
-      </w:r>
-      <w:r>
-        <w:rPr>
-          <w:rStyle w:val="VerbatimChar"/>
-        </w:rPr>
-        <w:t xml:space="preserve">docs/methodology.md §3</w:t>
-      </w:r>
-      <w:r>
-        <w:t xml:space="preserve"> </w:t>
-      </w:r>
-      <w:r>
-        <w:t xml:space="preserve">+ 本表 §3.3。</w:t>
+        <w:t xml:space="preserve">= Track 1 实验(v0.1 整体好不好,5 组)</w:t>
       </w:r>
     </w:p>
     <w:p>
@@ -12024,25 +12563,13 @@
           <w:bCs/>
           <w:b/>
         </w:rPr>
-        <w:t xml:space="preserve">新增 E 实验(E6+)</w:t>
+        <w:t xml:space="preserve">A</w:t>
       </w:r>
       <w:r>
         <w:t xml:space="preserve"> </w:t>
       </w:r>
       <w:r>
-        <w:t xml:space="preserve">→ 加到本表 §3.5 + 创建</w:t>
-      </w:r>
-      <w:r>
-        <w:t xml:space="preserve"> </w:t>
-      </w:r>
-      <w:r>
-        <w:rPr>
-          <w:rStyle w:val="VerbatimChar"/>
-        </w:rPr>
-        <w:t xml:space="preserve">experiments/exp_*/config.yaml</w:t>
-      </w:r>
-      <w:r>
-        <w:t xml:space="preserve">。</w:t>
+        <w:t xml:space="preserve">= Track 2 ablation(每条 C 值多少分,10 组;P2 批准 6 组重生成)</w:t>
       </w:r>
     </w:p>
     <w:p>
@@ -12058,20 +12585,294 @@
           <w:bCs/>
           <w:b/>
         </w:rPr>
-        <w:t xml:space="preserve">新增 A 消融(A16+)</w:t>
+        <w:t xml:space="preserve">G</w:t>
       </w:r>
       <w:r>
         <w:t xml:space="preserve"> </w:t>
       </w:r>
       <w:r>
-        <w:t xml:space="preserve">→ 加到本表 §3.6 + 对应 C 决策在 §3.3 的"对应 ablation"列更新。</w:t>
+        <w:t xml:space="preserve">= 门控,把以上流程分阶段卡住</w:t>
+      </w:r>
+    </w:p>
+    <w:bookmarkEnd w:id="42"/>
+    <w:bookmarkStart w:id="43" w:name="c13-跟-a10-是一样的吗"/>
+    <w:p>
+      <w:pPr>
+        <w:pStyle w:val="Heading3"/>
+      </w:pPr>
+      <w:r>
+        <w:t xml:space="preserve">"C13 跟 A10 是一样的吗?"</w:t>
+      </w:r>
+    </w:p>
+    <w:p>
+      <w:pPr>
+        <w:pStyle w:val="FirstParagraph"/>
+      </w:pPr>
+      <w:r>
+        <w:t xml:space="preserve">不一样。</w:t>
+      </w:r>
+      <w:r>
+        <w:rPr>
+          <w:bCs/>
+          <w:b/>
+        </w:rPr>
+        <w:t xml:space="preserve">C13 是我们做 instruction reversal 这件事</w:t>
+      </w:r>
+      <w:r>
+        <w:t xml:space="preserve">(生成配方里 10% 走这条路径),</w:t>
+      </w:r>
+      <w:r>
+        <w:rPr>
+          <w:bCs/>
+          <w:b/>
+        </w:rPr>
+        <w:t xml:space="preserve">A10 是验证 C13 值多少分</w:t>
+      </w:r>
+      <w:r>
+        <w:t xml:space="preserve">(关闭 reversal vs 开启,对比 Δ benchmark)。C13 是因,A10 是证据。C1↔A1、C2↔A3、C3↔A5、C4↔A4、C10↔A7、C15↔A2 同理。</w:t>
+      </w:r>
+    </w:p>
+    <w:bookmarkEnd w:id="43"/>
+    <w:bookmarkStart w:id="44" w:name="Xba7082c994dbd41d80a18d976d308e98a97e868"/>
+    <w:p>
+      <w:pPr>
+        <w:pStyle w:val="Heading3"/>
+      </w:pPr>
+      <w:r>
+        <w:t xml:space="preserve">"①–⑨ 跟 C 什么关系?"</w:t>
+      </w:r>
+    </w:p>
+    <w:p>
+      <w:pPr>
+        <w:pStyle w:val="FirstParagraph"/>
+      </w:pPr>
+      <w:r>
+        <w:t xml:space="preserve">① 调 uniq 总量、② 调 frontier 占比、③ 调 Best-of-N、④ 调 critic 覆盖与轮数、⑤ 调 seed 来源、⑥ 调 persona 规模、⑦ 调 结构数量 ——</w:t>
+      </w:r>
+      <w:r>
+        <w:t xml:space="preserve"> </w:t>
+      </w:r>
+      <w:r>
+        <w:rPr>
+          <w:bCs/>
+          <w:b/>
+        </w:rPr>
+        <w:t xml:space="preserve">都是在现有 C 决策上调参数,不是新策略</w:t>
+      </w:r>
+      <w:r>
+        <w:t xml:space="preserve">。C 是定性,①–⑨ 是定量。</w:t>
+      </w:r>
+    </w:p>
+    <w:bookmarkEnd w:id="44"/>
+    <w:bookmarkStart w:id="45" w:name="g3-打输怎么办"/>
+    <w:p>
+      <w:pPr>
+        <w:pStyle w:val="Heading3"/>
+      </w:pPr>
+      <w:r>
+        <w:t xml:space="preserve">"G3 打输怎么办?"</w:t>
+      </w:r>
+    </w:p>
+    <w:p>
+      <w:pPr>
+        <w:pStyle w:val="FirstParagraph"/>
+      </w:pPr>
+      <w:r>
+        <w:t xml:space="preserve">P2 规则:</w:t>
+      </w:r>
+      <w:r>
+        <w:rPr>
+          <w:bCs/>
+          <w:b/>
+        </w:rPr>
+        <w:t xml:space="preserve">无论 G3 结果都进 G4</w:t>
+      </w:r>
+      <w:r>
+        <w:t xml:space="preserve">,避免 cooldown-fork 的 false-negative(Hägele et al. 报告相关系数 0.88,小 gap 有翻盘概率)。G3 只是"早期信号",G4 才是最终裁决。</w:t>
+      </w:r>
+    </w:p>
+    <w:bookmarkEnd w:id="45"/>
+    <w:bookmarkStart w:id="46" w:name="e2-要训多久"/>
+    <w:p>
+      <w:pPr>
+        <w:pStyle w:val="Heading3"/>
+      </w:pPr>
+      <w:r>
+        <w:t xml:space="preserve">"E2 要训多久?"</w:t>
+      </w:r>
+    </w:p>
+    <w:p>
+      <w:pPr>
+        <w:pStyle w:val="FirstParagraph"/>
+      </w:pPr>
+      <w:r>
+        <w:t xml:space="preserve">10B uniq × 30B 训练 × 2 seeds × Qwen3-1.7B ≈</w:t>
+      </w:r>
+      <w:r>
+        <w:t xml:space="preserve"> </w:t>
+      </w:r>
+      <w:r>
+        <w:rPr>
+          <w:bCs/>
+          <w:b/>
+        </w:rPr>
+        <w:t xml:space="preserve">4 天</w:t>
+      </w:r>
+      <w:r>
+        <w:t xml:space="preserve">(8×H100,对齐 R1 实测 45–55h/seed × 2 seeds)。加上 E3(3B × 10ep × 1 seed,~2 天)= W6 约 6 天 GPU。</w:t>
+      </w:r>
+    </w:p>
+    <w:bookmarkEnd w:id="46"/>
+    <w:bookmarkStart w:id="47" w:name="w1w6-跟-r1-冲突吗"/>
+    <w:p>
+      <w:pPr>
+        <w:pStyle w:val="Heading3"/>
+      </w:pPr>
+      <w:r>
+        <w:t xml:space="preserve">"W1–W6 跟 R1 冲突吗?"</w:t>
+      </w:r>
+    </w:p>
+    <w:p>
+      <w:pPr>
+        <w:pStyle w:val="FirstParagraph"/>
+      </w:pPr>
+      <w:r>
+        <w:t xml:space="preserve">不冲突。W1 是纯工程 + 数据准备 + 少量 API 开销,W2 pilot 的 G3 fork 需要 backbone(需要 R3 先跑,~1.3 天),所以</w:t>
+      </w:r>
+      <w:r>
+        <w:rPr>
+          <w:bCs/>
+          <w:b/>
+        </w:rPr>
+        <w:t xml:space="preserve">顺序</w:t>
+      </w:r>
+      <w:r>
+        <w:t xml:space="preserve">:R1(主训练机)→ R2 → R3(backbone)→ W2 fork。W1 本身不抢 GPU,可与 R1/R2 并行做。</w:t>
+      </w:r>
+    </w:p>
+    <w:bookmarkEnd w:id="47"/>
+    <w:bookmarkStart w:id="48" w:name="l1-l2-l3-和-p1-p2-p3-冲突吗"/>
+    <w:p>
+      <w:pPr>
+        <w:pStyle w:val="Heading3"/>
+      </w:pPr>
+      <w:r>
+        <w:t xml:space="preserve">"L1 L2 L3 和 P1 P2 P3 冲突吗?"</w:t>
+      </w:r>
+    </w:p>
+    <w:p>
+      <w:pPr>
+        <w:pStyle w:val="FirstParagraph"/>
+      </w:pPr>
+      <w:r>
+        <w:t xml:space="preserve">完全不同两个轴。</w:t>
+      </w:r>
+      <w:r>
+        <w:rPr>
+          <w:bCs/>
+          <w:b/>
+        </w:rPr>
+        <w:t xml:space="preserve">L</w:t>
+      </w:r>
+      <w:r>
+        <w:t xml:space="preserve"> </w:t>
+      </w:r>
+      <w:r>
+        <w:t xml:space="preserve">= Layer(存储层),</w:t>
+      </w:r>
+      <w:r>
+        <w:rPr>
+          <w:bCs/>
+          <w:b/>
+        </w:rPr>
+        <w:t xml:space="preserve">P</w:t>
+      </w:r>
+      <w:r>
+        <w:t xml:space="preserve"> </w:t>
+      </w:r>
+      <w:r>
+        <w:t xml:space="preserve">= Phase(时间)。</w:t>
+      </w:r>
+    </w:p>
+    <w:bookmarkEnd w:id="48"/>
+    <w:bookmarkStart w:id="49" w:name="adr-0007-和-protocol-ab-是一回事"/>
+    <w:p>
+      <w:pPr>
+        <w:pStyle w:val="Heading3"/>
+      </w:pPr>
+      <w:r>
+        <w:t xml:space="preserve">"ADR 0007 和 Protocol A/B 是一回事?"</w:t>
+      </w:r>
+    </w:p>
+    <w:p>
+      <w:pPr>
+        <w:pStyle w:val="FirstParagraph"/>
+      </w:pPr>
+      <w:r>
+        <w:t xml:space="preserve">ADR 0007 是</w:t>
+      </w:r>
+      <w:r>
+        <w:rPr>
+          <w:bCs/>
+          <w:b/>
+        </w:rPr>
+        <w:t xml:space="preserve">决策文档</w:t>
+      </w:r>
+      <w:r>
+        <w:t xml:space="preserve">,Protocol A/B 是</w:t>
+      </w:r>
+      <w:r>
+        <w:rPr>
+          <w:bCs/>
+          <w:b/>
+        </w:rPr>
+        <w:t xml:space="preserve">决策产物</w:t>
+      </w:r>
+      <w:r>
+        <w:t xml:space="preserve">。读 ADR 0007 即理解 Protocol A/B。</w:t>
+      </w:r>
+    </w:p>
+    <w:bookmarkEnd w:id="49"/>
+    <w:bookmarkStart w:id="50" w:name="我要新加一条生成策略-c17怎么办"/>
+    <w:p>
+      <w:pPr>
+        <w:pStyle w:val="Heading3"/>
+      </w:pPr>
+      <w:r>
+        <w:t xml:space="preserve">"我要新加一条生成策略 C17,怎么办?"</w:t>
+      </w:r>
+    </w:p>
+    <w:p>
+      <w:pPr>
+        <w:pStyle w:val="FirstParagraph"/>
+      </w:pPr>
+      <w:r>
+        <w:t xml:space="preserve">见下面维护约定。</w:t>
+      </w:r>
+    </w:p>
+    <w:p>
+      <w:r>
+        <w:pict>
+          <v:rect style="width:0;height:1.5pt" o:hralign="center" o:hrstd="t" o:hr="t"/>
+        </w:pict>
+      </w:r>
+    </w:p>
+    <w:bookmarkEnd w:id="50"/>
+    <w:bookmarkEnd w:id="51"/>
+    <w:bookmarkStart w:id="52" w:name="Xd8f8c1297734e2df32999e899ccebb73cb6cd6e"/>
+    <w:p>
+      <w:pPr>
+        <w:pStyle w:val="Heading2"/>
+      </w:pPr>
+      <w:r>
+        <w:t xml:space="preserve">6. 维护约定</w:t>
       </w:r>
     </w:p>
     <w:p>
       <w:pPr>
         <w:numPr>
           <w:ilvl w:val="0"/>
-          <w:numId w:val="1003"/>
+          <w:numId w:val="1004"/>
         </w:numPr>
         <w:pStyle w:val="Compact"/>
       </w:pPr>
@@ -12080,20 +12881,50 @@
           <w:bCs/>
           <w:b/>
         </w:rPr>
-        <w:t xml:space="preserve">新增 G 门(G5+)</w:t>
+        <w:t xml:space="preserve">新增 ADR</w:t>
       </w:r>
       <w:r>
         <w:t xml:space="preserve"> </w:t>
       </w:r>
       <w:r>
-        <w:t xml:space="preserve">→ 加到本表 §3.7,写明规模 / 训练与否 / 通过条件。</w:t>
+        <w:t xml:space="preserve">→</w:t>
+      </w:r>
+      <w:r>
+        <w:t xml:space="preserve"> </w:t>
+      </w:r>
+      <w:r>
+        <w:rPr>
+          <w:rStyle w:val="VerbatimChar"/>
+        </w:rPr>
+        <w:t xml:space="preserve">docs/decisions/0010-*.md</w:t>
+      </w:r>
+      <w:r>
+        <w:t xml:space="preserve"> </w:t>
+      </w:r>
+      <w:r>
+        <w:t xml:space="preserve">+ 更新</w:t>
+      </w:r>
+      <w:r>
+        <w:t xml:space="preserve"> </w:t>
+      </w:r>
+      <w:r>
+        <w:rPr>
+          <w:rStyle w:val="VerbatimChar"/>
+        </w:rPr>
+        <w:t xml:space="preserve">decisions/README.md</w:t>
+      </w:r>
+      <w:r>
+        <w:t xml:space="preserve"> </w:t>
+      </w:r>
+      <w:r>
+        <w:t xml:space="preserve">索引 + 本表 §3.2。</w:t>
       </w:r>
     </w:p>
     <w:p>
       <w:pPr>
         <w:numPr>
           <w:ilvl w:val="0"/>
-          <w:numId w:val="1003"/>
+          <w:numId w:val="1004"/>
         </w:numPr>
         <w:pStyle w:val="Compact"/>
       </w:pPr>
@@ -12102,20 +12933,35 @@
           <w:bCs/>
           <w:b/>
         </w:rPr>
-        <w:t xml:space="preserve">新增 ⑮ 升级项</w:t>
+        <w:t xml:space="preserve">新增 C 策略(C21+)</w:t>
       </w:r>
       <w:r>
         <w:t xml:space="preserve"> </w:t>
       </w:r>
       <w:r>
-        <w:t xml:space="preserve">→ 加到本表 §3.4,在对应 W 周次里安排落地。</w:t>
+        <w:t xml:space="preserve">→ 加到</w:t>
+      </w:r>
+      <w:r>
+        <w:t xml:space="preserve"> </w:t>
+      </w:r>
+      <w:r>
+        <w:rPr>
+          <w:rStyle w:val="VerbatimChar"/>
+        </w:rPr>
+        <w:t xml:space="preserve">docs/methodology.md §3</w:t>
+      </w:r>
+      <w:r>
+        <w:t xml:space="preserve"> </w:t>
+      </w:r>
+      <w:r>
+        <w:t xml:space="preserve">+ 本表 §3.3。</w:t>
       </w:r>
     </w:p>
     <w:p>
       <w:pPr>
         <w:numPr>
           <w:ilvl w:val="0"/>
-          <w:numId w:val="1003"/>
+          <w:numId w:val="1004"/>
         </w:numPr>
         <w:pStyle w:val="Compact"/>
       </w:pPr>
@@ -12124,13 +12970,13 @@
           <w:bCs/>
           <w:b/>
         </w:rPr>
-        <w:t xml:space="preserve">新增 TODO(T6+)</w:t>
+        <w:t xml:space="preserve">新增 E 实验(E6+)</w:t>
       </w:r>
       <w:r>
         <w:t xml:space="preserve"> </w:t>
       </w:r>
       <w:r>
-        <w:t xml:space="preserve">→</w:t>
+        <w:t xml:space="preserve">→ 加到本表 §3.5 + 创建</w:t>
       </w:r>
       <w:r>
         <w:t xml:space="preserve"> </w:t>
@@ -12139,20 +12985,17 @@
         <w:rPr>
           <w:rStyle w:val="VerbatimChar"/>
         </w:rPr>
-        <w:t xml:space="preserve">docs/project-status.md § TODO 队列</w:t>
-      </w:r>
-      <w:r>
-        <w:t xml:space="preserve"> </w:t>
-      </w:r>
-      <w:r>
-        <w:t xml:space="preserve">+ 本表 §3.13。</w:t>
+        <w:t xml:space="preserve">experiments/exp_*/config.yaml</w:t>
+      </w:r>
+      <w:r>
+        <w:t xml:space="preserve">。</w:t>
       </w:r>
     </w:p>
     <w:p>
       <w:pPr>
         <w:numPr>
           <w:ilvl w:val="0"/>
-          <w:numId w:val="1003"/>
+          <w:numId w:val="1004"/>
         </w:numPr>
         <w:pStyle w:val="Compact"/>
       </w:pPr>
@@ -12161,50 +13004,153 @@
           <w:bCs/>
           <w:b/>
         </w:rPr>
-        <w:t xml:space="preserve">阶段推进</w:t>
+        <w:t xml:space="preserve">新增 A 消融(A16+)</w:t>
       </w:r>
       <w:r>
         <w:t xml:space="preserve"> </w:t>
       </w:r>
       <w:r>
-        <w:t xml:space="preserve">→ 更新</w:t>
-      </w:r>
-      <w:r>
-        <w:t xml:space="preserve"> </w:t>
-      </w:r>
-      <w:r>
-        <w:rPr>
-          <w:rStyle w:val="VerbatimChar"/>
-        </w:rPr>
-        <w:t xml:space="preserve">README.md</w:t>
-      </w:r>
-      <w:r>
-        <w:t xml:space="preserve"> </w:t>
-      </w:r>
-      <w:r>
-        <w:t xml:space="preserve">首屏「当前阶段」+</w:t>
-      </w:r>
-      <w:r>
-        <w:t xml:space="preserve"> </w:t>
-      </w:r>
-      <w:r>
-        <w:rPr>
-          <w:rStyle w:val="VerbatimChar"/>
-        </w:rPr>
-        <w:t xml:space="preserve">docs/project-status.md</w:t>
-      </w:r>
-      <w:r>
-        <w:t xml:space="preserve"> </w:t>
-      </w:r>
-      <w:r>
-        <w:t xml:space="preserve">变更历史 + 本表 §3.1 状态列。</w:t>
+        <w:t xml:space="preserve">→ 加到本表 §3.6 + 对应 C 决策在 §3.3 的"对应 ablation"列更新。</w:t>
       </w:r>
     </w:p>
     <w:p>
       <w:pPr>
         <w:numPr>
           <w:ilvl w:val="0"/>
-          <w:numId w:val="1003"/>
+          <w:numId w:val="1004"/>
+        </w:numPr>
+        <w:pStyle w:val="Compact"/>
+      </w:pPr>
+      <w:r>
+        <w:rPr>
+          <w:bCs/>
+          <w:b/>
+        </w:rPr>
+        <w:t xml:space="preserve">新增 G 门(G5+)</w:t>
+      </w:r>
+      <w:r>
+        <w:t xml:space="preserve"> </w:t>
+      </w:r>
+      <w:r>
+        <w:t xml:space="preserve">→ 加到本表 §3.7,写明规模 / 训练与否 / 通过条件。</w:t>
+      </w:r>
+    </w:p>
+    <w:p>
+      <w:pPr>
+        <w:numPr>
+          <w:ilvl w:val="0"/>
+          <w:numId w:val="1004"/>
+        </w:numPr>
+        <w:pStyle w:val="Compact"/>
+      </w:pPr>
+      <w:r>
+        <w:rPr>
+          <w:bCs/>
+          <w:b/>
+        </w:rPr>
+        <w:t xml:space="preserve">新增 ⑮ 升级项</w:t>
+      </w:r>
+      <w:r>
+        <w:t xml:space="preserve"> </w:t>
+      </w:r>
+      <w:r>
+        <w:t xml:space="preserve">→ 加到本表 §3.4,在对应 W 周次里安排落地。</w:t>
+      </w:r>
+    </w:p>
+    <w:p>
+      <w:pPr>
+        <w:numPr>
+          <w:ilvl w:val="0"/>
+          <w:numId w:val="1004"/>
+        </w:numPr>
+        <w:pStyle w:val="Compact"/>
+      </w:pPr>
+      <w:r>
+        <w:rPr>
+          <w:bCs/>
+          <w:b/>
+        </w:rPr>
+        <w:t xml:space="preserve">新增 TODO(T6+)</w:t>
+      </w:r>
+      <w:r>
+        <w:t xml:space="preserve"> </w:t>
+      </w:r>
+      <w:r>
+        <w:t xml:space="preserve">→</w:t>
+      </w:r>
+      <w:r>
+        <w:t xml:space="preserve"> </w:t>
+      </w:r>
+      <w:r>
+        <w:rPr>
+          <w:rStyle w:val="VerbatimChar"/>
+        </w:rPr>
+        <w:t xml:space="preserve">docs/project-status.md § TODO 队列</w:t>
+      </w:r>
+      <w:r>
+        <w:t xml:space="preserve"> </w:t>
+      </w:r>
+      <w:r>
+        <w:t xml:space="preserve">+ 本表 §3.13。</w:t>
+      </w:r>
+    </w:p>
+    <w:p>
+      <w:pPr>
+        <w:numPr>
+          <w:ilvl w:val="0"/>
+          <w:numId w:val="1004"/>
+        </w:numPr>
+        <w:pStyle w:val="Compact"/>
+      </w:pPr>
+      <w:r>
+        <w:rPr>
+          <w:bCs/>
+          <w:b/>
+        </w:rPr>
+        <w:t xml:space="preserve">阶段推进</w:t>
+      </w:r>
+      <w:r>
+        <w:t xml:space="preserve"> </w:t>
+      </w:r>
+      <w:r>
+        <w:t xml:space="preserve">→ 更新</w:t>
+      </w:r>
+      <w:r>
+        <w:t xml:space="preserve"> </w:t>
+      </w:r>
+      <w:r>
+        <w:rPr>
+          <w:rStyle w:val="VerbatimChar"/>
+        </w:rPr>
+        <w:t xml:space="preserve">README.md</w:t>
+      </w:r>
+      <w:r>
+        <w:t xml:space="preserve"> </w:t>
+      </w:r>
+      <w:r>
+        <w:t xml:space="preserve">首屏「当前阶段」+</w:t>
+      </w:r>
+      <w:r>
+        <w:t xml:space="preserve"> </w:t>
+      </w:r>
+      <w:r>
+        <w:rPr>
+          <w:rStyle w:val="VerbatimChar"/>
+        </w:rPr>
+        <w:t xml:space="preserve">docs/project-status.md</w:t>
+      </w:r>
+      <w:r>
+        <w:t xml:space="preserve"> </w:t>
+      </w:r>
+      <w:r>
+        <w:t xml:space="preserve">变更历史 + 本表 §3.1 状态列。</w:t>
+      </w:r>
+    </w:p>
+    <w:p>
+      <w:pPr>
+        <w:numPr>
+          <w:ilvl w:val="0"/>
+          <w:numId w:val="1004"/>
         </w:numPr>
         <w:pStyle w:val="Compact"/>
       </w:pPr>
@@ -12246,8 +13192,8 @@
         <w:t xml:space="preserve">© 2026 · Incepedia contributors · Apache-2.0</w:t>
       </w:r>
     </w:p>
-    <w:bookmarkEnd w:id="51"/>
     <w:bookmarkEnd w:id="52"/>
+    <w:bookmarkEnd w:id="53"/>
     <w:sectPr/>
   </w:body>
 </w:document>
@@ -12440,6 +13386,9 @@
     <w:abstractNumId w:val="991"/>
   </w:num>
   <w:num w:numId="1003">
+    <w:abstractNumId w:val="991"/>
+  </w:num>
+  <w:num w:numId="1004">
     <w:abstractNumId w:val="991"/>
   </w:num>
 </w:numbering>

</xml_diff>

<commit_message>
docs(cheatsheet): register Protocol C + R1 abandoned + R-C-FP run
- §3.10 Protocol C row added: Qwen2-style 28-layer + Llama-3.2 tok,
  for FinePhrase paper exact replication (28 layers / RoPE 1e4 /
  intermediate 6144 / no QKV bias, WSD 1/89/10 schedule, seq 4096,
  GBS 512 sequences)
- §3.12 R1 marked ABANDONED (crashed at step 20931/22888 = 91% on
  2026-04-24 03:07 UTC; project decided to drop, not recover); R2
  paused; new run R-C-FP added for the FinePhrase reproduction
- docx regenerated (~30 KB, 14 tables)

Made-with: Cursor
</commit_message>
<xml_diff>
--- a/docs/codenames-cheatsheet.docx
+++ b/docs/codenames-cheatsheet.docx
@@ -10530,7 +10530,7 @@
               <w:jc w:val="left"/>
             </w:pPr>
             <w:r>
-              <w:t xml:space="preserve">Llama2(全注意力 / RoPE θ=1e4 / 无 bias)</w:t>
+              <w:t xml:space="preserve">Llama2(全注意力 / RoPE θ=1e4 / 无 bias / 24 层)</w:t>
             </w:r>
           </w:p>
         </w:tc>
@@ -10554,7 +10554,7 @@
               <w:jc w:val="left"/>
             </w:pPr>
             <w:r>
-              <w:t xml:space="preserve">Mistral-7B-v0.1</w:t>
+              <w:t xml:space="preserve">Mistral-7B-v0.1(32k)</w:t>
             </w:r>
           </w:p>
         </w:tc>
@@ -10582,7 +10582,7 @@
               <w:jc w:val="left"/>
             </w:pPr>
             <w:r>
-              <w:t xml:space="preserve">外部锚</w:t>
+              <w:t xml:space="preserve">外部锚,对齐 SmolLM/Cosmopedia 公开数字</w:t>
             </w:r>
           </w:p>
         </w:tc>
@@ -10612,7 +10612,7 @@
               <w:jc w:val="left"/>
             </w:pPr>
             <w:r>
-              <w:t xml:space="preserve">Qwen3-style(GQA 8 KV / RoPE θ=1e6 / QKV bias)</w:t>
+              <w:t xml:space="preserve">Qwen3-style(GQA 8 KV / RoPE θ=1e6 / QKV bias / 24 层)</w:t>
             </w:r>
           </w:p>
         </w:tc>
@@ -10660,7 +10660,150 @@
               <w:jc w:val="left"/>
             </w:pPr>
             <w:r>
-              <w:t xml:space="preserve">工作架构</w:t>
+              <w:t xml:space="preserve">工作架构,所有 P2 主线 ablation</w:t>
+            </w:r>
+          </w:p>
+        </w:tc>
+      </w:tr>
+      <w:tr>
+        <w:tc>
+          <w:tcPr/>
+          <w:p>
+            <w:pPr>
+              <w:pStyle w:val="Compact"/>
+              <w:jc w:val="left"/>
+            </w:pPr>
+            <w:r>
+              <w:rPr>
+                <w:bCs/>
+                <w:b/>
+              </w:rPr>
+              <w:t xml:space="preserve">Protocol C</w:t>
+            </w:r>
+          </w:p>
+        </w:tc>
+        <w:tc>
+          <w:tcPr/>
+          <w:p>
+            <w:pPr>
+              <w:pStyle w:val="Compact"/>
+              <w:jc w:val="left"/>
+            </w:pPr>
+            <w:r>
+              <w:t xml:space="preserve">Qwen2-style(GQA 8 KV / RoPE θ=</w:t>
+            </w:r>
+            <w:r>
+              <w:rPr>
+                <w:bCs/>
+                <w:b/>
+              </w:rPr>
+              <w:t xml:space="preserve">1e4</w:t>
+            </w:r>
+            <w:r>
+              <w:t xml:space="preserve"> </w:t>
+            </w:r>
+            <w:r>
+              <w:t xml:space="preserve">/</w:t>
+            </w:r>
+            <w:r>
+              <w:t xml:space="preserve"> </w:t>
+            </w:r>
+            <w:r>
+              <w:rPr>
+                <w:bCs/>
+                <w:b/>
+              </w:rPr>
+              <w:t xml:space="preserve">无 bias</w:t>
+            </w:r>
+            <w:r>
+              <w:t xml:space="preserve"> </w:t>
+            </w:r>
+            <w:r>
+              <w:t xml:space="preserve">/</w:t>
+            </w:r>
+            <w:r>
+              <w:t xml:space="preserve"> </w:t>
+            </w:r>
+            <w:r>
+              <w:rPr>
+                <w:bCs/>
+                <w:b/>
+              </w:rPr>
+              <w:t xml:space="preserve">28 层</w:t>
+            </w:r>
+            <w:r>
+              <w:t xml:space="preserve"> </w:t>
+            </w:r>
+            <w:r>
+              <w:t xml:space="preserve">/ intermediate</w:t>
+            </w:r>
+            <w:r>
+              <w:t xml:space="preserve"> </w:t>
+            </w:r>
+            <w:r>
+              <w:rPr>
+                <w:bCs/>
+                <w:b/>
+              </w:rPr>
+              <w:t xml:space="preserve">6144</w:t>
+            </w:r>
+            <w:r>
+              <w:t xml:space="preserve">)</w:t>
+            </w:r>
+          </w:p>
+        </w:tc>
+        <w:tc>
+          <w:tcPr/>
+          <w:p>
+            <w:pPr>
+              <w:pStyle w:val="Compact"/>
+              <w:jc w:val="left"/>
+            </w:pPr>
+            <w:r>
+              <w:t xml:space="preserve">1.7B</w:t>
+            </w:r>
+          </w:p>
+        </w:tc>
+        <w:tc>
+          <w:tcPr/>
+          <w:p>
+            <w:pPr>
+              <w:pStyle w:val="Compact"/>
+              <w:jc w:val="left"/>
+            </w:pPr>
+            <w:r>
+              <w:t xml:space="preserve">hynky/Llama-3.2-1B-no-bos(128k)</w:t>
+            </w:r>
+          </w:p>
+        </w:tc>
+        <w:tc>
+          <w:tcPr/>
+          <w:p>
+            <w:pPr>
+              <w:pStyle w:val="Compact"/>
+              <w:jc w:val="left"/>
+            </w:pPr>
+            <w:r>
+              <w:t xml:space="preserve">2-3 次</w:t>
+            </w:r>
+          </w:p>
+        </w:tc>
+        <w:tc>
+          <w:tcPr/>
+          <w:p>
+            <w:pPr>
+              <w:pStyle w:val="Compact"/>
+              <w:jc w:val="left"/>
+            </w:pPr>
+            <w:r>
+              <w:rPr>
+                <w:bCs/>
+                <w:b/>
+              </w:rPr>
+              <w:t xml:space="preserve">FinePhrase 论文严格复刻</w:t>
+            </w:r>
+            <w:r>
+              <w:t xml:space="preserve">,Figure 1 直接对比;WSD schedule 1%/89%/10%,seq=4096,GBS=512×4096</w:t>
             </w:r>
           </w:p>
         </w:tc>
@@ -10975,7 +11118,7 @@
               <w:jc w:val="left"/>
             </w:pPr>
             <w:r>
-              <w:t xml:space="preserve">已弃</w:t>
+              <w:t xml:space="preserve">❌ 已弃</w:t>
             </w:r>
           </w:p>
         </w:tc>
@@ -11005,19 +11148,42 @@
               <w:jc w:val="left"/>
             </w:pPr>
             <w:r>
-              <w:t xml:space="preserve">seed42 第 2 次 30B 正式训练(= E1 一半)</w:t>
-            </w:r>
-          </w:p>
-        </w:tc>
-        <w:tc>
-          <w:tcPr/>
-          <w:p>
-            <w:pPr>
-              <w:pStyle w:val="Compact"/>
-              <w:jc w:val="left"/>
-            </w:pPr>
-            <w:r>
-              <w:t xml:space="preserve">🟡 40%</w:t>
+              <w:t xml:space="preserve">seed42 第 2 次 30B 正式训练(= E1 一半,Protocol B)</w:t>
+            </w:r>
+          </w:p>
+        </w:tc>
+        <w:tc>
+          <w:tcPr/>
+          <w:p>
+            <w:pPr>
+              <w:pStyle w:val="Compact"/>
+              <w:jc w:val="left"/>
+            </w:pPr>
+            <w:r>
+              <w:t xml:space="preserve">❌</w:t>
+            </w:r>
+            <w:r>
+              <w:t xml:space="preserve"> </w:t>
+            </w:r>
+            <w:r>
+              <w:rPr>
+                <w:bCs/>
+                <w:b/>
+              </w:rPr>
+              <w:t xml:space="preserve">崩溃于 step 20931 / 91%</w:t>
+            </w:r>
+            <w:r>
+              <w:t xml:space="preserve">(2026-04-24 03:07 UTC),</w:t>
+            </w:r>
+            <w:r>
+              <w:rPr>
+                <w:bCs/>
+                <w:b/>
+              </w:rPr>
+              <w:t xml:space="preserve">项目决定丢弃</w:t>
+            </w:r>
+            <w:r>
+              <w:t xml:space="preserve">;不补救</w:t>
             </w:r>
           </w:p>
         </w:tc>
@@ -11047,19 +11213,88 @@
               <w:jc w:val="left"/>
             </w:pPr>
             <w:r>
-              <w:t xml:space="preserve">seed1337 30B(= E1 另一半)</w:t>
-            </w:r>
-          </w:p>
-        </w:tc>
-        <w:tc>
-          <w:tcPr/>
-          <w:p>
-            <w:pPr>
-              <w:pStyle w:val="Compact"/>
-              <w:jc w:val="left"/>
-            </w:pPr>
-            <w:r>
-              <w:t xml:space="preserve">⏳ R1 后</w:t>
+              <w:t xml:space="preserve">seed1337 30B(= E1 另一半,Protocol B)</w:t>
+            </w:r>
+          </w:p>
+        </w:tc>
+        <w:tc>
+          <w:tcPr/>
+          <w:p>
+            <w:pPr>
+              <w:pStyle w:val="Compact"/>
+              <w:jc w:val="left"/>
+            </w:pPr>
+            <w:r>
+              <w:t xml:space="preserve">❌</w:t>
+            </w:r>
+            <w:r>
+              <w:t xml:space="preserve"> </w:t>
+            </w:r>
+            <w:r>
+              <w:rPr>
+                <w:bCs/>
+                <w:b/>
+              </w:rPr>
+              <w:t xml:space="preserve">未启动,随 R1 一起暂搁</w:t>
+            </w:r>
+          </w:p>
+        </w:tc>
+      </w:tr>
+      <w:tr>
+        <w:tc>
+          <w:tcPr/>
+          <w:p>
+            <w:pPr>
+              <w:pStyle w:val="Compact"/>
+              <w:jc w:val="left"/>
+            </w:pPr>
+            <w:r>
+              <w:rPr>
+                <w:bCs/>
+                <w:b/>
+              </w:rPr>
+              <w:t xml:space="preserve">R-C-FP</w:t>
+            </w:r>
+          </w:p>
+        </w:tc>
+        <w:tc>
+          <w:tcPr/>
+          <w:p>
+            <w:pPr>
+              <w:pStyle w:val="Compact"/>
+              <w:jc w:val="left"/>
+            </w:pPr>
+            <w:r>
+              <w:rPr>
+                <w:bCs/>
+                <w:b/>
+              </w:rPr>
+              <w:t xml:space="preserve">FinePhrase 复刻 · Protocol C × 21B from-scratch × (FinePhrase 50% + FW-Edu-HQ 50%)</w:t>
+            </w:r>
+          </w:p>
+        </w:tc>
+        <w:tc>
+          <w:tcPr/>
+          <w:p>
+            <w:pPr>
+              <w:pStyle w:val="Compact"/>
+              <w:jc w:val="left"/>
+            </w:pPr>
+            <w:r>
+              <w:t xml:space="preserve">🟢</w:t>
+            </w:r>
+            <w:r>
+              <w:t xml:space="preserve"> </w:t>
+            </w:r>
+            <w:r>
+              <w:rPr>
+                <w:bCs/>
+                <w:b/>
+              </w:rPr>
+              <w:t xml:space="preserve">进行中</w:t>
+            </w:r>
+            <w:r>
+              <w:t xml:space="preserve">(2026-04-24 起,ETA ~33h)</w:t>
             </w:r>
           </w:p>
         </w:tc>

</xml_diff>